<commit_message>
docs(proposal): thêm 4 sơ đồ chuyên nghiệp (SVG+PNG), Word có trang bìa + hình nhúng
</commit_message>
<xml_diff>
--- a/docs/axsvr-proposal.docx
+++ b/docs/axsvr-proposal.docx
@@ -2,140 +2,297 @@
 <file path=word/document.xml><?xml version="1.0" encoding="utf-8"?>
 <w:document xmlns:wpc="http://schemas.microsoft.com/office/word/2010/wordprocessingCanvas" xmlns:mo="http://schemas.microsoft.com/office/mac/office/2008/main" xmlns:mc="http://schemas.openxmlformats.org/markup-compatibility/2006" xmlns:mv="urn:schemas-microsoft-com:mac:vml" xmlns:o="urn:schemas-microsoft-com:office:office" xmlns:r="http://schemas.openxmlformats.org/officeDocument/2006/relationships" xmlns:m="http://schemas.openxmlformats.org/officeDocument/2006/math" xmlns:v="urn:schemas-microsoft-com:vml" xmlns:wp14="http://schemas.microsoft.com/office/word/2010/wordprocessingDrawing" xmlns:wp="http://schemas.openxmlformats.org/drawingml/2006/wordprocessingDrawing" xmlns:w10="urn:schemas-microsoft-com:office:word" xmlns:w="http://schemas.openxmlformats.org/wordprocessingml/2006/main" xmlns:w14="http://schemas.microsoft.com/office/word/2010/wordml" xmlns:wpg="http://schemas.microsoft.com/office/word/2010/wordprocessingGroup" xmlns:wpi="http://schemas.microsoft.com/office/word/2010/wordprocessingInk" xmlns:wne="http://schemas.microsoft.com/office/word/2006/wordml" xmlns:wps="http://schemas.microsoft.com/office/word/2010/wordprocessingShape" mc:Ignorable="w14 wp14">
   <w:body>
+    <w:p/>
+    <w:p/>
+    <w:p/>
+    <w:p/>
     <w:p>
       <w:pPr>
-        <w:jc w:val="center"/>
+        <w:spacing w:before="0" w:after="200"/>
+        <w:jc w:val="left"/>
       </w:pPr>
       <w:r>
         <w:rPr>
           <w:b/>
-          <w:color w:val="1F4E79"/>
-          <w:sz w:val="34"/>
+          <w:color w:val="146B63"/>
+          <w:sz w:val="22"/>
         </w:rPr>
-        <w:t>ĐỀ XUẤT &amp; BÁO CÁO DỰ ÁN — HẠ TẦNG WEB HIGH AVAILABILITY "AX SVR"</w:t>
+        <w:t>PROPOSAL NỘI BỘ — TRÌNH QUẢN LÝ</w:t>
+      </w:r>
+    </w:p>
+    <w:p>
+      <w:r>
+        <w:rPr>
+          <w:rFonts w:ascii="Cambria" w:hAnsi="Cambria"/>
+          <w:b/>
+          <w:color w:val="1A2423"/>
+          <w:sz w:val="52"/>
+        </w:rPr>
+        <w:t>HẠ TẦNG WEB HIGH AVAILABILITY</w:t>
+      </w:r>
+    </w:p>
+    <w:p>
+      <w:r>
+        <w:rPr>
+          <w:rFonts w:ascii="Cambria" w:hAnsi="Cambria"/>
+          <w:b/>
+          <w:color w:val="146B63"/>
+          <w:sz w:val="52"/>
+        </w:rPr>
+        <w:t>DỰ ÁN "AX SVR"</w:t>
       </w:r>
     </w:p>
     <w:p>
       <w:pPr>
-        <w:ind w:left="283"/>
+        <w:spacing w:before="160" w:after="0"/>
+        <w:jc w:val="left"/>
+      </w:pPr>
+      <w:r>
+        <w:rPr>
+          <w:b w:val="0"/>
+          <w:color w:val="5A6B68"/>
+          <w:sz w:val="26"/>
+        </w:rPr>
+        <w:t>Báo cáo hoàn thành triển khai và đề xuất giai đoạn tiếp theo</w:t>
+      </w:r>
+    </w:p>
+    <w:p/>
+    <w:p/>
+    <w:p/>
+    <w:tbl>
+      <w:tblPr>
+        <w:tblW w:type="auto" w:w="0"/>
+        <w:tblLook w:firstColumn="1" w:firstRow="1" w:lastColumn="0" w:lastRow="0" w:noHBand="0" w:noVBand="1" w:val="04A0"/>
+      </w:tblPr>
+      <w:tblGrid>
+        <w:gridCol w:w="2551"/>
+        <w:gridCol w:w="6803"/>
+      </w:tblGrid>
+      <w:tr>
+        <w:tc>
+          <w:tcPr>
+            <w:tcW w:type="dxa" w:w="4873"/>
+            <w:shd w:fill="F0F6F5"/>
+          </w:tcPr>
+          <w:p>
+            <w:r/>
+            <w:r>
+              <w:rPr>
+                <w:b/>
+                <w:color w:val="5A6B68"/>
+                <w:sz w:val="18"/>
+              </w:rPr>
+              <w:t>NGÀY</w:t>
+            </w:r>
+          </w:p>
+        </w:tc>
+        <w:tc>
+          <w:tcPr>
+            <w:tcW w:type="dxa" w:w="4873"/>
+          </w:tcPr>
+          <w:p>
+            <w:r/>
+            <w:r>
+              <w:rPr>
+                <w:b/>
+                <w:sz w:val="22"/>
+              </w:rPr>
+              <w:t>10/07/2026</w:t>
+            </w:r>
+          </w:p>
+        </w:tc>
+      </w:tr>
+      <w:tr>
+        <w:tc>
+          <w:tcPr>
+            <w:tcW w:type="dxa" w:w="4873"/>
+            <w:shd w:fill="F0F6F5"/>
+          </w:tcPr>
+          <w:p>
+            <w:r/>
+            <w:r>
+              <w:rPr>
+                <w:b/>
+                <w:color w:val="5A6B68"/>
+                <w:sz w:val="18"/>
+              </w:rPr>
+              <w:t>TRẠNG THÁI</w:t>
+            </w:r>
+          </w:p>
+        </w:tc>
+        <w:tc>
+          <w:tcPr>
+            <w:tcW w:type="dxa" w:w="4873"/>
+          </w:tcPr>
+          <w:p>
+            <w:r/>
+            <w:r>
+              <w:rPr>
+                <w:b/>
+                <w:sz w:val="22"/>
+              </w:rPr>
+              <w:t>Đã triển khai production</w:t>
+            </w:r>
+          </w:p>
+        </w:tc>
+      </w:tr>
+      <w:tr>
+        <w:tc>
+          <w:tcPr>
+            <w:tcW w:type="dxa" w:w="4873"/>
+            <w:shd w:fill="F0F6F5"/>
+          </w:tcPr>
+          <w:p>
+            <w:r/>
+            <w:r>
+              <w:rPr>
+                <w:b/>
+                <w:color w:val="5A6B68"/>
+                <w:sz w:val="18"/>
+              </w:rPr>
+              <w:t>PHIÊN BẢN</w:t>
+            </w:r>
+          </w:p>
+        </w:tc>
+        <w:tc>
+          <w:tcPr>
+            <w:tcW w:type="dxa" w:w="4873"/>
+          </w:tcPr>
+          <w:p>
+            <w:r/>
+            <w:r>
+              <w:rPr>
+                <w:b/>
+                <w:sz w:val="22"/>
+              </w:rPr>
+              <w:t>v1.0.0 (Git)</w:t>
+            </w:r>
+          </w:p>
+        </w:tc>
+      </w:tr>
+      <w:tr>
+        <w:tc>
+          <w:tcPr>
+            <w:tcW w:type="dxa" w:w="4873"/>
+            <w:shd w:fill="F0F6F5"/>
+          </w:tcPr>
+          <w:p>
+            <w:r/>
+            <w:r>
+              <w:rPr>
+                <w:b/>
+                <w:color w:val="5A6B68"/>
+                <w:sz w:val="18"/>
+              </w:rPr>
+              <w:t>NGƯỜI THỰC HIỆN</w:t>
+            </w:r>
+          </w:p>
+        </w:tc>
+        <w:tc>
+          <w:tcPr>
+            <w:tcW w:type="dxa" w:w="4873"/>
+          </w:tcPr>
+          <w:p>
+            <w:r/>
+            <w:r>
+              <w:rPr>
+                <w:b/>
+                <w:sz w:val="22"/>
+              </w:rPr>
+              <w:t>Đội hạ tầng</w:t>
+            </w:r>
+          </w:p>
+        </w:tc>
+      </w:tr>
+    </w:tbl>
+    <w:p/>
+    <w:p/>
+    <w:p/>
+    <w:p/>
+    <w:p/>
+    <w:p/>
+    <w:p>
+      <w:pPr>
+        <w:spacing w:before="120" w:after="120"/>
+        <w:jc w:val="center"/>
+        <w:shd w:fill="146B63"/>
       </w:pPr>
       <w:r>
         <w:rPr>
           <w:b/>
-          <w:i/>
-          <w:color w:val="595959"/>
+          <w:color w:val="FFFFFF"/>
+          <w:sz w:val="21"/>
         </w:rPr>
-        <w:t>Loại tài liệu:</w:t>
-      </w:r>
-      <w:r>
-        <w:rPr>
-          <w:i/>
-          <w:color w:val="595959"/>
-        </w:rPr>
-        <w:t xml:space="preserve"> Proposal nội bộ — trình quản lý</w:t>
+        <w:t>Không còn điểm chết đơn lẻ ở mọi tầng  ·  Failover tự động  ·  RPO = 0  ·  Khôi phục PITR</w:t>
       </w:r>
     </w:p>
     <w:p>
-      <w:pPr>
-        <w:ind w:left="283"/>
-      </w:pPr>
       <w:r>
-        <w:rPr>
-          <w:b/>
-          <w:i/>
-          <w:color w:val="595959"/>
-        </w:rPr>
-        <w:t>Ngày:</w:t>
-      </w:r>
-      <w:r>
-        <w:rPr>
-          <w:i/>
-          <w:color w:val="595959"/>
-        </w:rPr>
-        <w:t xml:space="preserve"> 10/07/2026</w:t>
-      </w:r>
-    </w:p>
-    <w:p>
-      <w:pPr>
-        <w:ind w:left="283"/>
-      </w:pPr>
-      <w:r>
-        <w:rPr>
-          <w:b/>
-          <w:i/>
-          <w:color w:val="595959"/>
-        </w:rPr>
-        <w:t>Trạng thái dự án:</w:t>
-      </w:r>
-      <w:r>
-        <w:rPr>
-          <w:i/>
-          <w:color w:val="595959"/>
-        </w:rPr>
-        <w:t xml:space="preserve"> Đã triển khai hoàn tất hạ tầng chính (production)</w:t>
-      </w:r>
-    </w:p>
-    <w:p>
-      <w:pPr>
-        <w:ind w:left="283"/>
-      </w:pPr>
-      <w:r>
-        <w:rPr>
-          <w:b/>
-          <w:i/>
-          <w:color w:val="595959"/>
-        </w:rPr>
-        <w:t>Người thực hiện:</w:t>
-      </w:r>
-      <w:r>
-        <w:rPr>
-          <w:i/>
-          <w:color w:val="595959"/>
-        </w:rPr>
-        <w:t xml:space="preserve"> Đội hạ tầng</w:t>
+        <w:br w:type="page"/>
       </w:r>
     </w:p>
     <w:p>
       <w:pPr>
         <w:pStyle w:val="Heading1"/>
+        <w:spacing w:before="360"/>
       </w:pPr>
       <w:r>
         <w:rPr>
-          <w:color w:val="1F4E79"/>
-          <w:sz w:val="28"/>
+          <w:rFonts w:ascii="Cambria" w:hAnsi="Cambria"/>
+          <w:color w:val="146B63"/>
+          <w:sz w:val="30"/>
         </w:rPr>
         <w:t>1. Tóm tắt điều hành (Executive Summary)</w:t>
       </w:r>
     </w:p>
     <w:p>
       <w:r>
+        <w:rPr>
+          <w:b w:val="0"/>
+          <w:i w:val="0"/>
+        </w:rPr>
         <w:t xml:space="preserve">Dự án AX Svr xây dựng hạ tầng web </w:t>
       </w:r>
       <w:r>
         <w:rPr>
           <w:b/>
+          <w:i w:val="0"/>
         </w:rPr>
         <w:t>High Availability (HA)</w:t>
       </w:r>
       <w:r>
+        <w:rPr>
+          <w:b w:val="0"/>
+          <w:i w:val="0"/>
+        </w:rPr>
         <w:t xml:space="preserve"> hoàn chỉnh cho khách hàng trên nền tảng ảo hóa, trong môi trường mạng </w:t>
       </w:r>
       <w:r>
         <w:rPr>
           <w:b/>
+          <w:i w:val="0"/>
         </w:rPr>
         <w:t>air-gap</w:t>
       </w:r>
       <w:r>
+        <w:rPr>
+          <w:b w:val="0"/>
+          <w:i w:val="0"/>
+        </w:rPr>
         <w:t xml:space="preserve"> (cô lập, không kết nối Internet). Hệ thống được thiết kế theo nguyên tắc </w:t>
       </w:r>
       <w:r>
         <w:rPr>
           <w:b/>
+          <w:i w:val="0"/>
         </w:rPr>
         <w:t>không còn điểm chết đơn lẻ (SPOF)</w:t>
       </w:r>
       <w:r>
+        <w:rPr>
+          <w:b w:val="0"/>
+          <w:i w:val="0"/>
+        </w:rPr>
         <w:t xml:space="preserve"> ở mọi tầng:</w:t>
       </w:r>
     </w:p>
@@ -146,19 +303,29 @@
       <w:r>
         <w:rPr>
           <w:b/>
+          <w:i w:val="0"/>
         </w:rPr>
         <w:t>Tầng biên (edge):</w:t>
       </w:r>
       <w:r>
+        <w:rPr>
+          <w:b w:val="0"/>
+          <w:i w:val="0"/>
+        </w:rPr>
         <w:t xml:space="preserve"> 2 proxy Nginx + Keepalived/VIP — mất 1 proxy, dịch vụ tự chuyển trong </w:t>
       </w:r>
       <w:r>
         <w:rPr>
           <w:b/>
+          <w:i w:val="0"/>
         </w:rPr>
         <w:t>&lt; 3 giây</w:t>
       </w:r>
       <w:r>
+        <w:rPr>
+          <w:b w:val="0"/>
+          <w:i w:val="0"/>
+        </w:rPr>
         <w:t>.</w:t>
       </w:r>
     </w:p>
@@ -169,10 +336,15 @@
       <w:r>
         <w:rPr>
           <w:b/>
+          <w:i w:val="0"/>
         </w:rPr>
         <w:t>Tầng web:</w:t>
       </w:r>
       <w:r>
+        <w:rPr>
+          <w:b w:val="0"/>
+          <w:i w:val="0"/>
+        </w:rPr>
         <w:t xml:space="preserve"> 2 server IIS (Windows Server 2025) chạy song song sau load balancer — mất 1 web, Nginx tự loại khỏi pool.</w:t>
       </w:r>
     </w:p>
@@ -183,28 +355,43 @@
       <w:r>
         <w:rPr>
           <w:b/>
+          <w:i w:val="0"/>
         </w:rPr>
         <w:t>Tầng dữ liệu:</w:t>
       </w:r>
       <w:r>
+        <w:rPr>
+          <w:b w:val="0"/>
+          <w:i w:val="0"/>
+        </w:rPr>
         <w:t xml:space="preserve"> cụm PostgreSQL 17 gồm 3 node (Patroni + etcd) tự động bầu leader mới trong </w:t>
       </w:r>
       <w:r>
         <w:rPr>
           <w:b/>
+          <w:i w:val="0"/>
         </w:rPr>
         <w:t>&lt; 30 giây</w:t>
       </w:r>
       <w:r>
+        <w:rPr>
+          <w:b w:val="0"/>
+          <w:i w:val="0"/>
+        </w:rPr>
         <w:t xml:space="preserve"> khi node chính gặp sự cố, với 1 replica đồng bộ (synchronous) đảm bảo </w:t>
       </w:r>
       <w:r>
         <w:rPr>
           <w:b/>
+          <w:i w:val="0"/>
         </w:rPr>
         <w:t>không mất dữ liệu đã commit (RPO = 0)</w:t>
       </w:r>
       <w:r>
+        <w:rPr>
+          <w:b w:val="0"/>
+          <w:i w:val="0"/>
+        </w:rPr>
         <w:t>.</w:t>
       </w:r>
     </w:p>
@@ -215,24 +402,38 @@
       <w:r>
         <w:rPr>
           <w:b/>
+          <w:i w:val="0"/>
         </w:rPr>
         <w:t>An toàn dữ liệu:</w:t>
       </w:r>
       <w:r>
+        <w:rPr>
+          <w:b w:val="0"/>
+          <w:i w:val="0"/>
+        </w:rPr>
         <w:t xml:space="preserve"> backup pgBackRest với WAL liên tục, hỗ trợ khôi phục về bất kỳ thời điểm nào (PITR).</w:t>
       </w:r>
     </w:p>
     <w:p>
       <w:r>
+        <w:rPr>
+          <w:b w:val="0"/>
+          <w:i w:val="0"/>
+        </w:rPr>
         <w:t xml:space="preserve">Khối lượng bàn giao gồm: </w:t>
       </w:r>
       <w:r>
         <w:rPr>
           <w:b/>
+          <w:i w:val="0"/>
         </w:rPr>
         <w:t>hạ tầng 10 VM đã triển khai</w:t>
       </w:r>
       <w:r>
+        <w:rPr>
+          <w:b w:val="0"/>
+          <w:i w:val="0"/>
+        </w:rPr>
         <w:t>, bộ tài liệu vận hành ~2.400 dòng (10 tài liệu phase), bộ công cụ quản trị DB (14 scripts), scripts firewall tự động theo vai trò, và công cụ tạo ISO cài đặt tự động. Toàn bộ được quản lý version trên Git (tag v1.0.0).</w:t>
       </w:r>
     </w:p>
@@ -240,30 +441,42 @@
       <w:r>
         <w:rPr>
           <w:b/>
+          <w:i w:val="0"/>
         </w:rPr>
         <w:t>Đề xuất tiếp theo:</w:t>
       </w:r>
       <w:r>
+        <w:rPr>
+          <w:b w:val="0"/>
+          <w:i w:val="0"/>
+        </w:rPr>
         <w:t xml:space="preserve"> tích hợp giám sát vào hệ thống </w:t>
       </w:r>
       <w:r>
         <w:rPr>
           <w:b/>
+          <w:i w:val="0"/>
         </w:rPr>
         <w:t>Zabbix/Grafana sẵn có</w:t>
       </w:r>
       <w:r>
+        <w:rPr>
+          <w:b w:val="0"/>
+          <w:i w:val="0"/>
+        </w:rPr>
         <w:t xml:space="preserve"> của công ty (không dựng node monitoring riêng), bổ sung backup off-site để hoàn thiện chuẩn 3-2-1, và thiết lập lịch diễn tập failover/khôi phục định kỳ.</w:t>
       </w:r>
     </w:p>
     <w:p>
       <w:pPr>
         <w:pStyle w:val="Heading1"/>
+        <w:spacing w:before="360"/>
       </w:pPr>
       <w:r>
         <w:rPr>
-          <w:color w:val="1F4E79"/>
-          <w:sz w:val="28"/>
+          <w:rFonts w:ascii="Cambria" w:hAnsi="Cambria"/>
+          <w:color w:val="146B63"/>
+          <w:sz w:val="30"/>
         </w:rPr>
         <w:t>2. Bối cảnh &amp; mục tiêu</w:t>
       </w:r>
@@ -274,14 +487,19 @@
       </w:pPr>
       <w:r>
         <w:rPr>
-          <w:color w:val="1F4E79"/>
-          <w:sz w:val="24"/>
+          <w:rFonts w:ascii="Cambria" w:hAnsi="Cambria"/>
+          <w:color w:val="1A2423"/>
+          <w:sz w:val="25"/>
         </w:rPr>
         <w:t>Bối cảnh</w:t>
       </w:r>
     </w:p>
     <w:p>
       <w:r>
+        <w:rPr>
+          <w:b w:val="0"/>
+          <w:i w:val="0"/>
+        </w:rPr>
         <w:t>Khách hàng cần hạ tầng chạy ứng dụng web (React SPA + backend kết nối PostgreSQL) phục vụ người dùng nội bộ qua dải mạng riêng, yêu cầu:</w:t>
       </w:r>
     </w:p>
@@ -290,15 +508,24 @@
         <w:pStyle w:val="ListBullet"/>
       </w:pPr>
       <w:r>
+        <w:rPr>
+          <w:b w:val="0"/>
+          <w:i w:val="0"/>
+        </w:rPr>
         <w:t xml:space="preserve">Dịch vụ </w:t>
       </w:r>
       <w:r>
         <w:rPr>
           <w:b/>
+          <w:i w:val="0"/>
         </w:rPr>
         <w:t>không gián đoạn</w:t>
       </w:r>
       <w:r>
+        <w:rPr>
+          <w:b w:val="0"/>
+          <w:i w:val="0"/>
+        </w:rPr>
         <w:t xml:space="preserve"> khi 1 máy chủ bất kỳ gặp sự cố.</w:t>
       </w:r>
     </w:p>
@@ -307,15 +534,24 @@
         <w:pStyle w:val="ListBullet"/>
       </w:pPr>
       <w:r>
+        <w:rPr>
+          <w:b w:val="0"/>
+          <w:i w:val="0"/>
+        </w:rPr>
         <w:t xml:space="preserve">Dữ liệu </w:t>
       </w:r>
       <w:r>
         <w:rPr>
           <w:b/>
+          <w:i w:val="0"/>
         </w:rPr>
         <w:t>không mất</w:t>
       </w:r>
       <w:r>
+        <w:rPr>
+          <w:b w:val="0"/>
+          <w:i w:val="0"/>
+        </w:rPr>
         <w:t xml:space="preserve"> khi hỏng node database.</w:t>
       </w:r>
     </w:p>
@@ -324,15 +560,24 @@
         <w:pStyle w:val="ListBullet"/>
       </w:pPr>
       <w:r>
+        <w:rPr>
+          <w:b w:val="0"/>
+          <w:i w:val="0"/>
+        </w:rPr>
         <w:t xml:space="preserve">Môi trường </w:t>
       </w:r>
       <w:r>
         <w:rPr>
           <w:b/>
+          <w:i w:val="0"/>
         </w:rPr>
         <w:t>air-gap</w:t>
       </w:r>
       <w:r>
+        <w:rPr>
+          <w:b w:val="0"/>
+          <w:i w:val="0"/>
+        </w:rPr>
         <w:t>: không kết nối Internet → mọi giải pháp phải hoạt động offline.</w:t>
       </w:r>
     </w:p>
@@ -341,6 +586,10 @@
         <w:pStyle w:val="ListBullet"/>
       </w:pPr>
       <w:r>
+        <w:rPr>
+          <w:b w:val="0"/>
+          <w:i w:val="0"/>
+        </w:rPr>
         <w:t>Chỉ quản trị viên được phép truy cập remote vào máy chủ.</w:t>
       </w:r>
     </w:p>
@@ -350,8 +599,9 @@
       </w:pPr>
       <w:r>
         <w:rPr>
-          <w:color w:val="1F4E79"/>
-          <w:sz w:val="24"/>
+          <w:rFonts w:ascii="Cambria" w:hAnsi="Cambria"/>
+          <w:color w:val="1A2423"/>
+          <w:sz w:val="25"/>
         </w:rPr>
         <w:t>Mục tiêu đã cam kết</w:t>
       </w:r>
@@ -372,7 +622,7 @@
         <w:tc>
           <w:tcPr>
             <w:tcW w:type="dxa" w:w="3249"/>
-            <w:shd w:fill="1F4E79"/>
+            <w:shd w:fill="146B63"/>
           </w:tcPr>
           <w:p>
             <w:r>
@@ -385,6 +635,7 @@
             <w:r>
               <w:rPr>
                 <w:b/>
+                <w:i w:val="0"/>
                 <w:color w:val="FFFFFF"/>
                 <w:sz w:val="20"/>
               </w:rPr>
@@ -395,7 +646,7 @@
         <w:tc>
           <w:tcPr>
             <w:tcW w:type="dxa" w:w="3249"/>
-            <w:shd w:fill="1F4E79"/>
+            <w:shd w:fill="146B63"/>
           </w:tcPr>
           <w:p>
             <w:r>
@@ -408,6 +659,7 @@
             <w:r>
               <w:rPr>
                 <w:b/>
+                <w:i w:val="0"/>
                 <w:color w:val="FFFFFF"/>
                 <w:sz w:val="20"/>
               </w:rPr>
@@ -418,7 +670,7 @@
         <w:tc>
           <w:tcPr>
             <w:tcW w:type="dxa" w:w="3249"/>
-            <w:shd w:fill="1F4E79"/>
+            <w:shd w:fill="146B63"/>
           </w:tcPr>
           <w:p>
             <w:r>
@@ -431,6 +683,7 @@
             <w:r>
               <w:rPr>
                 <w:b/>
+                <w:i w:val="0"/>
                 <w:color w:val="FFFFFF"/>
                 <w:sz w:val="20"/>
               </w:rPr>
@@ -452,6 +705,8 @@
             </w:r>
             <w:r>
               <w:rPr>
+                <w:b w:val="0"/>
+                <w:i w:val="0"/>
                 <w:sz w:val="20"/>
               </w:rPr>
               <w:t>HA tầng proxy</w:t>
@@ -470,6 +725,8 @@
             </w:r>
             <w:r>
               <w:rPr>
+                <w:b w:val="0"/>
+                <w:i w:val="0"/>
                 <w:sz w:val="20"/>
               </w:rPr>
               <w:t>Failover VIP</w:t>
@@ -488,6 +745,8 @@
             </w:r>
             <w:r>
               <w:rPr>
+                <w:b w:val="0"/>
+                <w:i w:val="0"/>
                 <w:sz w:val="20"/>
               </w:rPr>
               <w:t>&lt; 3 giây</w:t>
@@ -499,7 +758,7 @@
         <w:tc>
           <w:tcPr>
             <w:tcW w:type="dxa" w:w="3249"/>
-            <w:shd w:fill="EDF2F8"/>
+            <w:shd w:fill="F0F6F5"/>
           </w:tcPr>
           <w:p>
             <w:r>
@@ -509,6 +768,8 @@
             </w:r>
             <w:r>
               <w:rPr>
+                <w:b w:val="0"/>
+                <w:i w:val="0"/>
                 <w:sz w:val="20"/>
               </w:rPr>
               <w:t>HA tầng web</w:t>
@@ -518,7 +779,7 @@
         <w:tc>
           <w:tcPr>
             <w:tcW w:type="dxa" w:w="3249"/>
-            <w:shd w:fill="EDF2F8"/>
+            <w:shd w:fill="F0F6F5"/>
           </w:tcPr>
           <w:p>
             <w:r>
@@ -528,6 +789,8 @@
             </w:r>
             <w:r>
               <w:rPr>
+                <w:b w:val="0"/>
+                <w:i w:val="0"/>
                 <w:sz w:val="20"/>
               </w:rPr>
               <w:t>Loại node lỗi khỏi pool</w:t>
@@ -537,7 +800,7 @@
         <w:tc>
           <w:tcPr>
             <w:tcW w:type="dxa" w:w="3249"/>
-            <w:shd w:fill="EDF2F8"/>
+            <w:shd w:fill="F0F6F5"/>
           </w:tcPr>
           <w:p>
             <w:r>
@@ -547,6 +810,8 @@
             </w:r>
             <w:r>
               <w:rPr>
+                <w:b w:val="0"/>
+                <w:i w:val="0"/>
                 <w:sz w:val="20"/>
               </w:rPr>
               <w:t>Tự động (health check)</w:t>
@@ -567,6 +832,8 @@
             </w:r>
             <w:r>
               <w:rPr>
+                <w:b w:val="0"/>
+                <w:i w:val="0"/>
                 <w:sz w:val="20"/>
               </w:rPr>
               <w:t>HA tầng DB</w:t>
@@ -585,6 +852,8 @@
             </w:r>
             <w:r>
               <w:rPr>
+                <w:b w:val="0"/>
+                <w:i w:val="0"/>
                 <w:sz w:val="20"/>
               </w:rPr>
               <w:t>Bầu leader mới</w:t>
@@ -603,6 +872,8 @@
             </w:r>
             <w:r>
               <w:rPr>
+                <w:b w:val="0"/>
+                <w:i w:val="0"/>
                 <w:sz w:val="20"/>
               </w:rPr>
               <w:t>&lt; 30 giây, tự động</w:t>
@@ -614,7 +885,7 @@
         <w:tc>
           <w:tcPr>
             <w:tcW w:type="dxa" w:w="3249"/>
-            <w:shd w:fill="EDF2F8"/>
+            <w:shd w:fill="F0F6F5"/>
           </w:tcPr>
           <w:p>
             <w:r>
@@ -624,6 +895,8 @@
             </w:r>
             <w:r>
               <w:rPr>
+                <w:b w:val="0"/>
+                <w:i w:val="0"/>
                 <w:sz w:val="20"/>
               </w:rPr>
               <w:t>Chống mất dữ liệu</w:t>
@@ -633,7 +906,7 @@
         <w:tc>
           <w:tcPr>
             <w:tcW w:type="dxa" w:w="3249"/>
-            <w:shd w:fill="EDF2F8"/>
+            <w:shd w:fill="F0F6F5"/>
           </w:tcPr>
           <w:p>
             <w:r>
@@ -643,6 +916,8 @@
             </w:r>
             <w:r>
               <w:rPr>
+                <w:b w:val="0"/>
+                <w:i w:val="0"/>
                 <w:sz w:val="20"/>
               </w:rPr>
               <w:t>RPO khi mất leader</w:t>
@@ -652,7 +927,7 @@
         <w:tc>
           <w:tcPr>
             <w:tcW w:type="dxa" w:w="3249"/>
-            <w:shd w:fill="EDF2F8"/>
+            <w:shd w:fill="F0F6F5"/>
           </w:tcPr>
           <w:p>
             <w:r>
@@ -662,6 +937,8 @@
             </w:r>
             <w:r>
               <w:rPr>
+                <w:b w:val="0"/>
+                <w:i w:val="0"/>
                 <w:sz w:val="20"/>
               </w:rPr>
               <w:t>= 0 (sync replica)</w:t>
@@ -682,6 +959,8 @@
             </w:r>
             <w:r>
               <w:rPr>
+                <w:b w:val="0"/>
+                <w:i w:val="0"/>
                 <w:sz w:val="20"/>
               </w:rPr>
               <w:t>Khôi phục dữ liệu</w:t>
@@ -700,6 +979,8 @@
             </w:r>
             <w:r>
               <w:rPr>
+                <w:b w:val="0"/>
+                <w:i w:val="0"/>
                 <w:sz w:val="20"/>
               </w:rPr>
               <w:t>PITR</w:t>
@@ -718,6 +999,8 @@
             </w:r>
             <w:r>
               <w:rPr>
+                <w:b w:val="0"/>
+                <w:i w:val="0"/>
                 <w:sz w:val="20"/>
               </w:rPr>
               <w:t>Về bất kỳ thời điểm nào</w:t>
@@ -729,7 +1012,7 @@
         <w:tc>
           <w:tcPr>
             <w:tcW w:type="dxa" w:w="3249"/>
-            <w:shd w:fill="EDF2F8"/>
+            <w:shd w:fill="F0F6F5"/>
           </w:tcPr>
           <w:p>
             <w:r>
@@ -739,6 +1022,8 @@
             </w:r>
             <w:r>
               <w:rPr>
+                <w:b w:val="0"/>
+                <w:i w:val="0"/>
                 <w:sz w:val="20"/>
               </w:rPr>
               <w:t>Bảo mật</w:t>
@@ -748,7 +1033,7 @@
         <w:tc>
           <w:tcPr>
             <w:tcW w:type="dxa" w:w="3249"/>
-            <w:shd w:fill="EDF2F8"/>
+            <w:shd w:fill="F0F6F5"/>
           </w:tcPr>
           <w:p>
             <w:r>
@@ -758,6 +1043,8 @@
             </w:r>
             <w:r>
               <w:rPr>
+                <w:b w:val="0"/>
+                <w:i w:val="0"/>
                 <w:sz w:val="20"/>
               </w:rPr>
               <w:t>Truy cập remote</w:t>
@@ -767,7 +1054,7 @@
         <w:tc>
           <w:tcPr>
             <w:tcW w:type="dxa" w:w="3249"/>
-            <w:shd w:fill="EDF2F8"/>
+            <w:shd w:fill="F0F6F5"/>
           </w:tcPr>
           <w:p>
             <w:r>
@@ -777,6 +1064,8 @@
             </w:r>
             <w:r>
               <w:rPr>
+                <w:b w:val="0"/>
+                <w:i w:val="0"/>
                 <w:sz w:val="20"/>
               </w:rPr>
               <w:t>Chỉ IP admin (ufw + Windows FW)</w:t>
@@ -789,11 +1078,13 @@
     <w:p>
       <w:pPr>
         <w:pStyle w:val="Heading1"/>
+        <w:spacing w:before="360"/>
       </w:pPr>
       <w:r>
         <w:rPr>
-          <w:color w:val="1F4E79"/>
-          <w:sz w:val="28"/>
+          <w:rFonts w:ascii="Cambria" w:hAnsi="Cambria"/>
+          <w:color w:val="146B63"/>
+          <w:sz w:val="30"/>
         </w:rPr>
         <w:t>3. Kiến trúc giải pháp</w:t>
       </w:r>
@@ -804,315 +1095,77 @@
       </w:pPr>
       <w:r>
         <w:rPr>
-          <w:color w:val="1F4E79"/>
-          <w:sz w:val="24"/>
+          <w:rFonts w:ascii="Cambria" w:hAnsi="Cambria"/>
+          <w:color w:val="1A2423"/>
+          <w:sz w:val="25"/>
         </w:rPr>
         <w:t>3.1 Sơ đồ tổng thể</w:t>
       </w:r>
     </w:p>
     <w:p>
       <w:pPr>
-        <w:spacing w:after="0"/>
-        <w:ind w:left="227"/>
-        <w:shd w:fill="F5F5F5"/>
+        <w:keepNext/>
+        <w:spacing w:before="160"/>
+        <w:jc w:val="center"/>
       </w:pPr>
       <w:r>
-        <w:rPr>
-          <w:rFonts w:ascii="Consolas" w:hAnsi="Consolas"/>
-          <w:sz w:val="16"/>
-        </w:rPr>
-        <w:t xml:space="preserve">        USER (dải WAN 107.118.210.0/24 — air-gap)</w:t>
+        <w:drawing>
+          <wp:inline xmlns:a="http://schemas.openxmlformats.org/drawingml/2006/main" xmlns:pic="http://schemas.openxmlformats.org/drawingml/2006/picture">
+            <wp:extent cx="5976000" cy="5627400"/>
+            <wp:docPr id="1" name="Picture 1"/>
+            <wp:cNvGraphicFramePr>
+              <a:graphicFrameLocks noChangeAspect="1"/>
+            </wp:cNvGraphicFramePr>
+            <a:graphic>
+              <a:graphicData uri="http://schemas.openxmlformats.org/drawingml/2006/picture">
+                <pic:pic>
+                  <pic:nvPicPr>
+                    <pic:cNvPr id="0" name="axsvr-architecture.png"/>
+                    <pic:cNvPicPr/>
+                  </pic:nvPicPr>
+                  <pic:blipFill>
+                    <a:blip r:embed="rId11"/>
+                    <a:stretch>
+                      <a:fillRect/>
+                    </a:stretch>
+                  </pic:blipFill>
+                  <pic:spPr>
+                    <a:xfrm>
+                      <a:off x="0" y="0"/>
+                      <a:ext cx="5976000" cy="5627400"/>
+                    </a:xfrm>
+                    <a:prstGeom prst="rect"/>
+                  </pic:spPr>
+                </pic:pic>
+              </a:graphicData>
+            </a:graphic>
+          </wp:inline>
+        </w:drawing>
       </w:r>
     </w:p>
     <w:p>
       <w:pPr>
-        <w:spacing w:after="0"/>
-        <w:ind w:left="227"/>
-        <w:shd w:fill="F5F5F5"/>
+        <w:spacing w:after="280"/>
+        <w:jc w:val="center"/>
       </w:pPr>
       <w:r>
         <w:rPr>
-          <w:rFonts w:ascii="Consolas" w:hAnsi="Consolas"/>
-          <w:sz w:val="16"/>
+          <w:i/>
+          <w:color w:val="5A6B68"/>
+          <w:sz w:val="18"/>
         </w:rPr>
-        <w:t xml:space="preserve">                        │</w:t>
+        <w:t>Hình: Sơ đồ kiến trúc tổng thể AX Svr</w:t>
       </w:r>
     </w:p>
-    <w:p>
-      <w:pPr>
-        <w:spacing w:after="0"/>
-        <w:ind w:left="227"/>
-        <w:shd w:fill="F5F5F5"/>
-      </w:pPr>
-      <w:r>
-        <w:rPr>
-          <w:rFonts w:ascii="Consolas" w:hAnsi="Consolas"/>
-          <w:sz w:val="16"/>
-        </w:rPr>
-        <w:t xml:space="preserve">                        ▼</w:t>
-      </w:r>
-    </w:p>
-    <w:p>
-      <w:pPr>
-        <w:spacing w:after="0"/>
-        <w:ind w:left="227"/>
-        <w:shd w:fill="F5F5F5"/>
-      </w:pPr>
-      <w:r>
-        <w:rPr>
-          <w:rFonts w:ascii="Consolas" w:hAnsi="Consolas"/>
-          <w:sz w:val="16"/>
-        </w:rPr>
-        <w:t xml:space="preserve">            ╔═══ Proxy-VIP .100 ═══╗          ← Keepalived (VRRP)</w:t>
-      </w:r>
-    </w:p>
-    <w:p>
-      <w:pPr>
-        <w:spacing w:after="0"/>
-        <w:ind w:left="227"/>
-        <w:shd w:fill="F5F5F5"/>
-      </w:pPr>
-      <w:r>
-        <w:rPr>
-          <w:rFonts w:ascii="Consolas" w:hAnsi="Consolas"/>
-          <w:sz w:val="16"/>
-        </w:rPr>
-        <w:t xml:space="preserve">            ║                      ║</w:t>
-      </w:r>
-    </w:p>
-    <w:p>
-      <w:pPr>
-        <w:spacing w:after="0"/>
-        <w:ind w:left="227"/>
-        <w:shd w:fill="F5F5F5"/>
-      </w:pPr>
-      <w:r>
-        <w:rPr>
-          <w:rFonts w:ascii="Consolas" w:hAnsi="Consolas"/>
-          <w:sz w:val="16"/>
-        </w:rPr>
-        <w:t xml:space="preserve">     ax-proxy01 (.98)  ◄──►  ax-proxy02 (.99)   Nginx LB, TLS terminate</w:t>
-      </w:r>
-    </w:p>
-    <w:p>
-      <w:pPr>
-        <w:spacing w:after="0"/>
-        <w:ind w:left="227"/>
-        <w:shd w:fill="F5F5F5"/>
-      </w:pPr>
-      <w:r>
-        <w:rPr>
-          <w:rFonts w:ascii="Consolas" w:hAnsi="Consolas"/>
-          <w:sz w:val="16"/>
-        </w:rPr>
-        <w:t xml:space="preserve">            │      load balance    │</w:t>
-      </w:r>
-    </w:p>
-    <w:p>
-      <w:pPr>
-        <w:spacing w:after="0"/>
-        <w:ind w:left="227"/>
-        <w:shd w:fill="F5F5F5"/>
-      </w:pPr>
-      <w:r>
-        <w:rPr>
-          <w:rFonts w:ascii="Consolas" w:hAnsi="Consolas"/>
-          <w:sz w:val="16"/>
-        </w:rPr>
-        <w:t xml:space="preserve">            ├──────────┬───────────┘</w:t>
-      </w:r>
-    </w:p>
-    <w:p>
-      <w:pPr>
-        <w:spacing w:after="0"/>
-        <w:ind w:left="227"/>
-        <w:shd w:fill="F5F5F5"/>
-      </w:pPr>
-      <w:r>
-        <w:rPr>
-          <w:rFonts w:ascii="Consolas" w:hAnsi="Consolas"/>
-          <w:sz w:val="16"/>
-        </w:rPr>
-        <w:t xml:space="preserve">            ▼          ▼                        LAN 10.1.1.0/24</w:t>
-      </w:r>
-    </w:p>
-    <w:p>
-      <w:pPr>
-        <w:spacing w:after="0"/>
-        <w:ind w:left="227"/>
-        <w:shd w:fill="F5F5F5"/>
-      </w:pPr>
-      <w:r>
-        <w:rPr>
-          <w:rFonts w:ascii="Consolas" w:hAnsi="Consolas"/>
-          <w:sz w:val="16"/>
-        </w:rPr>
-        <w:t xml:space="preserve">     ax-web01 (.101)  ax-web02 (.102)           Win2025 + IIS, app local D:\app</w:t>
-      </w:r>
-    </w:p>
-    <w:p>
-      <w:pPr>
-        <w:spacing w:after="0"/>
-        <w:ind w:left="227"/>
-        <w:shd w:fill="F5F5F5"/>
-      </w:pPr>
-      <w:r>
-        <w:rPr>
-          <w:rFonts w:ascii="Consolas" w:hAnsi="Consolas"/>
-          <w:sz w:val="16"/>
-        </w:rPr>
-        <w:t xml:space="preserve">            │          │</w:t>
-      </w:r>
-    </w:p>
-    <w:p>
-      <w:pPr>
-        <w:spacing w:after="0"/>
-        <w:ind w:left="227"/>
-        <w:shd w:fill="F5F5F5"/>
-      </w:pPr>
-      <w:r>
-        <w:rPr>
-          <w:rFonts w:ascii="Consolas" w:hAnsi="Consolas"/>
-          <w:sz w:val="16"/>
-        </w:rPr>
-        <w:t xml:space="preserve">            │  connection string đa host</w:t>
-      </w:r>
-    </w:p>
-    <w:p>
-      <w:pPr>
-        <w:spacing w:after="0"/>
-        <w:ind w:left="227"/>
-        <w:shd w:fill="F5F5F5"/>
-      </w:pPr>
-      <w:r>
-        <w:rPr>
-          <w:rFonts w:ascii="Consolas" w:hAnsi="Consolas"/>
-          <w:sz w:val="16"/>
-        </w:rPr>
-        <w:t xml:space="preserve">            │  (target_session_attrs=read-write)</w:t>
-      </w:r>
-    </w:p>
-    <w:p>
-      <w:pPr>
-        <w:spacing w:after="0"/>
-        <w:ind w:left="227"/>
-        <w:shd w:fill="F5F5F5"/>
-      </w:pPr>
-      <w:r>
-        <w:rPr>
-          <w:rFonts w:ascii="Consolas" w:hAnsi="Consolas"/>
-          <w:sz w:val="16"/>
-        </w:rPr>
-        <w:t xml:space="preserve">            ▼          ▼</w:t>
-      </w:r>
-    </w:p>
-    <w:p>
-      <w:pPr>
-        <w:spacing w:after="0"/>
-        <w:ind w:left="227"/>
-        <w:shd w:fill="F5F5F5"/>
-      </w:pPr>
-      <w:r>
-        <w:rPr>
-          <w:rFonts w:ascii="Consolas" w:hAnsi="Consolas"/>
-          <w:sz w:val="16"/>
-        </w:rPr>
-        <w:t xml:space="preserve">     ax-db01 (.103)  ax-db02 (.104)  ax-db03 (.105)</w:t>
-      </w:r>
-    </w:p>
-    <w:p>
-      <w:pPr>
-        <w:spacing w:after="0"/>
-        <w:ind w:left="227"/>
-        <w:shd w:fill="F5F5F5"/>
-      </w:pPr>
-      <w:r>
-        <w:rPr>
-          <w:rFonts w:ascii="Consolas" w:hAnsi="Consolas"/>
-          <w:sz w:val="16"/>
-        </w:rPr>
-        <w:t xml:space="preserve">       LEADER        SYNC STANDBY     ASYNC REPLICA</w:t>
-      </w:r>
-    </w:p>
-    <w:p>
-      <w:pPr>
-        <w:spacing w:after="0"/>
-        <w:ind w:left="227"/>
-        <w:shd w:fill="F5F5F5"/>
-      </w:pPr>
-      <w:r>
-        <w:rPr>
-          <w:rFonts w:ascii="Consolas" w:hAnsi="Consolas"/>
-          <w:sz w:val="16"/>
-        </w:rPr>
-        <w:t xml:space="preserve">       PostgreSQL 17 + Patroni + etcd (quorum 3 node)</w:t>
-      </w:r>
-    </w:p>
-    <w:p>
-      <w:pPr>
-        <w:spacing w:after="0"/>
-        <w:ind w:left="227"/>
-        <w:shd w:fill="F5F5F5"/>
-      </w:pPr>
-      <w:r>
-        <w:rPr>
-          <w:rFonts w:ascii="Consolas" w:hAnsi="Consolas"/>
-          <w:sz w:val="16"/>
-        </w:rPr>
-        <w:t xml:space="preserve">                                      └─ /backup: pgBackRest + pg_dump</w:t>
-      </w:r>
-    </w:p>
-    <w:p>
-      <w:pPr>
-        <w:spacing w:after="0"/>
-        <w:ind w:left="227"/>
-        <w:shd w:fill="F5F5F5"/>
-      </w:pPr>
-      <w:r>
-        <w:rPr>
-          <w:rFonts w:ascii="Consolas" w:hAnsi="Consolas"/>
-          <w:sz w:val="16"/>
-        </w:rPr>
-        <w:t xml:space="preserve"> </w:t>
-      </w:r>
-    </w:p>
-    <w:p>
-      <w:pPr>
-        <w:spacing w:after="0"/>
-        <w:ind w:left="227"/>
-        <w:shd w:fill="F5F5F5"/>
-      </w:pPr>
-      <w:r>
-        <w:rPr>
-          <w:rFonts w:ascii="Consolas" w:hAnsi="Consolas"/>
-          <w:sz w:val="16"/>
-        </w:rPr>
-        <w:t xml:space="preserve">     nas (.97): Samba — kho source web (deploy theo release)</w:t>
-      </w:r>
-    </w:p>
-    <w:p>
-      <w:pPr>
-        <w:spacing w:after="0"/>
-        <w:ind w:left="227"/>
-        <w:shd w:fill="F5F5F5"/>
-      </w:pPr>
-      <w:r>
-        <w:rPr>
-          <w:rFonts w:ascii="Consolas" w:hAnsi="Consolas"/>
-          <w:sz w:val="16"/>
-        </w:rPr>
-        <w:t xml:space="preserve">     devdb (.90): PostgreSQL 17 standalone — môi trường Dev</w:t>
-      </w:r>
-    </w:p>
-    <w:p/>
     <w:p>
       <w:pPr>
         <w:pStyle w:val="Heading2"/>
       </w:pPr>
       <w:r>
         <w:rPr>
-          <w:color w:val="1F4E79"/>
-          <w:sz w:val="24"/>
+          <w:rFonts w:ascii="Cambria" w:hAnsi="Cambria"/>
+          <w:color w:val="1A2423"/>
+          <w:sz w:val="25"/>
         </w:rPr>
         <w:t>3.2 Các quyết định kiến trúc chính &amp; lý do</w:t>
       </w:r>
@@ -1124,10 +1177,15 @@
       <w:r>
         <w:rPr>
           <w:b/>
+          <w:i w:val="0"/>
         </w:rPr>
         <w:t>2 proxy + Keepalived/VIP (active-passive)</w:t>
       </w:r>
       <w:r>
+        <w:rPr>
+          <w:b w:val="0"/>
+          <w:i w:val="0"/>
+        </w:rPr>
         <w:t xml:space="preserve"> — HA tầng biên với 1 IP duy nhất cho user; failover tự động qua VRRP, không cần thiết bị cân bằng tải chuyên dụng.</w:t>
       </w:r>
     </w:p>
@@ -1138,10 +1196,15 @@
       <w:r>
         <w:rPr>
           <w:b/>
+          <w:i w:val="0"/>
         </w:rPr>
         <w:t>Cụm DB Patroni + etcd 3 node</w:t>
       </w:r>
       <w:r>
+        <w:rPr>
+          <w:b w:val="0"/>
+          <w:i w:val="0"/>
+        </w:rPr>
         <w:t xml:space="preserve"> — auto-failover chuẩn công nghiệp cho PostgreSQL; quorum số lẻ tránh split-brain; 1 sync standby (RPO=0) + 1 async replica.</w:t>
       </w:r>
     </w:p>
@@ -1152,29 +1215,46 @@
       <w:r>
         <w:rPr>
           <w:b/>
+          <w:i w:val="0"/>
         </w:rPr>
         <w:t>Ứng dụng kết nối DB bằng connection string đa host</w:t>
       </w:r>
       <w:r>
+        <w:rPr>
+          <w:b w:val="0"/>
+          <w:i w:val="0"/>
+        </w:rPr>
         <w:t xml:space="preserve"> (</w:t>
       </w:r>
       <w:r>
         <w:rPr>
           <w:rFonts w:ascii="Consolas" w:hAnsi="Consolas"/>
+          <w:b w:val="0"/>
+          <w:i w:val="0"/>
+          <w:color w:val="146B63"/>
           <w:sz w:val="20"/>
         </w:rPr>
         <w:t>target_session_attrs=read-write</w:t>
       </w:r>
       <w:r>
+        <w:rPr>
+          <w:b w:val="0"/>
+          <w:i w:val="0"/>
+        </w:rPr>
         <w:t xml:space="preserve">) thay vì HAProxy/DB-VIP — </w:t>
       </w:r>
       <w:r>
         <w:rPr>
           <w:b/>
+          <w:i w:val="0"/>
         </w:rPr>
         <w:t>bớt 1 lớp trung gian, bớt 1 điểm hỏng</w:t>
       </w:r>
       <w:r>
+        <w:rPr>
+          <w:b w:val="0"/>
+          <w:i w:val="0"/>
+        </w:rPr>
         <w:t>, độ an toàn dữ liệu tương đương (Patroni đảm nhiệm failover).</w:t>
       </w:r>
     </w:p>
@@ -1185,10 +1265,32 @@
       <w:r>
         <w:rPr>
           <w:b/>
+          <w:i w:val="0"/>
         </w:rPr>
-        <w:t>Web chạy local (`D:\app`), NAS chỉ là kho source</w:t>
+        <w:t>Web chạy local (</w:t>
       </w:r>
       <w:r>
+        <w:rPr>
+          <w:rFonts w:ascii="Consolas" w:hAnsi="Consolas"/>
+          <w:b/>
+          <w:i w:val="0"/>
+          <w:color w:val="146B63"/>
+          <w:sz w:val="20"/>
+        </w:rPr>
+        <w:t>D:\app</w:t>
+      </w:r>
+      <w:r>
+        <w:rPr>
+          <w:b/>
+          <w:i w:val="0"/>
+        </w:rPr>
+        <w:t>), NAS chỉ là kho source</w:t>
+      </w:r>
+      <w:r>
+        <w:rPr>
+          <w:b w:val="0"/>
+          <w:i w:val="0"/>
+        </w:rPr>
         <w:t xml:space="preserve"> — NAS hỏng thì web vẫn chạy bình thường; tránh biến NAS thành SPOF. Deploy theo release có version, rollback được.</w:t>
       </w:r>
     </w:p>
@@ -1199,10 +1301,32 @@
       <w:r>
         <w:rPr>
           <w:b/>
+          <w:i w:val="0"/>
         </w:rPr>
-        <w:t>Backup tập trung trên đĩa `/backup` riêng của DB3</w:t>
+        <w:t xml:space="preserve">Backup tập trung trên đĩa </w:t>
       </w:r>
       <w:r>
+        <w:rPr>
+          <w:rFonts w:ascii="Consolas" w:hAnsi="Consolas"/>
+          <w:b/>
+          <w:i w:val="0"/>
+          <w:color w:val="146B63"/>
+          <w:sz w:val="20"/>
+        </w:rPr>
+        <w:t>/backup</w:t>
+      </w:r>
+      <w:r>
+        <w:rPr>
+          <w:b/>
+          <w:i w:val="0"/>
+        </w:rPr>
+        <w:t xml:space="preserve"> riêng của DB3</w:t>
+      </w:r>
+      <w:r>
+        <w:rPr>
+          <w:b w:val="0"/>
+          <w:i w:val="0"/>
+        </w:rPr>
         <w:t xml:space="preserve"> — full hằng tuần + differential hằng ngày + WAL streaming liên tục; kèm pg_dump logic backup. (Giới hạn &amp; hướng xử lý: xem mục 6.)</w:t>
       </w:r>
     </w:p>
@@ -1213,10 +1337,15 @@
       <w:r>
         <w:rPr>
           <w:b/>
+          <w:i w:val="0"/>
         </w:rPr>
         <w:t>TLS terminate tại Nginx</w:t>
       </w:r>
       <w:r>
+        <w:rPr>
+          <w:b w:val="0"/>
+          <w:i w:val="0"/>
+        </w:rPr>
         <w:t xml:space="preserve"> — quản lý chứng chỉ tập trung 1 chỗ; IIS chạy HTTP nội bộ trong LAN.</w:t>
       </w:r>
     </w:p>
@@ -1227,10 +1356,15 @@
       <w:r>
         <w:rPr>
           <w:b/>
+          <w:i w:val="0"/>
         </w:rPr>
         <w:t>Air-gap compliance</w:t>
       </w:r>
       <w:r>
+        <w:rPr>
+          <w:b w:val="0"/>
+          <w:i w:val="0"/>
+        </w:rPr>
         <w:t xml:space="preserve"> — toàn bộ hướng dẫn cài đặt có phương án offline (mirror APT, CA nội bộ, NTP nội bộ).</w:t>
       </w:r>
     </w:p>
@@ -1240,8 +1374,9 @@
       </w:pPr>
       <w:r>
         <w:rPr>
-          <w:color w:val="1F4E79"/>
-          <w:sz w:val="24"/>
+          <w:rFonts w:ascii="Cambria" w:hAnsi="Cambria"/>
+          <w:color w:val="1A2423"/>
+          <w:sz w:val="25"/>
         </w:rPr>
         <w:t>3.3 Bảo mật — mô hình nhiều lớp</w:t>
       </w:r>
@@ -1253,19 +1388,29 @@
       <w:r>
         <w:rPr>
           <w:b/>
+          <w:i w:val="0"/>
         </w:rPr>
         <w:t>Mạng 2 dải tách biệt:</w:t>
       </w:r>
       <w:r>
+        <w:rPr>
+          <w:b w:val="0"/>
+          <w:i w:val="0"/>
+        </w:rPr>
         <w:t xml:space="preserve"> WAN (user truy cập) / LAN (replication, backup, quản trị nội bộ). PostgreSQL, etcd, Patroni, Samba </w:t>
       </w:r>
       <w:r>
         <w:rPr>
           <w:b/>
+          <w:i w:val="0"/>
         </w:rPr>
         <w:t>chỉ bind LAN</w:t>
       </w:r>
       <w:r>
+        <w:rPr>
+          <w:b w:val="0"/>
+          <w:i w:val="0"/>
+        </w:rPr>
         <w:t>.</w:t>
       </w:r>
     </w:p>
@@ -1276,39 +1421,63 @@
       <w:r>
         <w:rPr>
           <w:b/>
+          <w:i w:val="0"/>
         </w:rPr>
         <w:t>Firewall theo vai trò:</w:t>
       </w:r>
       <w:r>
+        <w:rPr>
+          <w:b w:val="0"/>
+          <w:i w:val="0"/>
+        </w:rPr>
         <w:t xml:space="preserve"> script </w:t>
       </w:r>
       <w:r>
         <w:rPr>
           <w:rFonts w:ascii="Consolas" w:hAnsi="Consolas"/>
+          <w:b w:val="0"/>
+          <w:i w:val="0"/>
+          <w:color w:val="146B63"/>
           <w:sz w:val="20"/>
         </w:rPr>
         <w:t>apply-firewall.sh</w:t>
       </w:r>
       <w:r>
+        <w:rPr>
+          <w:b w:val="0"/>
+          <w:i w:val="0"/>
+        </w:rPr>
         <w:t xml:space="preserve"> (Linux/ufw) + </w:t>
       </w:r>
       <w:r>
         <w:rPr>
           <w:rFonts w:ascii="Consolas" w:hAnsi="Consolas"/>
+          <w:b w:val="0"/>
+          <w:i w:val="0"/>
+          <w:color w:val="146B63"/>
           <w:sz w:val="20"/>
         </w:rPr>
         <w:t>apply-firewall-windows.ps1</w:t>
       </w:r>
       <w:r>
+        <w:rPr>
+          <w:b w:val="0"/>
+          <w:i w:val="0"/>
+        </w:rPr>
         <w:t xml:space="preserve"> (Windows/RDP) — SSH/RDP </w:t>
       </w:r>
       <w:r>
         <w:rPr>
           <w:b/>
+          <w:i w:val="0"/>
         </w:rPr>
         <w:t>chỉ mở cho IP admin</w:t>
       </w:r>
       <w:r>
+        <w:rPr>
+          <w:b w:val="0"/>
+          <w:i w:val="0"/>
+        </w:rPr>
         <w:t>.</w:t>
       </w:r>
     </w:p>
@@ -1319,41 +1488,185 @@
       <w:r>
         <w:rPr>
           <w:b/>
+          <w:i w:val="0"/>
         </w:rPr>
         <w:t>Kiểm soát DB 3 lớp:</w:t>
       </w:r>
       <w:r>
+        <w:rPr>
+          <w:b w:val="0"/>
+          <w:i w:val="0"/>
+        </w:rPr>
         <w:t xml:space="preserve"> ufw (chặn theo IP) → pg_hba (xác thực, pin IP per-user) → GRANT (quyền trên từng bảng). Tài khoản </w:t>
       </w:r>
       <w:r>
         <w:rPr>
           <w:rFonts w:ascii="Consolas" w:hAnsi="Consolas"/>
+          <w:b w:val="0"/>
+          <w:i w:val="0"/>
+          <w:color w:val="146B63"/>
           <w:sz w:val="20"/>
         </w:rPr>
         <w:t>postgres</w:t>
       </w:r>
       <w:r>
+        <w:rPr>
+          <w:b w:val="0"/>
+          <w:i w:val="0"/>
+        </w:rPr>
         <w:t xml:space="preserve"> gốc khóa local-only, quản trị dùng role riêng </w:t>
       </w:r>
       <w:r>
         <w:rPr>
           <w:rFonts w:ascii="Consolas" w:hAnsi="Consolas"/>
+          <w:b w:val="0"/>
+          <w:i w:val="0"/>
+          <w:color w:val="146B63"/>
           <w:sz w:val="20"/>
         </w:rPr>
         <w:t>dbadmin</w:t>
       </w:r>
       <w:r>
+        <w:rPr>
+          <w:b w:val="0"/>
+          <w:i w:val="0"/>
+        </w:rPr>
         <w:t>.</w:t>
       </w:r>
     </w:p>
     <w:p>
       <w:pPr>
-        <w:pStyle w:val="Heading1"/>
+        <w:keepNext/>
+        <w:spacing w:before="160"/>
+        <w:jc w:val="center"/>
+      </w:pPr>
+      <w:r>
+        <w:drawing>
+          <wp:inline xmlns:a="http://schemas.openxmlformats.org/drawingml/2006/main" xmlns:pic="http://schemas.openxmlformats.org/drawingml/2006/picture">
+            <wp:extent cx="5976000" cy="3087600"/>
+            <wp:docPr id="2" name="Picture 2"/>
+            <wp:cNvGraphicFramePr>
+              <a:graphicFrameLocks noChangeAspect="1"/>
+            </wp:cNvGraphicFramePr>
+            <a:graphic>
+              <a:graphicData uri="http://schemas.openxmlformats.org/drawingml/2006/picture">
+                <pic:pic>
+                  <pic:nvPicPr>
+                    <pic:cNvPr id="0" name="axsvr-security.png"/>
+                    <pic:cNvPicPr/>
+                  </pic:nvPicPr>
+                  <pic:blipFill>
+                    <a:blip r:embed="rId12"/>
+                    <a:stretch>
+                      <a:fillRect/>
+                    </a:stretch>
+                  </pic:blipFill>
+                  <pic:spPr>
+                    <a:xfrm>
+                      <a:off x="0" y="0"/>
+                      <a:ext cx="5976000" cy="3087600"/>
+                    </a:xfrm>
+                    <a:prstGeom prst="rect"/>
+                  </pic:spPr>
+                </pic:pic>
+              </a:graphicData>
+            </a:graphic>
+          </wp:inline>
+        </w:drawing>
+      </w:r>
+    </w:p>
+    <w:p>
+      <w:pPr>
+        <w:spacing w:after="280"/>
+        <w:jc w:val="center"/>
       </w:pPr>
       <w:r>
         <w:rPr>
-          <w:color w:val="1F4E79"/>
-          <w:sz w:val="28"/>
+          <w:i/>
+          <w:color w:val="5A6B68"/>
+          <w:sz w:val="18"/>
+        </w:rPr>
+        <w:t>Hình: Mô hình bảo mật nhiều lớp</w:t>
+      </w:r>
+    </w:p>
+    <w:p>
+      <w:pPr>
+        <w:pStyle w:val="Heading2"/>
+      </w:pPr>
+      <w:r>
+        <w:rPr>
+          <w:rFonts w:ascii="Cambria" w:hAnsi="Cambria"/>
+          <w:color w:val="1A2423"/>
+          <w:sz w:val="25"/>
+        </w:rPr>
+        <w:t>3.4 Chiến lược backup &amp; khôi phục dữ liệu</w:t>
+      </w:r>
+    </w:p>
+    <w:p>
+      <w:pPr>
+        <w:keepNext/>
+        <w:spacing w:before="160"/>
+        <w:jc w:val="center"/>
+      </w:pPr>
+      <w:r>
+        <w:drawing>
+          <wp:inline xmlns:a="http://schemas.openxmlformats.org/drawingml/2006/main" xmlns:pic="http://schemas.openxmlformats.org/drawingml/2006/picture">
+            <wp:extent cx="5976000" cy="3187200"/>
+            <wp:docPr id="3" name="Picture 3"/>
+            <wp:cNvGraphicFramePr>
+              <a:graphicFrameLocks noChangeAspect="1"/>
+            </wp:cNvGraphicFramePr>
+            <a:graphic>
+              <a:graphicData uri="http://schemas.openxmlformats.org/drawingml/2006/picture">
+                <pic:pic>
+                  <pic:nvPicPr>
+                    <pic:cNvPr id="0" name="axsvr-backup.png"/>
+                    <pic:cNvPicPr/>
+                  </pic:nvPicPr>
+                  <pic:blipFill>
+                    <a:blip r:embed="rId13"/>
+                    <a:stretch>
+                      <a:fillRect/>
+                    </a:stretch>
+                  </pic:blipFill>
+                  <pic:spPr>
+                    <a:xfrm>
+                      <a:off x="0" y="0"/>
+                      <a:ext cx="5976000" cy="3187200"/>
+                    </a:xfrm>
+                    <a:prstGeom prst="rect"/>
+                  </pic:spPr>
+                </pic:pic>
+              </a:graphicData>
+            </a:graphic>
+          </wp:inline>
+        </w:drawing>
+      </w:r>
+    </w:p>
+    <w:p>
+      <w:pPr>
+        <w:spacing w:after="280"/>
+        <w:jc w:val="center"/>
+      </w:pPr>
+      <w:r>
+        <w:rPr>
+          <w:i/>
+          <w:color w:val="5A6B68"/>
+          <w:sz w:val="18"/>
+        </w:rPr>
+        <w:t>Hình: Chiến lược backup và khôi phục</w:t>
+      </w:r>
+    </w:p>
+    <w:p>
+      <w:pPr>
+        <w:pStyle w:val="Heading1"/>
+        <w:spacing w:before="360"/>
+      </w:pPr>
+      <w:r>
+        <w:rPr>
+          <w:rFonts w:ascii="Cambria" w:hAnsi="Cambria"/>
+          <w:color w:val="146B63"/>
+          <w:sz w:val="30"/>
         </w:rPr>
         <w:t>4. Khối lượng công việc đã hoàn thành</w:t>
       </w:r>
@@ -1364,8 +1677,9 @@
       </w:pPr>
       <w:r>
         <w:rPr>
-          <w:color w:val="1F4E79"/>
-          <w:sz w:val="24"/>
+          <w:rFonts w:ascii="Cambria" w:hAnsi="Cambria"/>
+          <w:color w:val="1A2423"/>
+          <w:sz w:val="25"/>
         </w:rPr>
         <w:t>4.1 Hạ tầng đã triển khai (production)</w:t>
       </w:r>
@@ -1386,7 +1700,7 @@
         <w:tc>
           <w:tcPr>
             <w:tcW w:type="dxa" w:w="3249"/>
-            <w:shd w:fill="1F4E79"/>
+            <w:shd w:fill="146B63"/>
           </w:tcPr>
           <w:p>
             <w:r>
@@ -1399,6 +1713,7 @@
             <w:r>
               <w:rPr>
                 <w:b/>
+                <w:i w:val="0"/>
                 <w:color w:val="FFFFFF"/>
                 <w:sz w:val="20"/>
               </w:rPr>
@@ -1409,7 +1724,7 @@
         <w:tc>
           <w:tcPr>
             <w:tcW w:type="dxa" w:w="3249"/>
-            <w:shd w:fill="1F4E79"/>
+            <w:shd w:fill="146B63"/>
           </w:tcPr>
           <w:p>
             <w:r>
@@ -1422,6 +1737,7 @@
             <w:r>
               <w:rPr>
                 <w:b/>
+                <w:i w:val="0"/>
                 <w:color w:val="FFFFFF"/>
                 <w:sz w:val="20"/>
               </w:rPr>
@@ -1432,7 +1748,7 @@
         <w:tc>
           <w:tcPr>
             <w:tcW w:type="dxa" w:w="3249"/>
-            <w:shd w:fill="1F4E79"/>
+            <w:shd w:fill="146B63"/>
           </w:tcPr>
           <w:p>
             <w:r>
@@ -1445,6 +1761,7 @@
             <w:r>
               <w:rPr>
                 <w:b/>
+                <w:i w:val="0"/>
                 <w:color w:val="FFFFFF"/>
                 <w:sz w:val="20"/>
               </w:rPr>
@@ -1466,6 +1783,8 @@
             </w:r>
             <w:r>
               <w:rPr>
+                <w:b w:val="0"/>
+                <w:i w:val="0"/>
                 <w:sz w:val="20"/>
               </w:rPr>
               <w:t>1</w:t>
@@ -1484,6 +1803,8 @@
             </w:r>
             <w:r>
               <w:rPr>
+                <w:b w:val="0"/>
+                <w:i w:val="0"/>
                 <w:sz w:val="20"/>
               </w:rPr>
               <w:t>10 VM cài đặt hoàn chỉnh</w:t>
@@ -1502,6 +1823,8 @@
             </w:r>
             <w:r>
               <w:rPr>
+                <w:b w:val="0"/>
+                <w:i w:val="0"/>
                 <w:sz w:val="20"/>
               </w:rPr>
               <w:t>2 proxy, 2 web (Win2025), 3 DB, NAS, DevDB + chuẩn hóa OS/mạng 2 NIC/hardening</w:t>
@@ -1513,7 +1836,7 @@
         <w:tc>
           <w:tcPr>
             <w:tcW w:type="dxa" w:w="3249"/>
-            <w:shd w:fill="EDF2F8"/>
+            <w:shd w:fill="F0F6F5"/>
           </w:tcPr>
           <w:p>
             <w:r>
@@ -1523,6 +1846,8 @@
             </w:r>
             <w:r>
               <w:rPr>
+                <w:b w:val="0"/>
+                <w:i w:val="0"/>
                 <w:sz w:val="20"/>
               </w:rPr>
               <w:t>2</w:t>
@@ -1532,7 +1857,7 @@
         <w:tc>
           <w:tcPr>
             <w:tcW w:type="dxa" w:w="3249"/>
-            <w:shd w:fill="EDF2F8"/>
+            <w:shd w:fill="F0F6F5"/>
           </w:tcPr>
           <w:p>
             <w:r>
@@ -1542,6 +1867,8 @@
             </w:r>
             <w:r>
               <w:rPr>
+                <w:b w:val="0"/>
+                <w:i w:val="0"/>
                 <w:sz w:val="20"/>
               </w:rPr>
               <w:t>Cụm PostgreSQL HA</w:t>
@@ -1551,7 +1878,7 @@
         <w:tc>
           <w:tcPr>
             <w:tcW w:type="dxa" w:w="3249"/>
-            <w:shd w:fill="EDF2F8"/>
+            <w:shd w:fill="F0F6F5"/>
           </w:tcPr>
           <w:p>
             <w:r>
@@ -1561,6 +1888,8 @@
             </w:r>
             <w:r>
               <w:rPr>
+                <w:b w:val="0"/>
+                <w:i w:val="0"/>
                 <w:sz w:val="20"/>
               </w:rPr>
               <w:t xml:space="preserve">PostgreSQL 17 + Patroni + etcd 3 node, 1 sync + 1 async, data trên đĩa riêng </w:t>
@@ -1568,6 +1897,9 @@
             <w:r>
               <w:rPr>
                 <w:rFonts w:ascii="Consolas" w:hAnsi="Consolas"/>
+                <w:b w:val="0"/>
+                <w:i w:val="0"/>
+                <w:color w:val="146B63"/>
                 <w:sz w:val="20"/>
               </w:rPr>
               <w:t>/data</w:t>
@@ -1588,6 +1920,8 @@
             </w:r>
             <w:r>
               <w:rPr>
+                <w:b w:val="0"/>
+                <w:i w:val="0"/>
                 <w:sz w:val="20"/>
               </w:rPr>
               <w:t>3</w:t>
@@ -1606,6 +1940,8 @@
             </w:r>
             <w:r>
               <w:rPr>
+                <w:b w:val="0"/>
+                <w:i w:val="0"/>
                 <w:sz w:val="20"/>
               </w:rPr>
               <w:t>Tầng web IIS</w:t>
@@ -1624,6 +1960,8 @@
             </w:r>
             <w:r>
               <w:rPr>
+                <w:b w:val="0"/>
+                <w:i w:val="0"/>
                 <w:sz w:val="20"/>
               </w:rPr>
               <w:t>2 node Win2025, SPA routing, health check, forwarded headers</w:t>
@@ -1635,7 +1973,7 @@
         <w:tc>
           <w:tcPr>
             <w:tcW w:type="dxa" w:w="3249"/>
-            <w:shd w:fill="EDF2F8"/>
+            <w:shd w:fill="F0F6F5"/>
           </w:tcPr>
           <w:p>
             <w:r>
@@ -1645,6 +1983,8 @@
             </w:r>
             <w:r>
               <w:rPr>
+                <w:b w:val="0"/>
+                <w:i w:val="0"/>
                 <w:sz w:val="20"/>
               </w:rPr>
               <w:t>4</w:t>
@@ -1654,7 +1994,7 @@
         <w:tc>
           <w:tcPr>
             <w:tcW w:type="dxa" w:w="3249"/>
-            <w:shd w:fill="EDF2F8"/>
+            <w:shd w:fill="F0F6F5"/>
           </w:tcPr>
           <w:p>
             <w:r>
@@ -1664,6 +2004,8 @@
             </w:r>
             <w:r>
               <w:rPr>
+                <w:b w:val="0"/>
+                <w:i w:val="0"/>
                 <w:sz w:val="20"/>
               </w:rPr>
               <w:t>Tầng proxy HA</w:t>
@@ -1673,7 +2015,7 @@
         <w:tc>
           <w:tcPr>
             <w:tcW w:type="dxa" w:w="3249"/>
-            <w:shd w:fill="EDF2F8"/>
+            <w:shd w:fill="F0F6F5"/>
           </w:tcPr>
           <w:p>
             <w:r>
@@ -1683,6 +2025,8 @@
             </w:r>
             <w:r>
               <w:rPr>
+                <w:b w:val="0"/>
+                <w:i w:val="0"/>
                 <w:sz w:val="20"/>
               </w:rPr>
               <w:t>Nginx LB + Keepalived VIP, health check upstream</w:t>
@@ -1703,6 +2047,8 @@
             </w:r>
             <w:r>
               <w:rPr>
+                <w:b w:val="0"/>
+                <w:i w:val="0"/>
                 <w:sz w:val="20"/>
               </w:rPr>
               <w:t>5</w:t>
@@ -1721,6 +2067,8 @@
             </w:r>
             <w:r>
               <w:rPr>
+                <w:b w:val="0"/>
+                <w:i w:val="0"/>
                 <w:sz w:val="20"/>
               </w:rPr>
               <w:t>NAS kho source</w:t>
@@ -1739,6 +2087,8 @@
             </w:r>
             <w:r>
               <w:rPr>
+                <w:b w:val="0"/>
+                <w:i w:val="0"/>
                 <w:sz w:val="20"/>
               </w:rPr>
               <w:t>Samba bind LAN, quy trình deploy theo release NAS→local</w:t>
@@ -1750,7 +2100,7 @@
         <w:tc>
           <w:tcPr>
             <w:tcW w:type="dxa" w:w="3249"/>
-            <w:shd w:fill="EDF2F8"/>
+            <w:shd w:fill="F0F6F5"/>
           </w:tcPr>
           <w:p>
             <w:r>
@@ -1760,6 +2110,8 @@
             </w:r>
             <w:r>
               <w:rPr>
+                <w:b w:val="0"/>
+                <w:i w:val="0"/>
                 <w:sz w:val="20"/>
               </w:rPr>
               <w:t>6</w:t>
@@ -1769,7 +2121,7 @@
         <w:tc>
           <w:tcPr>
             <w:tcW w:type="dxa" w:w="3249"/>
-            <w:shd w:fill="EDF2F8"/>
+            <w:shd w:fill="F0F6F5"/>
           </w:tcPr>
           <w:p>
             <w:r>
@@ -1779,6 +2131,8 @@
             </w:r>
             <w:r>
               <w:rPr>
+                <w:b w:val="0"/>
+                <w:i w:val="0"/>
                 <w:sz w:val="20"/>
               </w:rPr>
               <w:t>Backup</w:t>
@@ -1788,7 +2142,7 @@
         <w:tc>
           <w:tcPr>
             <w:tcW w:type="dxa" w:w="3249"/>
-            <w:shd w:fill="EDF2F8"/>
+            <w:shd w:fill="F0F6F5"/>
           </w:tcPr>
           <w:p>
             <w:r>
@@ -1798,6 +2152,8 @@
             </w:r>
             <w:r>
               <w:rPr>
+                <w:b w:val="0"/>
+                <w:i w:val="0"/>
                 <w:sz w:val="20"/>
               </w:rPr>
               <w:t xml:space="preserve">pgBackRest (full/diff/WAL) + pg_dump, cron trên DB3, đĩa </w:t>
@@ -1805,12 +2161,17 @@
             <w:r>
               <w:rPr>
                 <w:rFonts w:ascii="Consolas" w:hAnsi="Consolas"/>
+                <w:b w:val="0"/>
+                <w:i w:val="0"/>
+                <w:color w:val="146B63"/>
                 <w:sz w:val="20"/>
               </w:rPr>
               <w:t>/backup</w:t>
             </w:r>
             <w:r>
               <w:rPr>
+                <w:b w:val="0"/>
+                <w:i w:val="0"/>
                 <w:sz w:val="20"/>
               </w:rPr>
               <w:t xml:space="preserve"> riêng</w:t>
@@ -1831,6 +2192,8 @@
             </w:r>
             <w:r>
               <w:rPr>
+                <w:b w:val="0"/>
+                <w:i w:val="0"/>
                 <w:sz w:val="20"/>
               </w:rPr>
               <w:t>7</w:t>
@@ -1849,6 +2212,8 @@
             </w:r>
             <w:r>
               <w:rPr>
+                <w:b w:val="0"/>
+                <w:i w:val="0"/>
                 <w:sz w:val="20"/>
               </w:rPr>
               <w:t>Firewall toàn hệ thống</w:t>
@@ -1867,6 +2232,8 @@
             </w:r>
             <w:r>
               <w:rPr>
+                <w:b w:val="0"/>
+                <w:i w:val="0"/>
                 <w:sz w:val="20"/>
               </w:rPr>
               <w:t>ufw theo vai trò + Windows Firewall, chỉ admin remote</w:t>
@@ -1878,7 +2245,7 @@
         <w:tc>
           <w:tcPr>
             <w:tcW w:type="dxa" w:w="3249"/>
-            <w:shd w:fill="EDF2F8"/>
+            <w:shd w:fill="F0F6F5"/>
           </w:tcPr>
           <w:p>
             <w:r>
@@ -1888,6 +2255,8 @@
             </w:r>
             <w:r>
               <w:rPr>
+                <w:b w:val="0"/>
+                <w:i w:val="0"/>
                 <w:sz w:val="20"/>
               </w:rPr>
               <w:t>8</w:t>
@@ -1897,7 +2266,7 @@
         <w:tc>
           <w:tcPr>
             <w:tcW w:type="dxa" w:w="3249"/>
-            <w:shd w:fill="EDF2F8"/>
+            <w:shd w:fill="F0F6F5"/>
           </w:tcPr>
           <w:p>
             <w:r>
@@ -1907,6 +2276,8 @@
             </w:r>
             <w:r>
               <w:rPr>
+                <w:b w:val="0"/>
+                <w:i w:val="0"/>
                 <w:sz w:val="20"/>
               </w:rPr>
               <w:t>DevDB</w:t>
@@ -1916,7 +2287,7 @@
         <w:tc>
           <w:tcPr>
             <w:tcW w:type="dxa" w:w="3249"/>
-            <w:shd w:fill="EDF2F8"/>
+            <w:shd w:fill="F0F6F5"/>
           </w:tcPr>
           <w:p>
             <w:r>
@@ -1926,6 +2297,8 @@
             </w:r>
             <w:r>
               <w:rPr>
+                <w:b w:val="0"/>
+                <w:i w:val="0"/>
                 <w:sz w:val="20"/>
               </w:rPr>
               <w:t>PostgreSQL 17 standalone cho đội Dev</w:t>
@@ -1937,50 +2310,54 @@
     <w:p/>
     <w:p>
       <w:pPr>
-        <w:ind w:left="283"/>
+        <w:ind w:left="227"/>
+        <w:shd w:fill="E3EFED"/>
       </w:pPr>
       <w:r>
         <w:rPr>
           <w:b/>
-          <w:i/>
-          <w:color w:val="595959"/>
+          <w:i w:val="0"/>
+          <w:sz w:val="20"/>
         </w:rPr>
         <w:t>Ghi chú monitoring:</w:t>
       </w:r>
       <w:r>
         <w:rPr>
-          <w:i/>
-          <w:color w:val="595959"/>
+          <w:b w:val="0"/>
+          <w:i w:val="0"/>
+          <w:sz w:val="20"/>
         </w:rPr>
         <w:t xml:space="preserve"> tài liệu Phase 6 (Prometheus/Grafana) đã hoàn chỉnh, nhưng </w:t>
       </w:r>
       <w:r>
         <w:rPr>
           <w:b/>
-          <w:i/>
-          <w:color w:val="595959"/>
+          <w:i w:val="0"/>
+          <w:sz w:val="20"/>
         </w:rPr>
         <w:t>không dựng node monitoring riêng</w:t>
       </w:r>
       <w:r>
         <w:rPr>
-          <w:i/>
-          <w:color w:val="595959"/>
+          <w:b w:val="0"/>
+          <w:i w:val="0"/>
+          <w:sz w:val="20"/>
         </w:rPr>
         <w:t xml:space="preserve"> — quyết định tận dụng hệ thống </w:t>
       </w:r>
       <w:r>
         <w:rPr>
           <w:b/>
-          <w:i/>
-          <w:color w:val="595959"/>
+          <w:i w:val="0"/>
+          <w:sz w:val="20"/>
         </w:rPr>
         <w:t>Zabbix/Grafana sẵn có</w:t>
       </w:r>
       <w:r>
         <w:rPr>
-          <w:i/>
-          <w:color w:val="595959"/>
+          <w:b w:val="0"/>
+          <w:i w:val="0"/>
+          <w:sz w:val="20"/>
         </w:rPr>
         <w:t xml:space="preserve"> của công ty (xem đề xuất mục 7).</w:t>
       </w:r>
@@ -1991,8 +2368,9 @@
       </w:pPr>
       <w:r>
         <w:rPr>
-          <w:color w:val="1F4E79"/>
-          <w:sz w:val="24"/>
+          <w:rFonts w:ascii="Cambria" w:hAnsi="Cambria"/>
+          <w:color w:val="1A2423"/>
+          <w:sz w:val="25"/>
         </w:rPr>
         <w:t>4.2 Sản phẩm bàn giao (deliverables)</w:t>
       </w:r>
@@ -2012,7 +2390,7 @@
         <w:tc>
           <w:tcPr>
             <w:tcW w:type="dxa" w:w="4873"/>
-            <w:shd w:fill="1F4E79"/>
+            <w:shd w:fill="146B63"/>
           </w:tcPr>
           <w:p>
             <w:r>
@@ -2025,6 +2403,7 @@
             <w:r>
               <w:rPr>
                 <w:b/>
+                <w:i w:val="0"/>
                 <w:color w:val="FFFFFF"/>
                 <w:sz w:val="20"/>
               </w:rPr>
@@ -2035,7 +2414,7 @@
         <w:tc>
           <w:tcPr>
             <w:tcW w:type="dxa" w:w="4873"/>
-            <w:shd w:fill="1F4E79"/>
+            <w:shd w:fill="146B63"/>
           </w:tcPr>
           <w:p>
             <w:r>
@@ -2048,6 +2427,7 @@
             <w:r>
               <w:rPr>
                 <w:b/>
+                <w:i w:val="0"/>
                 <w:color w:val="FFFFFF"/>
                 <w:sz w:val="20"/>
               </w:rPr>
@@ -2069,6 +2449,8 @@
             </w:r>
             <w:r>
               <w:rPr>
+                <w:b w:val="0"/>
+                <w:i w:val="0"/>
                 <w:sz w:val="20"/>
               </w:rPr>
               <w:t>Bộ tài liệu triển khai &amp; vận hành (Phase 0→6, DevDB, off-site, autoinstall)</w:t>
@@ -2087,6 +2469,8 @@
             </w:r>
             <w:r>
               <w:rPr>
+                <w:b w:val="0"/>
+                <w:i w:val="0"/>
                 <w:sz w:val="20"/>
               </w:rPr>
               <w:t>10 tài liệu, ~2.400 dòng, config tách riêng từng node (copy-paste được)</w:t>
@@ -2098,7 +2482,7 @@
         <w:tc>
           <w:tcPr>
             <w:tcW w:type="dxa" w:w="4873"/>
-            <w:shd w:fill="EDF2F8"/>
+            <w:shd w:fill="F0F6F5"/>
           </w:tcPr>
           <w:p>
             <w:r>
@@ -2108,6 +2492,8 @@
             </w:r>
             <w:r>
               <w:rPr>
+                <w:b w:val="0"/>
+                <w:i w:val="0"/>
                 <w:sz w:val="20"/>
               </w:rPr>
               <w:t xml:space="preserve">Bộ công cụ quản trị PostgreSQL </w:t>
@@ -2115,6 +2501,9 @@
             <w:r>
               <w:rPr>
                 <w:rFonts w:ascii="Consolas" w:hAnsi="Consolas"/>
+                <w:b w:val="0"/>
+                <w:i w:val="0"/>
+                <w:color w:val="146B63"/>
                 <w:sz w:val="20"/>
               </w:rPr>
               <w:t>db-scripts/</w:t>
@@ -2124,7 +2513,7 @@
         <w:tc>
           <w:tcPr>
             <w:tcW w:type="dxa" w:w="4873"/>
-            <w:shd w:fill="EDF2F8"/>
+            <w:shd w:fill="F0F6F5"/>
           </w:tcPr>
           <w:p>
             <w:r>
@@ -2134,6 +2523,8 @@
             </w:r>
             <w:r>
               <w:rPr>
+                <w:b w:val="0"/>
+                <w:i w:val="0"/>
                 <w:sz w:val="20"/>
               </w:rPr>
               <w:t>14 scripts: tạo admin/user/db, phân quyền nhóm, pin IP per-user, hỗ trợ cả DevDB &amp; cụm Patroni</w:t>
@@ -2154,6 +2545,8 @@
             </w:r>
             <w:r>
               <w:rPr>
+                <w:b w:val="0"/>
+                <w:i w:val="0"/>
                 <w:sz w:val="20"/>
               </w:rPr>
               <w:t>Scripts firewall tự động</w:t>
@@ -2172,6 +2565,8 @@
             </w:r>
             <w:r>
               <w:rPr>
+                <w:b w:val="0"/>
+                <w:i w:val="0"/>
                 <w:sz w:val="20"/>
               </w:rPr>
               <w:t>2 scripts (Linux + Windows)</w:t>
@@ -2183,7 +2578,7 @@
         <w:tc>
           <w:tcPr>
             <w:tcW w:type="dxa" w:w="4873"/>
-            <w:shd w:fill="EDF2F8"/>
+            <w:shd w:fill="F0F6F5"/>
           </w:tcPr>
           <w:p>
             <w:r>
@@ -2193,6 +2588,8 @@
             </w:r>
             <w:r>
               <w:rPr>
+                <w:b w:val="0"/>
+                <w:i w:val="0"/>
                 <w:sz w:val="20"/>
               </w:rPr>
               <w:t>Công cụ autoinstall Ubuntu 24.04</w:t>
@@ -2202,7 +2599,7 @@
         <w:tc>
           <w:tcPr>
             <w:tcW w:type="dxa" w:w="4873"/>
-            <w:shd w:fill="EDF2F8"/>
+            <w:shd w:fill="F0F6F5"/>
           </w:tcPr>
           <w:p>
             <w:r>
@@ -2213,12 +2610,17 @@
             <w:r>
               <w:rPr>
                 <w:rFonts w:ascii="Consolas" w:hAnsi="Consolas"/>
+                <w:b w:val="0"/>
+                <w:i w:val="0"/>
+                <w:color w:val="146B63"/>
                 <w:sz w:val="20"/>
               </w:rPr>
               <w:t>gen-autoinstall.sh</w:t>
             </w:r>
             <w:r>
               <w:rPr>
+                <w:b w:val="0"/>
+                <w:i w:val="0"/>
                 <w:sz w:val="20"/>
               </w:rPr>
               <w:t xml:space="preserve"> sinh seed ISO cho từng host</w:t>
@@ -2239,6 +2641,8 @@
             </w:r>
             <w:r>
               <w:rPr>
+                <w:b w:val="0"/>
+                <w:i w:val="0"/>
                 <w:sz w:val="20"/>
               </w:rPr>
               <w:t>Checklist nghiệm thu Go-Live</w:t>
@@ -2257,6 +2661,8 @@
             </w:r>
             <w:r>
               <w:rPr>
+                <w:b w:val="0"/>
+                <w:i w:val="0"/>
                 <w:sz w:val="20"/>
               </w:rPr>
               <w:t>Đầy đủ theo từng tầng, gồm các bài test sập node thực tế</w:t>
@@ -2268,7 +2674,7 @@
         <w:tc>
           <w:tcPr>
             <w:tcW w:type="dxa" w:w="4873"/>
-            <w:shd w:fill="EDF2F8"/>
+            <w:shd w:fill="F0F6F5"/>
           </w:tcPr>
           <w:p>
             <w:r>
@@ -2278,6 +2684,8 @@
             </w:r>
             <w:r>
               <w:rPr>
+                <w:b w:val="0"/>
+                <w:i w:val="0"/>
                 <w:sz w:val="20"/>
               </w:rPr>
               <w:t>Quản lý version</w:t>
@@ -2287,7 +2695,7 @@
         <w:tc>
           <w:tcPr>
             <w:tcW w:type="dxa" w:w="4873"/>
-            <w:shd w:fill="EDF2F8"/>
+            <w:shd w:fill="F0F6F5"/>
           </w:tcPr>
           <w:p>
             <w:r>
@@ -2297,6 +2705,8 @@
             </w:r>
             <w:r>
               <w:rPr>
+                <w:b w:val="0"/>
+                <w:i w:val="0"/>
                 <w:sz w:val="20"/>
               </w:rPr>
               <w:t xml:space="preserve">Git repo riêng (private), tag </w:t>
@@ -2304,6 +2714,7 @@
             <w:r>
               <w:rPr>
                 <w:b/>
+                <w:i w:val="0"/>
                 <w:sz w:val="20"/>
               </w:rPr>
               <w:t>v1.0.0</w:t>
@@ -2319,10 +2730,66 @@
       </w:pPr>
       <w:r>
         <w:rPr>
-          <w:color w:val="1F4E79"/>
-          <w:sz w:val="24"/>
+          <w:rFonts w:ascii="Cambria" w:hAnsi="Cambria"/>
+          <w:color w:val="1A2423"/>
+          <w:sz w:val="25"/>
         </w:rPr>
         <w:t>4.3 Kết quả kiểm thử HA (theo checklist nghiệm thu)</w:t>
+      </w:r>
+    </w:p>
+    <w:p>
+      <w:pPr>
+        <w:keepNext/>
+        <w:spacing w:before="160"/>
+        <w:jc w:val="center"/>
+      </w:pPr>
+      <w:r>
+        <w:drawing>
+          <wp:inline xmlns:a="http://schemas.openxmlformats.org/drawingml/2006/main" xmlns:pic="http://schemas.openxmlformats.org/drawingml/2006/picture">
+            <wp:extent cx="5976000" cy="3286800"/>
+            <wp:docPr id="4" name="Picture 4"/>
+            <wp:cNvGraphicFramePr>
+              <a:graphicFrameLocks noChangeAspect="1"/>
+            </wp:cNvGraphicFramePr>
+            <a:graphic>
+              <a:graphicData uri="http://schemas.openxmlformats.org/drawingml/2006/picture">
+                <pic:pic>
+                  <pic:nvPicPr>
+                    <pic:cNvPr id="0" name="axsvr-db-failover.png"/>
+                    <pic:cNvPicPr/>
+                  </pic:nvPicPr>
+                  <pic:blipFill>
+                    <a:blip r:embed="rId14"/>
+                    <a:stretch>
+                      <a:fillRect/>
+                    </a:stretch>
+                  </pic:blipFill>
+                  <pic:spPr>
+                    <a:xfrm>
+                      <a:off x="0" y="0"/>
+                      <a:ext cx="5976000" cy="3286800"/>
+                    </a:xfrm>
+                    <a:prstGeom prst="rect"/>
+                  </pic:spPr>
+                </pic:pic>
+              </a:graphicData>
+            </a:graphic>
+          </wp:inline>
+        </w:drawing>
+      </w:r>
+    </w:p>
+    <w:p>
+      <w:pPr>
+        <w:spacing w:after="280"/>
+        <w:jc w:val="center"/>
+      </w:pPr>
+      <w:r>
+        <w:rPr>
+          <w:i/>
+          <w:color w:val="5A6B68"/>
+          <w:sz w:val="18"/>
+        </w:rPr>
+        <w:t>Hình: Kịch bản failover cụm PostgreSQL</w:t>
       </w:r>
     </w:p>
     <w:p>
@@ -2330,15 +2797,24 @@
         <w:pStyle w:val="ListBullet"/>
       </w:pPr>
       <w:r>
+        <w:rPr>
+          <w:b w:val="0"/>
+          <w:i w:val="0"/>
+        </w:rPr>
         <w:t xml:space="preserve">Tắt node DB leader → cụm tự bầu leader mới </w:t>
       </w:r>
       <w:r>
         <w:rPr>
           <w:b/>
+          <w:i w:val="0"/>
         </w:rPr>
         <w:t>&lt; 30 giây</w:t>
       </w:r>
       <w:r>
+        <w:rPr>
+          <w:b w:val="0"/>
+          <w:i w:val="0"/>
+        </w:rPr>
         <w:t>, ứng dụng ghi tiếp bình thường; node cũ bật lại tự rejoin thành replica.</w:t>
       </w:r>
     </w:p>
@@ -2347,15 +2823,24 @@
         <w:pStyle w:val="ListBullet"/>
       </w:pPr>
       <w:r>
+        <w:rPr>
+          <w:b w:val="0"/>
+          <w:i w:val="0"/>
+        </w:rPr>
         <w:t xml:space="preserve">Tắt proxy chính → VIP chuyển sang proxy phụ </w:t>
       </w:r>
       <w:r>
         <w:rPr>
           <w:b/>
+          <w:i w:val="0"/>
         </w:rPr>
         <w:t>&lt; 3 giây</w:t>
       </w:r>
       <w:r>
+        <w:rPr>
+          <w:b w:val="0"/>
+          <w:i w:val="0"/>
+        </w:rPr>
         <w:t>, user không gián đoạn.</w:t>
       </w:r>
     </w:p>
@@ -2364,6 +2849,10 @@
         <w:pStyle w:val="ListBullet"/>
       </w:pPr>
       <w:r>
+        <w:rPr>
+          <w:b w:val="0"/>
+          <w:i w:val="0"/>
+        </w:rPr>
         <w:t>Tắt 1 web → Nginx tự loại khỏi pool, dịch vụ tiếp tục trên node còn lại.</w:t>
       </w:r>
     </w:p>
@@ -2372,17 +2861,23 @@
         <w:pStyle w:val="ListBullet"/>
       </w:pPr>
       <w:r>
+        <w:rPr>
+          <w:b w:val="0"/>
+          <w:i w:val="0"/>
+        </w:rPr>
         <w:t>Backup: WAL archive hoạt động liên tục, khôi phục PITR đã diễn tập thành công.</w:t>
       </w:r>
     </w:p>
     <w:p>
       <w:pPr>
         <w:pStyle w:val="Heading1"/>
+        <w:spacing w:before="360"/>
       </w:pPr>
       <w:r>
         <w:rPr>
-          <w:color w:val="1F4E79"/>
-          <w:sz w:val="28"/>
+          <w:rFonts w:ascii="Cambria" w:hAnsi="Cambria"/>
+          <w:color w:val="146B63"/>
+          <w:sz w:val="30"/>
         </w:rPr>
         <w:t>5. Giá trị mang lại</w:t>
       </w:r>
@@ -2394,10 +2889,15 @@
       <w:r>
         <w:rPr>
           <w:b/>
+          <w:i w:val="0"/>
         </w:rPr>
         <w:t>Loại bỏ SPOF ở mọi tầng</w:t>
       </w:r>
       <w:r>
+        <w:rPr>
+          <w:b w:val="0"/>
+          <w:i w:val="0"/>
+        </w:rPr>
         <w:t xml:space="preserve"> — bất kỳ 1 máy chủ nào hỏng, dịch vụ vẫn chạy; giảm thiểu downtime ngoài kế hoạch.</w:t>
       </w:r>
     </w:p>
@@ -2408,10 +2908,15 @@
       <w:r>
         <w:rPr>
           <w:b/>
+          <w:i w:val="0"/>
         </w:rPr>
         <w:t>An toàn dữ liệu 2 lớp</w:t>
       </w:r>
       <w:r>
+        <w:rPr>
+          <w:b w:val="0"/>
+          <w:i w:val="0"/>
+        </w:rPr>
         <w:t xml:space="preserve"> — sync replica (RPO=0 khi mất leader) + backup PITR (khôi phục sai sót logic, xóa nhầm dữ liệu).</w:t>
       </w:r>
     </w:p>
@@ -2422,10 +2927,15 @@
       <w:r>
         <w:rPr>
           <w:b/>
+          <w:i w:val="0"/>
         </w:rPr>
         <w:t>Vận hành đơn giản hóa</w:t>
       </w:r>
       <w:r>
+        <w:rPr>
+          <w:b w:val="0"/>
+          <w:i w:val="0"/>
+        </w:rPr>
         <w:t xml:space="preserve"> — failover hoàn toàn tự động ở cả 3 tầng, không cần can thiệp tay lúc sự cố.</w:t>
       </w:r>
     </w:p>
@@ -2436,10 +2946,15 @@
       <w:r>
         <w:rPr>
           <w:b/>
+          <w:i w:val="0"/>
         </w:rPr>
         <w:t>Tri thức được tài liệu hóa</w:t>
       </w:r>
       <w:r>
+        <w:rPr>
+          <w:b w:val="0"/>
+          <w:i w:val="0"/>
+        </w:rPr>
         <w:t xml:space="preserve"> — bất kỳ kỹ sư nào cũng có thể vận hành/tái dựng hệ thống theo runbook; không phụ thuộc cá nhân.</w:t>
       </w:r>
     </w:p>
@@ -2450,21 +2965,28 @@
       <w:r>
         <w:rPr>
           <w:b/>
+          <w:i w:val="0"/>
         </w:rPr>
         <w:t>Tái sử dụng được</w:t>
       </w:r>
       <w:r>
+        <w:rPr>
+          <w:b w:val="0"/>
+          <w:i w:val="0"/>
+        </w:rPr>
         <w:t xml:space="preserve"> — bộ tài liệu + scripts là nền tảng chuẩn để triển khai cho các khách hàng tương lai có nhu cầu tương tự.</w:t>
       </w:r>
     </w:p>
     <w:p>
       <w:pPr>
         <w:pStyle w:val="Heading1"/>
+        <w:spacing w:before="360"/>
       </w:pPr>
       <w:r>
         <w:rPr>
-          <w:color w:val="1F4E79"/>
-          <w:sz w:val="28"/>
+          <w:rFonts w:ascii="Cambria" w:hAnsi="Cambria"/>
+          <w:color w:val="146B63"/>
+          <w:sz w:val="30"/>
         </w:rPr>
         <w:t>6. Rủi ro còn lại &amp; giới hạn hiện tại</w:t>
       </w:r>
@@ -2486,7 +3008,7 @@
         <w:tc>
           <w:tcPr>
             <w:tcW w:type="dxa" w:w="2436"/>
-            <w:shd w:fill="1F4E79"/>
+            <w:shd w:fill="146B63"/>
           </w:tcPr>
           <w:p>
             <w:r>
@@ -2499,6 +3021,7 @@
             <w:r>
               <w:rPr>
                 <w:b/>
+                <w:i w:val="0"/>
                 <w:color w:val="FFFFFF"/>
                 <w:sz w:val="20"/>
               </w:rPr>
@@ -2509,7 +3032,7 @@
         <w:tc>
           <w:tcPr>
             <w:tcW w:type="dxa" w:w="2436"/>
-            <w:shd w:fill="1F4E79"/>
+            <w:shd w:fill="146B63"/>
           </w:tcPr>
           <w:p>
             <w:r>
@@ -2522,6 +3045,7 @@
             <w:r>
               <w:rPr>
                 <w:b/>
+                <w:i w:val="0"/>
                 <w:color w:val="FFFFFF"/>
                 <w:sz w:val="20"/>
               </w:rPr>
@@ -2532,7 +3056,7 @@
         <w:tc>
           <w:tcPr>
             <w:tcW w:type="dxa" w:w="2436"/>
-            <w:shd w:fill="1F4E79"/>
+            <w:shd w:fill="146B63"/>
           </w:tcPr>
           <w:p>
             <w:r>
@@ -2545,6 +3069,7 @@
             <w:r>
               <w:rPr>
                 <w:b/>
+                <w:i w:val="0"/>
                 <w:color w:val="FFFFFF"/>
                 <w:sz w:val="20"/>
               </w:rPr>
@@ -2555,7 +3080,7 @@
         <w:tc>
           <w:tcPr>
             <w:tcW w:type="dxa" w:w="2436"/>
-            <w:shd w:fill="1F4E79"/>
+            <w:shd w:fill="146B63"/>
           </w:tcPr>
           <w:p>
             <w:r>
@@ -2568,6 +3093,7 @@
             <w:r>
               <w:rPr>
                 <w:b/>
+                <w:i w:val="0"/>
                 <w:color w:val="FFFFFF"/>
                 <w:sz w:val="20"/>
               </w:rPr>
@@ -2589,6 +3115,8 @@
             </w:r>
             <w:r>
               <w:rPr>
+                <w:b w:val="0"/>
+                <w:i w:val="0"/>
                 <w:sz w:val="20"/>
               </w:rPr>
               <w:t>1</w:t>
@@ -2607,6 +3135,8 @@
             </w:r>
             <w:r>
               <w:rPr>
+                <w:b w:val="0"/>
+                <w:i w:val="0"/>
                 <w:sz w:val="20"/>
               </w:rPr>
               <w:t>Backup đang nằm trên DB3 — cùng cụm với dữ liệu chính. Thảm họa mất cả cụm (cháy, hỏng storage ảo hóa) sẽ mất cả backup</w:t>
@@ -2626,6 +3156,7 @@
             <w:r>
               <w:rPr>
                 <w:b/>
+                <w:i w:val="0"/>
                 <w:sz w:val="20"/>
               </w:rPr>
               <w:t>Cao</w:t>
@@ -2644,6 +3175,8 @@
             </w:r>
             <w:r>
               <w:rPr>
+                <w:b w:val="0"/>
+                <w:i w:val="0"/>
                 <w:sz w:val="20"/>
               </w:rPr>
               <w:t>Bổ sung backup off-site (site khác/đĩa rời — air-gap không dùng được cloud) → hoàn thiện chuẩn 3-2-1. Tài liệu đã viết sẵn (Phase 5b)</w:t>
@@ -2655,7 +3188,7 @@
         <w:tc>
           <w:tcPr>
             <w:tcW w:type="dxa" w:w="2436"/>
-            <w:shd w:fill="EDF2F8"/>
+            <w:shd w:fill="F0F6F5"/>
           </w:tcPr>
           <w:p>
             <w:r>
@@ -2665,6 +3198,8 @@
             </w:r>
             <w:r>
               <w:rPr>
+                <w:b w:val="0"/>
+                <w:i w:val="0"/>
                 <w:sz w:val="20"/>
               </w:rPr>
               <w:t>2</w:t>
@@ -2674,7 +3209,7 @@
         <w:tc>
           <w:tcPr>
             <w:tcW w:type="dxa" w:w="2436"/>
-            <w:shd w:fill="EDF2F8"/>
+            <w:shd w:fill="F0F6F5"/>
           </w:tcPr>
           <w:p>
             <w:r>
@@ -2684,6 +3219,8 @@
             </w:r>
             <w:r>
               <w:rPr>
+                <w:b w:val="0"/>
+                <w:i w:val="0"/>
                 <w:sz w:val="20"/>
               </w:rPr>
               <w:t>Chưa có giám sát/cảnh báo tập trung — sự cố 1 node (hệ thống vẫn chạy nhờ HA) có thể không ai biết, đến khi node thứ 2 hỏng mới lộ</w:t>
@@ -2693,7 +3230,7 @@
         <w:tc>
           <w:tcPr>
             <w:tcW w:type="dxa" w:w="2436"/>
-            <w:shd w:fill="EDF2F8"/>
+            <w:shd w:fill="F0F6F5"/>
           </w:tcPr>
           <w:p>
             <w:r>
@@ -2704,6 +3241,7 @@
             <w:r>
               <w:rPr>
                 <w:b/>
+                <w:i w:val="0"/>
                 <w:sz w:val="20"/>
               </w:rPr>
               <w:t>Cao</w:t>
@@ -2713,7 +3251,7 @@
         <w:tc>
           <w:tcPr>
             <w:tcW w:type="dxa" w:w="2436"/>
-            <w:shd w:fill="EDF2F8"/>
+            <w:shd w:fill="F0F6F5"/>
           </w:tcPr>
           <w:p>
             <w:r>
@@ -2723,6 +3261,8 @@
             </w:r>
             <w:r>
               <w:rPr>
+                <w:b w:val="0"/>
+                <w:i w:val="0"/>
                 <w:sz w:val="20"/>
               </w:rPr>
               <w:t>Tích hợp Zabbix/Grafana sẵn có (mục 7.1)</w:t>
@@ -2743,6 +3283,8 @@
             </w:r>
             <w:r>
               <w:rPr>
+                <w:b w:val="0"/>
+                <w:i w:val="0"/>
                 <w:sz w:val="20"/>
               </w:rPr>
               <w:t>3</w:t>
@@ -2761,6 +3303,8 @@
             </w:r>
             <w:r>
               <w:rPr>
+                <w:b w:val="0"/>
+                <w:i w:val="0"/>
                 <w:sz w:val="20"/>
               </w:rPr>
               <w:t xml:space="preserve">HA chỉ đúng khi VM cùng vai trò nằm </w:t>
@@ -2768,12 +3312,15 @@
             <w:r>
               <w:rPr>
                 <w:b/>
+                <w:i w:val="0"/>
                 <w:sz w:val="20"/>
               </w:rPr>
               <w:t>khác host vật lý</w:t>
             </w:r>
             <w:r>
               <w:rPr>
+                <w:b w:val="0"/>
+                <w:i w:val="0"/>
                 <w:sz w:val="20"/>
               </w:rPr>
               <w:t xml:space="preserve"> (anti-affinity)</w:t>
@@ -2792,6 +3339,8 @@
             </w:r>
             <w:r>
               <w:rPr>
+                <w:b w:val="0"/>
+                <w:i w:val="0"/>
                 <w:sz w:val="20"/>
               </w:rPr>
               <w:t>Trung bình</w:t>
@@ -2810,6 +3359,8 @@
             </w:r>
             <w:r>
               <w:rPr>
+                <w:b w:val="0"/>
+                <w:i w:val="0"/>
                 <w:sz w:val="20"/>
               </w:rPr>
               <w:t>Xác nhận cấu hình anti-affinity trên tầng ảo hóa</w:t>
@@ -2821,7 +3372,7 @@
         <w:tc>
           <w:tcPr>
             <w:tcW w:type="dxa" w:w="2436"/>
-            <w:shd w:fill="EDF2F8"/>
+            <w:shd w:fill="F0F6F5"/>
           </w:tcPr>
           <w:p>
             <w:r>
@@ -2831,6 +3382,8 @@
             </w:r>
             <w:r>
               <w:rPr>
+                <w:b w:val="0"/>
+                <w:i w:val="0"/>
                 <w:sz w:val="20"/>
               </w:rPr>
               <w:t>4</w:t>
@@ -2840,7 +3393,7 @@
         <w:tc>
           <w:tcPr>
             <w:tcW w:type="dxa" w:w="2436"/>
-            <w:shd w:fill="EDF2F8"/>
+            <w:shd w:fill="F0F6F5"/>
           </w:tcPr>
           <w:p>
             <w:r>
@@ -2850,6 +3403,8 @@
             </w:r>
             <w:r>
               <w:rPr>
+                <w:b w:val="0"/>
+                <w:i w:val="0"/>
                 <w:sz w:val="20"/>
               </w:rPr>
               <w:t>Chứng chỉ TLS dùng CA nội bộ — cần quy trình gia hạn/phân phối CA cho client</w:t>
@@ -2859,7 +3414,7 @@
         <w:tc>
           <w:tcPr>
             <w:tcW w:type="dxa" w:w="2436"/>
-            <w:shd w:fill="EDF2F8"/>
+            <w:shd w:fill="F0F6F5"/>
           </w:tcPr>
           <w:p>
             <w:r>
@@ -2869,6 +3424,8 @@
             </w:r>
             <w:r>
               <w:rPr>
+                <w:b w:val="0"/>
+                <w:i w:val="0"/>
                 <w:sz w:val="20"/>
               </w:rPr>
               <w:t>Trung bình</w:t>
@@ -2878,7 +3435,7 @@
         <w:tc>
           <w:tcPr>
             <w:tcW w:type="dxa" w:w="2436"/>
-            <w:shd w:fill="EDF2F8"/>
+            <w:shd w:fill="F0F6F5"/>
           </w:tcPr>
           <w:p>
             <w:r>
@@ -2888,6 +3445,8 @@
             </w:r>
             <w:r>
               <w:rPr>
+                <w:b w:val="0"/>
+                <w:i w:val="0"/>
                 <w:sz w:val="20"/>
               </w:rPr>
               <w:t>Đưa vào quy trình vận hành định kỳ</w:t>
@@ -2908,6 +3467,8 @@
             </w:r>
             <w:r>
               <w:rPr>
+                <w:b w:val="0"/>
+                <w:i w:val="0"/>
                 <w:sz w:val="20"/>
               </w:rPr>
               <w:t>5</w:t>
@@ -2926,6 +3487,8 @@
             </w:r>
             <w:r>
               <w:rPr>
+                <w:b w:val="0"/>
+                <w:i w:val="0"/>
                 <w:sz w:val="20"/>
               </w:rPr>
               <w:t>Kỹ năng vận hành Patroni/pgBackRest cần duy trì</w:t>
@@ -2944,6 +3507,8 @@
             </w:r>
             <w:r>
               <w:rPr>
+                <w:b w:val="0"/>
+                <w:i w:val="0"/>
                 <w:sz w:val="20"/>
               </w:rPr>
               <w:t>Trung bình</w:t>
@@ -2962,6 +3527,8 @@
             </w:r>
             <w:r>
               <w:rPr>
+                <w:b w:val="0"/>
+                <w:i w:val="0"/>
                 <w:sz w:val="20"/>
               </w:rPr>
               <w:t>Diễn tập failover + PITR định kỳ (quý/lần) theo checklist có sẵn</w:t>
@@ -2974,11 +3541,13 @@
     <w:p>
       <w:pPr>
         <w:pStyle w:val="Heading1"/>
+        <w:spacing w:before="360"/>
       </w:pPr>
       <w:r>
         <w:rPr>
-          <w:color w:val="1F4E79"/>
-          <w:sz w:val="28"/>
+          <w:rFonts w:ascii="Cambria" w:hAnsi="Cambria"/>
+          <w:color w:val="146B63"/>
+          <w:sz w:val="30"/>
         </w:rPr>
         <w:t>7. Đề xuất giai đoạn tiếp theo</w:t>
       </w:r>
@@ -2989,14 +3558,19 @@
       </w:pPr>
       <w:r>
         <w:rPr>
-          <w:color w:val="1F4E79"/>
-          <w:sz w:val="24"/>
+          <w:rFonts w:ascii="Cambria" w:hAnsi="Cambria"/>
+          <w:color w:val="1A2423"/>
+          <w:sz w:val="25"/>
         </w:rPr>
         <w:t>7.1 Tích hợp giám sát vào Zabbix/Grafana sẵn có *(ưu tiên cao)*</w:t>
       </w:r>
     </w:p>
     <w:p>
       <w:r>
+        <w:rPr>
+          <w:b w:val="0"/>
+          <w:i w:val="0"/>
+        </w:rPr>
         <w:t>Không dựng node monitoring riêng; tận dụng hạ tầng giám sát công ty đang vận hành:</w:t>
       </w:r>
     </w:p>
@@ -3005,6 +3579,10 @@
         <w:pStyle w:val="ListBullet"/>
       </w:pPr>
       <w:r>
+        <w:rPr>
+          <w:b w:val="0"/>
+          <w:i w:val="0"/>
+        </w:rPr>
         <w:t>Cài Zabbix agent trên các node Linux/Windows; giám sát port/service các tầng (nginx, keepalived, IIS, postgres, patroni, etcd).</w:t>
       </w:r>
     </w:p>
@@ -3013,16 +3591,27 @@
         <w:pStyle w:val="ListBullet"/>
       </w:pPr>
       <w:r>
+        <w:rPr>
+          <w:b w:val="0"/>
+          <w:i w:val="0"/>
+        </w:rPr>
         <w:t>Giám sát trạng thái cụm qua Patroni REST API (</w:t>
       </w:r>
       <w:r>
         <w:rPr>
           <w:rFonts w:ascii="Consolas" w:hAnsi="Consolas"/>
+          <w:b w:val="0"/>
+          <w:i w:val="0"/>
+          <w:color w:val="146B63"/>
           <w:sz w:val="20"/>
         </w:rPr>
         <w:t>:8008/metrics</w:t>
       </w:r>
       <w:r>
+        <w:rPr>
+          <w:b w:val="0"/>
+          <w:i w:val="0"/>
+        </w:rPr>
         <w:t>) và etcd health.</w:t>
       </w:r>
     </w:p>
@@ -3031,26 +3620,44 @@
         <w:pStyle w:val="ListBullet"/>
       </w:pPr>
       <w:r>
+        <w:rPr>
+          <w:b w:val="0"/>
+          <w:i w:val="0"/>
+        </w:rPr>
         <w:t xml:space="preserve">Cảnh báo tối thiểu: node down, cụm mất leader/mất sync standby, backup thất bại/quá hạn, dung lượng đĩa </w:t>
       </w:r>
       <w:r>
         <w:rPr>
           <w:rFonts w:ascii="Consolas" w:hAnsi="Consolas"/>
+          <w:b w:val="0"/>
+          <w:i w:val="0"/>
+          <w:color w:val="146B63"/>
           <w:sz w:val="20"/>
         </w:rPr>
         <w:t>/data</w:t>
       </w:r>
       <w:r>
+        <w:rPr>
+          <w:b w:val="0"/>
+          <w:i w:val="0"/>
+        </w:rPr>
         <w:t xml:space="preserve">, </w:t>
       </w:r>
       <w:r>
         <w:rPr>
           <w:rFonts w:ascii="Consolas" w:hAnsi="Consolas"/>
+          <w:b w:val="0"/>
+          <w:i w:val="0"/>
+          <w:color w:val="146B63"/>
           <w:sz w:val="20"/>
         </w:rPr>
         <w:t>/backup</w:t>
       </w:r>
       <w:r>
+        <w:rPr>
+          <w:b w:val="0"/>
+          <w:i w:val="0"/>
+        </w:rPr>
         <w:t>, chứng chỉ sắp hết hạn.</w:t>
       </w:r>
     </w:p>
@@ -3059,6 +3666,10 @@
         <w:pStyle w:val="ListBullet"/>
       </w:pPr>
       <w:r>
+        <w:rPr>
+          <w:b w:val="0"/>
+          <w:i w:val="0"/>
+        </w:rPr>
         <w:t>Dashboard Grafana cho DB cluster + traffic proxy.</w:t>
       </w:r>
     </w:p>
@@ -3068,14 +3679,19 @@
       </w:pPr>
       <w:r>
         <w:rPr>
-          <w:color w:val="1F4E79"/>
-          <w:sz w:val="24"/>
+          <w:rFonts w:ascii="Cambria" w:hAnsi="Cambria"/>
+          <w:color w:val="1A2423"/>
+          <w:sz w:val="25"/>
         </w:rPr>
         <w:t>7.2 Backup off-site — hoàn thiện 3-2-1 *(ưu tiên cao)*</w:t>
       </w:r>
     </w:p>
     <w:p>
       <w:r>
+        <w:rPr>
+          <w:b w:val="0"/>
+          <w:i w:val="0"/>
+        </w:rPr>
         <w:t>Triển khai repo2 pgBackRest sang site khác qua SSH (hoặc quy trình đĩa rời) theo tài liệu Phase 5b có sẵn.</w:t>
       </w:r>
     </w:p>
@@ -3085,8 +3701,9 @@
       </w:pPr>
       <w:r>
         <w:rPr>
-          <w:color w:val="1F4E79"/>
-          <w:sz w:val="24"/>
+          <w:rFonts w:ascii="Cambria" w:hAnsi="Cambria"/>
+          <w:color w:val="1A2423"/>
+          <w:sz w:val="25"/>
         </w:rPr>
         <w:t>7.3 Quy trình vận hành định kỳ</w:t>
       </w:r>
@@ -3096,6 +3713,10 @@
         <w:pStyle w:val="ListBullet"/>
       </w:pPr>
       <w:r>
+        <w:rPr>
+          <w:b w:val="0"/>
+          <w:i w:val="0"/>
+        </w:rPr>
         <w:t>Diễn tập failover DB + proxy, diễn tập khôi phục PITR: mỗi quý.</w:t>
       </w:r>
     </w:p>
@@ -3104,16 +3725,27 @@
         <w:pStyle w:val="ListBullet"/>
       </w:pPr>
       <w:r>
+        <w:rPr>
+          <w:b w:val="0"/>
+          <w:i w:val="0"/>
+        </w:rPr>
         <w:t xml:space="preserve">Kiểm tra </w:t>
       </w:r>
       <w:r>
         <w:rPr>
           <w:rFonts w:ascii="Consolas" w:hAnsi="Consolas"/>
+          <w:b w:val="0"/>
+          <w:i w:val="0"/>
+          <w:color w:val="146B63"/>
           <w:sz w:val="20"/>
         </w:rPr>
         <w:t>pgbackrest info</w:t>
       </w:r>
       <w:r>
+        <w:rPr>
+          <w:b w:val="0"/>
+          <w:i w:val="0"/>
+        </w:rPr>
         <w:t>, dung lượng đĩa, hạn chứng chỉ: hằng tuần (đưa vào cảnh báo tự động sau 7.1).</w:t>
       </w:r>
     </w:p>
@@ -3122,6 +3754,10 @@
         <w:pStyle w:val="ListBullet"/>
       </w:pPr>
       <w:r>
+        <w:rPr>
+          <w:b w:val="0"/>
+          <w:i w:val="0"/>
+        </w:rPr>
         <w:t>Cập nhật bảo mật OS qua mirror APT offline: theo chu kỳ công ty quy định.</w:t>
       </w:r>
     </w:p>
@@ -3131,8 +3767,9 @@
       </w:pPr>
       <w:r>
         <w:rPr>
-          <w:color w:val="1F4E79"/>
-          <w:sz w:val="24"/>
+          <w:rFonts w:ascii="Cambria" w:hAnsi="Cambria"/>
+          <w:color w:val="1A2423"/>
+          <w:sz w:val="25"/>
         </w:rPr>
         <w:t>7.4 Nguồn lực đề xuất</w:t>
       </w:r>
@@ -3152,7 +3789,7 @@
         <w:tc>
           <w:tcPr>
             <w:tcW w:type="dxa" w:w="4873"/>
-            <w:shd w:fill="1F4E79"/>
+            <w:shd w:fill="146B63"/>
           </w:tcPr>
           <w:p>
             <w:r>
@@ -3165,6 +3802,7 @@
             <w:r>
               <w:rPr>
                 <w:b/>
+                <w:i w:val="0"/>
                 <w:color w:val="FFFFFF"/>
                 <w:sz w:val="20"/>
               </w:rPr>
@@ -3175,7 +3813,7 @@
         <w:tc>
           <w:tcPr>
             <w:tcW w:type="dxa" w:w="4873"/>
-            <w:shd w:fill="1F4E79"/>
+            <w:shd w:fill="146B63"/>
           </w:tcPr>
           <w:p>
             <w:r>
@@ -3188,6 +3826,7 @@
             <w:r>
               <w:rPr>
                 <w:b/>
+                <w:i w:val="0"/>
                 <w:color w:val="FFFFFF"/>
                 <w:sz w:val="20"/>
               </w:rPr>
@@ -3209,6 +3848,8 @@
             </w:r>
             <w:r>
               <w:rPr>
+                <w:b w:val="0"/>
+                <w:i w:val="0"/>
                 <w:sz w:val="20"/>
               </w:rPr>
               <w:t>Tích hợp Zabbix/Grafana (7.1)</w:t>
@@ -3227,6 +3868,8 @@
             </w:r>
             <w:r>
               <w:rPr>
+                <w:b w:val="0"/>
+                <w:i w:val="0"/>
                 <w:sz w:val="20"/>
               </w:rPr>
               <w:t>3–5 ngày công</w:t>
@@ -3238,7 +3881,7 @@
         <w:tc>
           <w:tcPr>
             <w:tcW w:type="dxa" w:w="4873"/>
-            <w:shd w:fill="EDF2F8"/>
+            <w:shd w:fill="F0F6F5"/>
           </w:tcPr>
           <w:p>
             <w:r>
@@ -3248,6 +3891,8 @@
             </w:r>
             <w:r>
               <w:rPr>
+                <w:b w:val="0"/>
+                <w:i w:val="0"/>
                 <w:sz w:val="20"/>
               </w:rPr>
               <w:t>Backup off-site (7.2)</w:t>
@@ -3257,7 +3902,7 @@
         <w:tc>
           <w:tcPr>
             <w:tcW w:type="dxa" w:w="4873"/>
-            <w:shd w:fill="EDF2F8"/>
+            <w:shd w:fill="F0F6F5"/>
           </w:tcPr>
           <w:p>
             <w:r>
@@ -3267,6 +3912,8 @@
             </w:r>
             <w:r>
               <w:rPr>
+                <w:b w:val="0"/>
+                <w:i w:val="0"/>
                 <w:sz w:val="20"/>
               </w:rPr>
               <w:t>2–3 ngày công + hạ tầng site phụ/đĩa rời</w:t>
@@ -3287,6 +3934,8 @@
             </w:r>
             <w:r>
               <w:rPr>
+                <w:b w:val="0"/>
+                <w:i w:val="0"/>
                 <w:sz w:val="20"/>
               </w:rPr>
               <w:t>Soạn lịch &amp; chạy diễn tập lần đầu (7.3)</w:t>
@@ -3305,6 +3954,8 @@
             </w:r>
             <w:r>
               <w:rPr>
+                <w:b w:val="0"/>
+                <w:i w:val="0"/>
                 <w:sz w:val="20"/>
               </w:rPr>
               <w:t>1–2 ngày công</w:t>
@@ -3317,40 +3968,60 @@
     <w:p>
       <w:pPr>
         <w:pStyle w:val="Heading1"/>
+        <w:spacing w:before="360"/>
       </w:pPr>
       <w:r>
         <w:rPr>
-          <w:color w:val="1F4E79"/>
-          <w:sz w:val="28"/>
+          <w:rFonts w:ascii="Cambria" w:hAnsi="Cambria"/>
+          <w:color w:val="146B63"/>
+          <w:sz w:val="30"/>
         </w:rPr>
         <w:t>8. Kết luận</w:t>
       </w:r>
     </w:p>
     <w:p>
       <w:r>
+        <w:rPr>
+          <w:b w:val="0"/>
+          <w:i w:val="0"/>
+        </w:rPr>
         <w:t xml:space="preserve">Hạ tầng AX Svr đã được triển khai hoàn chỉnh, đạt các mục tiêu HA và an toàn dữ liệu đã cam kết, kèm bộ tài liệu vận hành và công cụ quản trị đầy đủ. Hệ thống hiện phục vụ ổn định; hai hạng mục cần quyết định để đạt độ an toàn trọn vẹn là </w:t>
       </w:r>
       <w:r>
         <w:rPr>
           <w:b/>
+          <w:i w:val="0"/>
         </w:rPr>
         <w:t>tích hợp giám sát Zabbix/Grafana</w:t>
       </w:r>
       <w:r>
+        <w:rPr>
+          <w:b w:val="0"/>
+          <w:i w:val="0"/>
+        </w:rPr>
         <w:t xml:space="preserve"> và </w:t>
       </w:r>
       <w:r>
         <w:rPr>
           <w:b/>
+          <w:i w:val="0"/>
         </w:rPr>
         <w:t>backup off-site 3-2-1</w:t>
       </w:r>
       <w:r>
+        <w:rPr>
+          <w:b w:val="0"/>
+          <w:i w:val="0"/>
+        </w:rPr>
         <w:t>.</w:t>
       </w:r>
     </w:p>
     <w:p>
       <w:r>
+        <w:rPr>
+          <w:b w:val="0"/>
+          <w:i w:val="0"/>
+        </w:rPr>
         <w:t>Kính đề nghị quản lý:</w:t>
       </w:r>
     </w:p>
@@ -3361,10 +4032,15 @@
       <w:r>
         <w:rPr>
           <w:b/>
+          <w:i w:val="0"/>
         </w:rPr>
         <w:t>Ghi nhận nghiệm thu</w:t>
       </w:r>
       <w:r>
+        <w:rPr>
+          <w:b w:val="0"/>
+          <w:i w:val="0"/>
+        </w:rPr>
         <w:t xml:space="preserve"> khối lượng công việc đã hoàn thành (mục 4).</w:t>
       </w:r>
     </w:p>
@@ -3375,21 +4051,28 @@
       <w:r>
         <w:rPr>
           <w:b/>
+          <w:i w:val="0"/>
         </w:rPr>
         <w:t>Phê duyệt</w:t>
       </w:r>
       <w:r>
+        <w:rPr>
+          <w:b w:val="0"/>
+          <w:i w:val="0"/>
+        </w:rPr>
         <w:t xml:space="preserve"> triển khai giai đoạn tiếp theo (mục 7) với ước lượng nguồn lực kèm theo.</w:t>
       </w:r>
     </w:p>
     <w:p>
       <w:pPr>
         <w:pStyle w:val="Heading1"/>
+        <w:spacing w:before="360"/>
       </w:pPr>
       <w:r>
         <w:rPr>
-          <w:color w:val="1F4E79"/>
-          <w:sz w:val="28"/>
+          <w:rFonts w:ascii="Cambria" w:hAnsi="Cambria"/>
+          <w:color w:val="146B63"/>
+          <w:sz w:val="30"/>
         </w:rPr>
         <w:t>Phụ lục A — Bảng IP hệ thống</w:t>
       </w:r>
@@ -3411,7 +4094,7 @@
         <w:tc>
           <w:tcPr>
             <w:tcW w:type="dxa" w:w="2436"/>
-            <w:shd w:fill="1F4E79"/>
+            <w:shd w:fill="146B63"/>
           </w:tcPr>
           <w:p>
             <w:r>
@@ -3424,6 +4107,7 @@
             <w:r>
               <w:rPr>
                 <w:b/>
+                <w:i w:val="0"/>
                 <w:color w:val="FFFFFF"/>
                 <w:sz w:val="20"/>
               </w:rPr>
@@ -3434,7 +4118,7 @@
         <w:tc>
           <w:tcPr>
             <w:tcW w:type="dxa" w:w="2436"/>
-            <w:shd w:fill="1F4E79"/>
+            <w:shd w:fill="146B63"/>
           </w:tcPr>
           <w:p>
             <w:r>
@@ -3447,6 +4131,7 @@
             <w:r>
               <w:rPr>
                 <w:b/>
+                <w:i w:val="0"/>
                 <w:color w:val="FFFFFF"/>
                 <w:sz w:val="20"/>
               </w:rPr>
@@ -3457,7 +4142,7 @@
         <w:tc>
           <w:tcPr>
             <w:tcW w:type="dxa" w:w="2436"/>
-            <w:shd w:fill="1F4E79"/>
+            <w:shd w:fill="146B63"/>
           </w:tcPr>
           <w:p>
             <w:r>
@@ -3470,6 +4155,7 @@
             <w:r>
               <w:rPr>
                 <w:b/>
+                <w:i w:val="0"/>
                 <w:color w:val="FFFFFF"/>
                 <w:sz w:val="20"/>
               </w:rPr>
@@ -3480,7 +4166,7 @@
         <w:tc>
           <w:tcPr>
             <w:tcW w:type="dxa" w:w="2436"/>
-            <w:shd w:fill="1F4E79"/>
+            <w:shd w:fill="146B63"/>
           </w:tcPr>
           <w:p>
             <w:r>
@@ -3493,6 +4179,7 @@
             <w:r>
               <w:rPr>
                 <w:b/>
+                <w:i w:val="0"/>
                 <w:color w:val="FFFFFF"/>
                 <w:sz w:val="20"/>
               </w:rPr>
@@ -3514,6 +4201,8 @@
             </w:r>
             <w:r>
               <w:rPr>
+                <w:b w:val="0"/>
+                <w:i w:val="0"/>
                 <w:sz w:val="20"/>
               </w:rPr>
               <w:t>Proxy-VIP</w:t>
@@ -3532,6 +4221,8 @@
             </w:r>
             <w:r>
               <w:rPr>
+                <w:b w:val="0"/>
+                <w:i w:val="0"/>
                 <w:sz w:val="20"/>
               </w:rPr>
               <w:t>.100</w:t>
@@ -3550,6 +4241,8 @@
             </w:r>
             <w:r>
               <w:rPr>
+                <w:b w:val="0"/>
+                <w:i w:val="0"/>
                 <w:sz w:val="20"/>
               </w:rPr>
               <w:t>—</w:t>
@@ -3568,6 +4261,8 @@
             </w:r>
             <w:r>
               <w:rPr>
+                <w:b w:val="0"/>
+                <w:i w:val="0"/>
                 <w:sz w:val="20"/>
               </w:rPr>
               <w:t>(Keepalived VRRP)</w:t>
@@ -3579,7 +4274,7 @@
         <w:tc>
           <w:tcPr>
             <w:tcW w:type="dxa" w:w="2436"/>
-            <w:shd w:fill="EDF2F8"/>
+            <w:shd w:fill="F0F6F5"/>
           </w:tcPr>
           <w:p>
             <w:r>
@@ -3589,6 +4284,8 @@
             </w:r>
             <w:r>
               <w:rPr>
+                <w:b w:val="0"/>
+                <w:i w:val="0"/>
                 <w:sz w:val="20"/>
               </w:rPr>
               <w:t>ax-proxy01</w:t>
@@ -3598,7 +4295,7 @@
         <w:tc>
           <w:tcPr>
             <w:tcW w:type="dxa" w:w="2436"/>
-            <w:shd w:fill="EDF2F8"/>
+            <w:shd w:fill="F0F6F5"/>
           </w:tcPr>
           <w:p>
             <w:r>
@@ -3608,6 +4305,8 @@
             </w:r>
             <w:r>
               <w:rPr>
+                <w:b w:val="0"/>
+                <w:i w:val="0"/>
                 <w:sz w:val="20"/>
               </w:rPr>
               <w:t>.98</w:t>
@@ -3617,7 +4316,7 @@
         <w:tc>
           <w:tcPr>
             <w:tcW w:type="dxa" w:w="2436"/>
-            <w:shd w:fill="EDF2F8"/>
+            <w:shd w:fill="F0F6F5"/>
           </w:tcPr>
           <w:p>
             <w:r>
@@ -3627,6 +4326,8 @@
             </w:r>
             <w:r>
               <w:rPr>
+                <w:b w:val="0"/>
+                <w:i w:val="0"/>
                 <w:sz w:val="20"/>
               </w:rPr>
               <w:t>.98</w:t>
@@ -3636,7 +4337,7 @@
         <w:tc>
           <w:tcPr>
             <w:tcW w:type="dxa" w:w="2436"/>
-            <w:shd w:fill="EDF2F8"/>
+            <w:shd w:fill="F0F6F5"/>
           </w:tcPr>
           <w:p>
             <w:r>
@@ -3646,6 +4347,8 @@
             </w:r>
             <w:r>
               <w:rPr>
+                <w:b w:val="0"/>
+                <w:i w:val="0"/>
                 <w:sz w:val="20"/>
               </w:rPr>
               <w:t>Ubuntu / nginx, keepalived</w:t>
@@ -3666,6 +4369,8 @@
             </w:r>
             <w:r>
               <w:rPr>
+                <w:b w:val="0"/>
+                <w:i w:val="0"/>
                 <w:sz w:val="20"/>
               </w:rPr>
               <w:t>ax-proxy02</w:t>
@@ -3684,6 +4389,8 @@
             </w:r>
             <w:r>
               <w:rPr>
+                <w:b w:val="0"/>
+                <w:i w:val="0"/>
                 <w:sz w:val="20"/>
               </w:rPr>
               <w:t>.99</w:t>
@@ -3702,6 +4409,8 @@
             </w:r>
             <w:r>
               <w:rPr>
+                <w:b w:val="0"/>
+                <w:i w:val="0"/>
                 <w:sz w:val="20"/>
               </w:rPr>
               <w:t>.99</w:t>
@@ -3720,6 +4429,8 @@
             </w:r>
             <w:r>
               <w:rPr>
+                <w:b w:val="0"/>
+                <w:i w:val="0"/>
                 <w:sz w:val="20"/>
               </w:rPr>
               <w:t>Ubuntu / nginx, keepalived</w:t>
@@ -3731,7 +4442,7 @@
         <w:tc>
           <w:tcPr>
             <w:tcW w:type="dxa" w:w="2436"/>
-            <w:shd w:fill="EDF2F8"/>
+            <w:shd w:fill="F0F6F5"/>
           </w:tcPr>
           <w:p>
             <w:r>
@@ -3741,6 +4452,8 @@
             </w:r>
             <w:r>
               <w:rPr>
+                <w:b w:val="0"/>
+                <w:i w:val="0"/>
                 <w:sz w:val="20"/>
               </w:rPr>
               <w:t>ax-web01</w:t>
@@ -3750,7 +4463,7 @@
         <w:tc>
           <w:tcPr>
             <w:tcW w:type="dxa" w:w="2436"/>
-            <w:shd w:fill="EDF2F8"/>
+            <w:shd w:fill="F0F6F5"/>
           </w:tcPr>
           <w:p>
             <w:r>
@@ -3760,6 +4473,8 @@
             </w:r>
             <w:r>
               <w:rPr>
+                <w:b w:val="0"/>
+                <w:i w:val="0"/>
                 <w:sz w:val="20"/>
               </w:rPr>
               <w:t>.101</w:t>
@@ -3769,7 +4484,7 @@
         <w:tc>
           <w:tcPr>
             <w:tcW w:type="dxa" w:w="2436"/>
-            <w:shd w:fill="EDF2F8"/>
+            <w:shd w:fill="F0F6F5"/>
           </w:tcPr>
           <w:p>
             <w:r>
@@ -3779,6 +4494,8 @@
             </w:r>
             <w:r>
               <w:rPr>
+                <w:b w:val="0"/>
+                <w:i w:val="0"/>
                 <w:sz w:val="20"/>
               </w:rPr>
               <w:t>.101</w:t>
@@ -3788,7 +4505,7 @@
         <w:tc>
           <w:tcPr>
             <w:tcW w:type="dxa" w:w="2436"/>
-            <w:shd w:fill="EDF2F8"/>
+            <w:shd w:fill="F0F6F5"/>
           </w:tcPr>
           <w:p>
             <w:r>
@@ -3798,6 +4515,8 @@
             </w:r>
             <w:r>
               <w:rPr>
+                <w:b w:val="0"/>
+                <w:i w:val="0"/>
                 <w:sz w:val="20"/>
               </w:rPr>
               <w:t>Win2025 / IIS</w:t>
@@ -3818,6 +4537,8 @@
             </w:r>
             <w:r>
               <w:rPr>
+                <w:b w:val="0"/>
+                <w:i w:val="0"/>
                 <w:sz w:val="20"/>
               </w:rPr>
               <w:t>ax-web02</w:t>
@@ -3836,6 +4557,8 @@
             </w:r>
             <w:r>
               <w:rPr>
+                <w:b w:val="0"/>
+                <w:i w:val="0"/>
                 <w:sz w:val="20"/>
               </w:rPr>
               <w:t>.102</w:t>
@@ -3854,6 +4577,8 @@
             </w:r>
             <w:r>
               <w:rPr>
+                <w:b w:val="0"/>
+                <w:i w:val="0"/>
                 <w:sz w:val="20"/>
               </w:rPr>
               <w:t>.102</w:t>
@@ -3872,6 +4597,8 @@
             </w:r>
             <w:r>
               <w:rPr>
+                <w:b w:val="0"/>
+                <w:i w:val="0"/>
                 <w:sz w:val="20"/>
               </w:rPr>
               <w:t>Win2025 / IIS</w:t>
@@ -3883,7 +4610,7 @@
         <w:tc>
           <w:tcPr>
             <w:tcW w:type="dxa" w:w="2436"/>
-            <w:shd w:fill="EDF2F8"/>
+            <w:shd w:fill="F0F6F5"/>
           </w:tcPr>
           <w:p>
             <w:r>
@@ -3893,6 +4620,8 @@
             </w:r>
             <w:r>
               <w:rPr>
+                <w:b w:val="0"/>
+                <w:i w:val="0"/>
                 <w:sz w:val="20"/>
               </w:rPr>
               <w:t>nas</w:t>
@@ -3902,7 +4631,7 @@
         <w:tc>
           <w:tcPr>
             <w:tcW w:type="dxa" w:w="2436"/>
-            <w:shd w:fill="EDF2F8"/>
+            <w:shd w:fill="F0F6F5"/>
           </w:tcPr>
           <w:p>
             <w:r>
@@ -3912,6 +4641,8 @@
             </w:r>
             <w:r>
               <w:rPr>
+                <w:b w:val="0"/>
+                <w:i w:val="0"/>
                 <w:sz w:val="20"/>
               </w:rPr>
               <w:t>.97</w:t>
@@ -3921,7 +4652,7 @@
         <w:tc>
           <w:tcPr>
             <w:tcW w:type="dxa" w:w="2436"/>
-            <w:shd w:fill="EDF2F8"/>
+            <w:shd w:fill="F0F6F5"/>
           </w:tcPr>
           <w:p>
             <w:r>
@@ -3931,6 +4662,8 @@
             </w:r>
             <w:r>
               <w:rPr>
+                <w:b w:val="0"/>
+                <w:i w:val="0"/>
                 <w:sz w:val="20"/>
               </w:rPr>
               <w:t>.97</w:t>
@@ -3940,7 +4673,7 @@
         <w:tc>
           <w:tcPr>
             <w:tcW w:type="dxa" w:w="2436"/>
-            <w:shd w:fill="EDF2F8"/>
+            <w:shd w:fill="F0F6F5"/>
           </w:tcPr>
           <w:p>
             <w:r>
@@ -3950,6 +4683,8 @@
             </w:r>
             <w:r>
               <w:rPr>
+                <w:b w:val="0"/>
+                <w:i w:val="0"/>
                 <w:sz w:val="20"/>
               </w:rPr>
               <w:t>Ubuntu / samba (chỉ source web)</w:t>
@@ -3970,6 +4705,8 @@
             </w:r>
             <w:r>
               <w:rPr>
+                <w:b w:val="0"/>
+                <w:i w:val="0"/>
                 <w:sz w:val="20"/>
               </w:rPr>
               <w:t>ax-db01</w:t>
@@ -3988,6 +4725,8 @@
             </w:r>
             <w:r>
               <w:rPr>
+                <w:b w:val="0"/>
+                <w:i w:val="0"/>
                 <w:sz w:val="20"/>
               </w:rPr>
               <w:t>.103</w:t>
@@ -4006,6 +4745,8 @@
             </w:r>
             <w:r>
               <w:rPr>
+                <w:b w:val="0"/>
+                <w:i w:val="0"/>
                 <w:sz w:val="20"/>
               </w:rPr>
               <w:t>.103</w:t>
@@ -4024,6 +4765,8 @@
             </w:r>
             <w:r>
               <w:rPr>
+                <w:b w:val="0"/>
+                <w:i w:val="0"/>
                 <w:sz w:val="20"/>
               </w:rPr>
               <w:t>Ubuntu / PostgreSQL 17, Patroni, etcd, pgBackRest</w:t>
@@ -4035,7 +4778,7 @@
         <w:tc>
           <w:tcPr>
             <w:tcW w:type="dxa" w:w="2436"/>
-            <w:shd w:fill="EDF2F8"/>
+            <w:shd w:fill="F0F6F5"/>
           </w:tcPr>
           <w:p>
             <w:r>
@@ -4045,6 +4788,8 @@
             </w:r>
             <w:r>
               <w:rPr>
+                <w:b w:val="0"/>
+                <w:i w:val="0"/>
                 <w:sz w:val="20"/>
               </w:rPr>
               <w:t>ax-db02</w:t>
@@ -4054,7 +4799,7 @@
         <w:tc>
           <w:tcPr>
             <w:tcW w:type="dxa" w:w="2436"/>
-            <w:shd w:fill="EDF2F8"/>
+            <w:shd w:fill="F0F6F5"/>
           </w:tcPr>
           <w:p>
             <w:r>
@@ -4064,6 +4809,8 @@
             </w:r>
             <w:r>
               <w:rPr>
+                <w:b w:val="0"/>
+                <w:i w:val="0"/>
                 <w:sz w:val="20"/>
               </w:rPr>
               <w:t>.104</w:t>
@@ -4073,7 +4820,7 @@
         <w:tc>
           <w:tcPr>
             <w:tcW w:type="dxa" w:w="2436"/>
-            <w:shd w:fill="EDF2F8"/>
+            <w:shd w:fill="F0F6F5"/>
           </w:tcPr>
           <w:p>
             <w:r>
@@ -4083,6 +4830,8 @@
             </w:r>
             <w:r>
               <w:rPr>
+                <w:b w:val="0"/>
+                <w:i w:val="0"/>
                 <w:sz w:val="20"/>
               </w:rPr>
               <w:t>.104</w:t>
@@ -4092,7 +4841,7 @@
         <w:tc>
           <w:tcPr>
             <w:tcW w:type="dxa" w:w="2436"/>
-            <w:shd w:fill="EDF2F8"/>
+            <w:shd w:fill="F0F6F5"/>
           </w:tcPr>
           <w:p>
             <w:r>
@@ -4102,6 +4851,8 @@
             </w:r>
             <w:r>
               <w:rPr>
+                <w:b w:val="0"/>
+                <w:i w:val="0"/>
                 <w:sz w:val="20"/>
               </w:rPr>
               <w:t>như trên</w:t>
@@ -4122,6 +4873,8 @@
             </w:r>
             <w:r>
               <w:rPr>
+                <w:b w:val="0"/>
+                <w:i w:val="0"/>
                 <w:sz w:val="20"/>
               </w:rPr>
               <w:t>ax-db03</w:t>
@@ -4140,6 +4893,8 @@
             </w:r>
             <w:r>
               <w:rPr>
+                <w:b w:val="0"/>
+                <w:i w:val="0"/>
                 <w:sz w:val="20"/>
               </w:rPr>
               <w:t>.105</w:t>
@@ -4158,6 +4913,8 @@
             </w:r>
             <w:r>
               <w:rPr>
+                <w:b w:val="0"/>
+                <w:i w:val="0"/>
                 <w:sz w:val="20"/>
               </w:rPr>
               <w:t>.105</w:t>
@@ -4176,6 +4933,8 @@
             </w:r>
             <w:r>
               <w:rPr>
+                <w:b w:val="0"/>
+                <w:i w:val="0"/>
                 <w:sz w:val="20"/>
               </w:rPr>
               <w:t xml:space="preserve">như trên + đĩa </w:t>
@@ -4183,12 +4942,17 @@
             <w:r>
               <w:rPr>
                 <w:rFonts w:ascii="Consolas" w:hAnsi="Consolas"/>
+                <w:b w:val="0"/>
+                <w:i w:val="0"/>
+                <w:color w:val="146B63"/>
                 <w:sz w:val="20"/>
               </w:rPr>
               <w:t>/backup</w:t>
             </w:r>
             <w:r>
               <w:rPr>
+                <w:b w:val="0"/>
+                <w:i w:val="0"/>
                 <w:sz w:val="20"/>
               </w:rPr>
               <w:t xml:space="preserve"> (repo backup)</w:t>
@@ -4200,7 +4964,7 @@
         <w:tc>
           <w:tcPr>
             <w:tcW w:type="dxa" w:w="2436"/>
-            <w:shd w:fill="EDF2F8"/>
+            <w:shd w:fill="F0F6F5"/>
           </w:tcPr>
           <w:p>
             <w:r>
@@ -4210,6 +4974,8 @@
             </w:r>
             <w:r>
               <w:rPr>
+                <w:b w:val="0"/>
+                <w:i w:val="0"/>
                 <w:sz w:val="20"/>
               </w:rPr>
               <w:t>devdb</w:t>
@@ -4219,7 +4985,7 @@
         <w:tc>
           <w:tcPr>
             <w:tcW w:type="dxa" w:w="2436"/>
-            <w:shd w:fill="EDF2F8"/>
+            <w:shd w:fill="F0F6F5"/>
           </w:tcPr>
           <w:p>
             <w:r>
@@ -4229,6 +4995,8 @@
             </w:r>
             <w:r>
               <w:rPr>
+                <w:b w:val="0"/>
+                <w:i w:val="0"/>
                 <w:sz w:val="20"/>
               </w:rPr>
               <w:t>.90</w:t>
@@ -4238,7 +5006,7 @@
         <w:tc>
           <w:tcPr>
             <w:tcW w:type="dxa" w:w="2436"/>
-            <w:shd w:fill="EDF2F8"/>
+            <w:shd w:fill="F0F6F5"/>
           </w:tcPr>
           <w:p>
             <w:r>
@@ -4248,6 +5016,8 @@
             </w:r>
             <w:r>
               <w:rPr>
+                <w:b w:val="0"/>
+                <w:i w:val="0"/>
                 <w:sz w:val="20"/>
               </w:rPr>
               <w:t>—</w:t>
@@ -4257,7 +5027,7 @@
         <w:tc>
           <w:tcPr>
             <w:tcW w:type="dxa" w:w="2436"/>
-            <w:shd w:fill="EDF2F8"/>
+            <w:shd w:fill="F0F6F5"/>
           </w:tcPr>
           <w:p>
             <w:r>
@@ -4267,6 +5037,8 @@
             </w:r>
             <w:r>
               <w:rPr>
+                <w:b w:val="0"/>
+                <w:i w:val="0"/>
                 <w:sz w:val="20"/>
               </w:rPr>
               <w:t>Ubuntu / PostgreSQL 17 standalone</w:t>
@@ -4279,11 +5051,13 @@
     <w:p>
       <w:pPr>
         <w:pStyle w:val="Heading1"/>
+        <w:spacing w:before="360"/>
       </w:pPr>
       <w:r>
         <w:rPr>
-          <w:color w:val="1F4E79"/>
-          <w:sz w:val="28"/>
+          <w:rFonts w:ascii="Cambria" w:hAnsi="Cambria"/>
+          <w:color w:val="146B63"/>
+          <w:sz w:val="30"/>
         </w:rPr>
         <w:t>Phụ lục B — Danh mục tài liệu bàn giao</w:t>
       </w:r>
@@ -4304,7 +5078,7 @@
         <w:tc>
           <w:tcPr>
             <w:tcW w:type="dxa" w:w="3249"/>
-            <w:shd w:fill="1F4E79"/>
+            <w:shd w:fill="146B63"/>
           </w:tcPr>
           <w:p>
             <w:r>
@@ -4317,6 +5091,7 @@
             <w:r>
               <w:rPr>
                 <w:b/>
+                <w:i w:val="0"/>
                 <w:color w:val="FFFFFF"/>
                 <w:sz w:val="20"/>
               </w:rPr>
@@ -4327,7 +5102,7 @@
         <w:tc>
           <w:tcPr>
             <w:tcW w:type="dxa" w:w="3249"/>
-            <w:shd w:fill="1F4E79"/>
+            <w:shd w:fill="146B63"/>
           </w:tcPr>
           <w:p>
             <w:r>
@@ -4340,6 +5115,7 @@
             <w:r>
               <w:rPr>
                 <w:b/>
+                <w:i w:val="0"/>
                 <w:color w:val="FFFFFF"/>
                 <w:sz w:val="20"/>
               </w:rPr>
@@ -4350,7 +5126,7 @@
         <w:tc>
           <w:tcPr>
             <w:tcW w:type="dxa" w:w="3249"/>
-            <w:shd w:fill="1F4E79"/>
+            <w:shd w:fill="146B63"/>
           </w:tcPr>
           <w:p>
             <w:r>
@@ -4363,6 +5139,7 @@
             <w:r>
               <w:rPr>
                 <w:b/>
+                <w:i w:val="0"/>
                 <w:color w:val="FFFFFF"/>
                 <w:sz w:val="20"/>
               </w:rPr>
@@ -4384,6 +5161,8 @@
             </w:r>
             <w:r>
               <w:rPr>
+                <w:b w:val="0"/>
+                <w:i w:val="0"/>
                 <w:sz w:val="20"/>
               </w:rPr>
               <w:t>0</w:t>
@@ -4402,6 +5181,8 @@
             </w:r>
             <w:r>
               <w:rPr>
+                <w:b w:val="0"/>
+                <w:i w:val="0"/>
                 <w:sz w:val="20"/>
               </w:rPr>
               <w:t>axsvr-phase0-setup.md</w:t>
@@ -4420,6 +5201,8 @@
             </w:r>
             <w:r>
               <w:rPr>
+                <w:b w:val="0"/>
+                <w:i w:val="0"/>
                 <w:sz w:val="20"/>
               </w:rPr>
               <w:t>OS, mạng 2 NIC, hardening, phần mềm theo vai trò</w:t>
@@ -4431,7 +5214,7 @@
         <w:tc>
           <w:tcPr>
             <w:tcW w:type="dxa" w:w="3249"/>
-            <w:shd w:fill="EDF2F8"/>
+            <w:shd w:fill="F0F6F5"/>
           </w:tcPr>
           <w:p>
             <w:r>
@@ -4441,6 +5224,8 @@
             </w:r>
             <w:r>
               <w:rPr>
+                <w:b w:val="0"/>
+                <w:i w:val="0"/>
                 <w:sz w:val="20"/>
               </w:rPr>
               <w:t>1</w:t>
@@ -4450,7 +5235,7 @@
         <w:tc>
           <w:tcPr>
             <w:tcW w:type="dxa" w:w="3249"/>
-            <w:shd w:fill="EDF2F8"/>
+            <w:shd w:fill="F0F6F5"/>
           </w:tcPr>
           <w:p>
             <w:r>
@@ -4460,6 +5245,8 @@
             </w:r>
             <w:r>
               <w:rPr>
+                <w:b w:val="0"/>
+                <w:i w:val="0"/>
                 <w:sz w:val="20"/>
               </w:rPr>
               <w:t>axsvr-phase1-db.md</w:t>
@@ -4469,7 +5256,7 @@
         <w:tc>
           <w:tcPr>
             <w:tcW w:type="dxa" w:w="3249"/>
-            <w:shd w:fill="EDF2F8"/>
+            <w:shd w:fill="F0F6F5"/>
           </w:tcPr>
           <w:p>
             <w:r>
@@ -4479,6 +5266,8 @@
             </w:r>
             <w:r>
               <w:rPr>
+                <w:b w:val="0"/>
+                <w:i w:val="0"/>
                 <w:sz w:val="20"/>
               </w:rPr>
               <w:t>Cụm PostgreSQL HA (etcd + Patroni)</w:t>
@@ -4499,6 +5288,8 @@
             </w:r>
             <w:r>
               <w:rPr>
+                <w:b w:val="0"/>
+                <w:i w:val="0"/>
                 <w:sz w:val="20"/>
               </w:rPr>
               <w:t>2</w:t>
@@ -4517,6 +5308,8 @@
             </w:r>
             <w:r>
               <w:rPr>
+                <w:b w:val="0"/>
+                <w:i w:val="0"/>
                 <w:sz w:val="20"/>
               </w:rPr>
               <w:t>axsvr-phase2-nas.md</w:t>
@@ -4535,6 +5328,8 @@
             </w:r>
             <w:r>
               <w:rPr>
+                <w:b w:val="0"/>
+                <w:i w:val="0"/>
                 <w:sz w:val="20"/>
               </w:rPr>
               <w:t>NAS kho source (Samba, deploy theo release)</w:t>
@@ -4546,7 +5341,7 @@
         <w:tc>
           <w:tcPr>
             <w:tcW w:type="dxa" w:w="3249"/>
-            <w:shd w:fill="EDF2F8"/>
+            <w:shd w:fill="F0F6F5"/>
           </w:tcPr>
           <w:p>
             <w:r>
@@ -4556,6 +5351,8 @@
             </w:r>
             <w:r>
               <w:rPr>
+                <w:b w:val="0"/>
+                <w:i w:val="0"/>
                 <w:sz w:val="20"/>
               </w:rPr>
               <w:t>3</w:t>
@@ -4565,7 +5362,7 @@
         <w:tc>
           <w:tcPr>
             <w:tcW w:type="dxa" w:w="3249"/>
-            <w:shd w:fill="EDF2F8"/>
+            <w:shd w:fill="F0F6F5"/>
           </w:tcPr>
           <w:p>
             <w:r>
@@ -4575,6 +5372,8 @@
             </w:r>
             <w:r>
               <w:rPr>
+                <w:b w:val="0"/>
+                <w:i w:val="0"/>
                 <w:sz w:val="20"/>
               </w:rPr>
               <w:t>axsvr-phase3-web-iis.md</w:t>
@@ -4584,7 +5383,7 @@
         <w:tc>
           <w:tcPr>
             <w:tcW w:type="dxa" w:w="3249"/>
-            <w:shd w:fill="EDF2F8"/>
+            <w:shd w:fill="F0F6F5"/>
           </w:tcPr>
           <w:p>
             <w:r>
@@ -4594,6 +5393,8 @@
             </w:r>
             <w:r>
               <w:rPr>
+                <w:b w:val="0"/>
+                <w:i w:val="0"/>
                 <w:sz w:val="20"/>
               </w:rPr>
               <w:t>Web Win2025 + IIS</w:t>
@@ -4614,6 +5415,8 @@
             </w:r>
             <w:r>
               <w:rPr>
+                <w:b w:val="0"/>
+                <w:i w:val="0"/>
                 <w:sz w:val="20"/>
               </w:rPr>
               <w:t>4</w:t>
@@ -4632,6 +5435,8 @@
             </w:r>
             <w:r>
               <w:rPr>
+                <w:b w:val="0"/>
+                <w:i w:val="0"/>
                 <w:sz w:val="20"/>
               </w:rPr>
               <w:t>axsvr-phase4-proxy.md</w:t>
@@ -4650,6 +5455,8 @@
             </w:r>
             <w:r>
               <w:rPr>
+                <w:b w:val="0"/>
+                <w:i w:val="0"/>
                 <w:sz w:val="20"/>
               </w:rPr>
               <w:t>Proxy HA (Nginx + Keepalived/VIP)</w:t>
@@ -4661,7 +5468,7 @@
         <w:tc>
           <w:tcPr>
             <w:tcW w:type="dxa" w:w="3249"/>
-            <w:shd w:fill="EDF2F8"/>
+            <w:shd w:fill="F0F6F5"/>
           </w:tcPr>
           <w:p>
             <w:r>
@@ -4671,6 +5478,8 @@
             </w:r>
             <w:r>
               <w:rPr>
+                <w:b w:val="0"/>
+                <w:i w:val="0"/>
                 <w:sz w:val="20"/>
               </w:rPr>
               <w:t>5</w:t>
@@ -4680,7 +5489,7 @@
         <w:tc>
           <w:tcPr>
             <w:tcW w:type="dxa" w:w="3249"/>
-            <w:shd w:fill="EDF2F8"/>
+            <w:shd w:fill="F0F6F5"/>
           </w:tcPr>
           <w:p>
             <w:r>
@@ -4690,6 +5499,8 @@
             </w:r>
             <w:r>
               <w:rPr>
+                <w:b w:val="0"/>
+                <w:i w:val="0"/>
                 <w:sz w:val="20"/>
               </w:rPr>
               <w:t>axsvr-phase5-backup.md</w:t>
@@ -4699,7 +5510,7 @@
         <w:tc>
           <w:tcPr>
             <w:tcW w:type="dxa" w:w="3249"/>
-            <w:shd w:fill="EDF2F8"/>
+            <w:shd w:fill="F0F6F5"/>
           </w:tcPr>
           <w:p>
             <w:r>
@@ -4709,6 +5520,8 @@
             </w:r>
             <w:r>
               <w:rPr>
+                <w:b w:val="0"/>
+                <w:i w:val="0"/>
                 <w:sz w:val="20"/>
               </w:rPr>
               <w:t>Backup pgBackRest + pg_dump, PITR</w:t>
@@ -4729,6 +5542,8 @@
             </w:r>
             <w:r>
               <w:rPr>
+                <w:b w:val="0"/>
+                <w:i w:val="0"/>
                 <w:sz w:val="20"/>
               </w:rPr>
               <w:t>5b</w:t>
@@ -4747,6 +5562,8 @@
             </w:r>
             <w:r>
               <w:rPr>
+                <w:b w:val="0"/>
+                <w:i w:val="0"/>
                 <w:sz w:val="20"/>
               </w:rPr>
               <w:t>axsvr-backup-offsite.md</w:t>
@@ -4765,9 +5582,19 @@
             </w:r>
             <w:r>
               <w:rPr>
-                <w:sz w:val="20"/>
-              </w:rPr>
-              <w:t>Off-site backup (3-2-1) — *chưa triển khai, đề xuất*</w:t>
+                <w:b w:val="0"/>
+                <w:i w:val="0"/>
+                <w:sz w:val="20"/>
+              </w:rPr>
+              <w:t xml:space="preserve">Off-site backup (3-2-1) — </w:t>
+            </w:r>
+            <w:r>
+              <w:rPr>
+                <w:b w:val="0"/>
+                <w:i/>
+                <w:sz w:val="20"/>
+              </w:rPr>
+              <w:t>chưa triển khai, đề xuất</w:t>
             </w:r>
           </w:p>
         </w:tc>
@@ -4776,7 +5603,7 @@
         <w:tc>
           <w:tcPr>
             <w:tcW w:type="dxa" w:w="3249"/>
-            <w:shd w:fill="EDF2F8"/>
+            <w:shd w:fill="F0F6F5"/>
           </w:tcPr>
           <w:p>
             <w:r>
@@ -4786,6 +5613,8 @@
             </w:r>
             <w:r>
               <w:rPr>
+                <w:b w:val="0"/>
+                <w:i w:val="0"/>
                 <w:sz w:val="20"/>
               </w:rPr>
               <w:t>6</w:t>
@@ -4795,7 +5624,7 @@
         <w:tc>
           <w:tcPr>
             <w:tcW w:type="dxa" w:w="3249"/>
-            <w:shd w:fill="EDF2F8"/>
+            <w:shd w:fill="F0F6F5"/>
           </w:tcPr>
           <w:p>
             <w:r>
@@ -4805,6 +5634,8 @@
             </w:r>
             <w:r>
               <w:rPr>
+                <w:b w:val="0"/>
+                <w:i w:val="0"/>
                 <w:sz w:val="20"/>
               </w:rPr>
               <w:t>axsvr-phase6-monitoring.md</w:t>
@@ -4814,7 +5645,7 @@
         <w:tc>
           <w:tcPr>
             <w:tcW w:type="dxa" w:w="3249"/>
-            <w:shd w:fill="EDF2F8"/>
+            <w:shd w:fill="F0F6F5"/>
           </w:tcPr>
           <w:p>
             <w:r>
@@ -4824,6 +5655,8 @@
             </w:r>
             <w:r>
               <w:rPr>
+                <w:b w:val="0"/>
+                <w:i w:val="0"/>
                 <w:sz w:val="20"/>
               </w:rPr>
               <w:t>Monitoring (tham khảo; thay bằng tích hợp Zabbix/Grafana)</w:t>
@@ -4844,6 +5677,8 @@
             </w:r>
             <w:r>
               <w:rPr>
+                <w:b w:val="0"/>
+                <w:i w:val="0"/>
                 <w:sz w:val="20"/>
               </w:rPr>
               <w:t>Dev</w:t>
@@ -4862,6 +5697,8 @@
             </w:r>
             <w:r>
               <w:rPr>
+                <w:b w:val="0"/>
+                <w:i w:val="0"/>
                 <w:sz w:val="20"/>
               </w:rPr>
               <w:t>axsvr-devdb-setup.md</w:t>
@@ -4880,6 +5717,8 @@
             </w:r>
             <w:r>
               <w:rPr>
+                <w:b w:val="0"/>
+                <w:i w:val="0"/>
                 <w:sz w:val="20"/>
               </w:rPr>
               <w:t>DevDB standalone</w:t>
@@ -4891,7 +5730,7 @@
         <w:tc>
           <w:tcPr>
             <w:tcW w:type="dxa" w:w="3249"/>
-            <w:shd w:fill="EDF2F8"/>
+            <w:shd w:fill="F0F6F5"/>
           </w:tcPr>
           <w:p>
             <w:r>
@@ -4901,6 +5740,8 @@
             </w:r>
             <w:r>
               <w:rPr>
+                <w:b w:val="0"/>
+                <w:i w:val="0"/>
                 <w:sz w:val="20"/>
               </w:rPr>
               <w:t>Tool</w:t>
@@ -4910,7 +5751,7 @@
         <w:tc>
           <w:tcPr>
             <w:tcW w:type="dxa" w:w="3249"/>
-            <w:shd w:fill="EDF2F8"/>
+            <w:shd w:fill="F0F6F5"/>
           </w:tcPr>
           <w:p>
             <w:r>
@@ -4920,6 +5761,8 @@
             </w:r>
             <w:r>
               <w:rPr>
+                <w:b w:val="0"/>
+                <w:i w:val="0"/>
                 <w:sz w:val="20"/>
               </w:rPr>
               <w:t>axsvr-autoinstall.md + autoinstall/</w:t>
@@ -4929,7 +5772,7 @@
         <w:tc>
           <w:tcPr>
             <w:tcW w:type="dxa" w:w="3249"/>
-            <w:shd w:fill="EDF2F8"/>
+            <w:shd w:fill="F0F6F5"/>
           </w:tcPr>
           <w:p>
             <w:r>
@@ -4939,6 +5782,8 @@
             </w:r>
             <w:r>
               <w:rPr>
+                <w:b w:val="0"/>
+                <w:i w:val="0"/>
                 <w:sz w:val="20"/>
               </w:rPr>
               <w:t>Autoinstall Ubuntu 24.04 (seed ISO)</w:t>
@@ -4959,6 +5804,8 @@
             </w:r>
             <w:r>
               <w:rPr>
+                <w:b w:val="0"/>
+                <w:i w:val="0"/>
                 <w:sz w:val="20"/>
               </w:rPr>
               <w:t>Tool</w:t>
@@ -4977,6 +5824,8 @@
             </w:r>
             <w:r>
               <w:rPr>
+                <w:b w:val="0"/>
+                <w:i w:val="0"/>
                 <w:sz w:val="20"/>
               </w:rPr>
               <w:t>firewall/</w:t>
@@ -4995,6 +5844,8 @@
             </w:r>
             <w:r>
               <w:rPr>
+                <w:b w:val="0"/>
+                <w:i w:val="0"/>
                 <w:sz w:val="20"/>
               </w:rPr>
               <w:t>Firewall theo vai trò (Linux + Windows)</w:t>
@@ -5006,7 +5857,7 @@
         <w:tc>
           <w:tcPr>
             <w:tcW w:type="dxa" w:w="3249"/>
-            <w:shd w:fill="EDF2F8"/>
+            <w:shd w:fill="F0F6F5"/>
           </w:tcPr>
           <w:p>
             <w:r>
@@ -5016,6 +5867,8 @@
             </w:r>
             <w:r>
               <w:rPr>
+                <w:b w:val="0"/>
+                <w:i w:val="0"/>
                 <w:sz w:val="20"/>
               </w:rPr>
               <w:t>Tool</w:t>
@@ -5025,7 +5878,7 @@
         <w:tc>
           <w:tcPr>
             <w:tcW w:type="dxa" w:w="3249"/>
-            <w:shd w:fill="EDF2F8"/>
+            <w:shd w:fill="F0F6F5"/>
           </w:tcPr>
           <w:p>
             <w:r>
@@ -5035,6 +5888,8 @@
             </w:r>
             <w:r>
               <w:rPr>
+                <w:b w:val="0"/>
+                <w:i w:val="0"/>
                 <w:sz w:val="20"/>
               </w:rPr>
               <w:t>db-scripts/</w:t>
@@ -5044,7 +5899,7 @@
         <w:tc>
           <w:tcPr>
             <w:tcW w:type="dxa" w:w="3249"/>
-            <w:shd w:fill="EDF2F8"/>
+            <w:shd w:fill="F0F6F5"/>
           </w:tcPr>
           <w:p>
             <w:r>
@@ -5054,6 +5909,8 @@
             </w:r>
             <w:r>
               <w:rPr>
+                <w:b w:val="0"/>
+                <w:i w:val="0"/>
                 <w:sz w:val="20"/>
               </w:rPr>
               <w:t>14 scripts quản trị PostgreSQL</w:t>
@@ -5064,6 +5921,8 @@
     </w:tbl>
     <w:p/>
     <w:sectPr>
+      <w:headerReference w:type="default" r:id="rId9"/>
+      <w:footerReference w:type="default" r:id="rId10"/>
       <w:pgSz w:w="12240" w:h="15840"/>
       <w:pgMar w:top="1134" w:right="1247" w:bottom="1134" w:left="1247" w:header="720" w:footer="720" w:gutter="0"/>
       <w:cols w:space="720"/>
@@ -5071,6 +5930,45 @@
     </w:sectPr>
   </w:body>
 </w:document>
+</file>
+
+<file path=word/footer1.xml><?xml version="1.0" encoding="utf-8"?>
+<w:ftr xmlns:m="http://schemas.openxmlformats.org/officeDocument/2006/math" xmlns:mc="http://schemas.openxmlformats.org/markup-compatibility/2006" xmlns:mo="http://schemas.microsoft.com/office/mac/office/2008/main" xmlns:mv="urn:schemas-microsoft-com:mac:vml" xmlns:o="urn:schemas-microsoft-com:office:office" xmlns:r="http://schemas.openxmlformats.org/officeDocument/2006/relationships" xmlns:v="urn:schemas-microsoft-com:vml" xmlns:w10="urn:schemas-microsoft-com:office:word" xmlns:w14="http://schemas.microsoft.com/office/word/2010/wordml" xmlns:w="http://schemas.openxmlformats.org/wordprocessingml/2006/main" xmlns:wne="http://schemas.microsoft.com/office/word/2006/wordml" xmlns:wp14="http://schemas.microsoft.com/office/word/2010/wordprocessingDrawing" xmlns:wp="http://schemas.openxmlformats.org/drawingml/2006/wordprocessingDrawing" xmlns:wpc="http://schemas.microsoft.com/office/word/2010/wordprocessingCanvas" xmlns:wpg="http://schemas.microsoft.com/office/word/2010/wordprocessingGroup" xmlns:wpi="http://schemas.microsoft.com/office/word/2010/wordprocessingInk" xmlns:wps="http://schemas.microsoft.com/office/word/2010/wordprocessingShape" mc:Ignorable="w14 wp14">
+  <w:p>
+    <w:pPr>
+      <w:pStyle w:val="Footer"/>
+      <w:jc w:val="center"/>
+    </w:pPr>
+    <w:r/>
+    <w:r>
+      <w:rPr>
+        <w:color w:val="5A6B68"/>
+        <w:sz w:val="18"/>
+      </w:rPr>
+      <w:fldChar w:fldCharType="begin"/>
+      <w:instrText xml:space="preserve">PAGE</w:instrText>
+      <w:fldChar w:fldCharType="end"/>
+    </w:r>
+  </w:p>
+</w:ftr>
+</file>
+
+<file path=word/header1.xml><?xml version="1.0" encoding="utf-8"?>
+<w:hdr xmlns:m="http://schemas.openxmlformats.org/officeDocument/2006/math" xmlns:mc="http://schemas.openxmlformats.org/markup-compatibility/2006" xmlns:mo="http://schemas.microsoft.com/office/mac/office/2008/main" xmlns:mv="urn:schemas-microsoft-com:mac:vml" xmlns:o="urn:schemas-microsoft-com:office:office" xmlns:r="http://schemas.openxmlformats.org/officeDocument/2006/relationships" xmlns:v="urn:schemas-microsoft-com:vml" xmlns:w10="urn:schemas-microsoft-com:office:word" xmlns:w14="http://schemas.microsoft.com/office/word/2010/wordml" xmlns:w="http://schemas.openxmlformats.org/wordprocessingml/2006/main" xmlns:wne="http://schemas.microsoft.com/office/word/2006/wordml" xmlns:wp14="http://schemas.microsoft.com/office/word/2010/wordprocessingDrawing" xmlns:wp="http://schemas.openxmlformats.org/drawingml/2006/wordprocessingDrawing" xmlns:wpc="http://schemas.microsoft.com/office/word/2010/wordprocessingCanvas" xmlns:wpg="http://schemas.microsoft.com/office/word/2010/wordprocessingGroup" xmlns:wpi="http://schemas.microsoft.com/office/word/2010/wordprocessingInk" xmlns:wps="http://schemas.microsoft.com/office/word/2010/wordprocessingShape" mc:Ignorable="w14 wp14">
+  <w:p>
+    <w:pPr>
+      <w:pStyle w:val="Header"/>
+    </w:pPr>
+    <w:r/>
+    <w:r>
+      <w:rPr>
+        <w:color w:val="5A6B68"/>
+        <w:sz w:val="16"/>
+      </w:rPr>
+      <w:t>AX Svr — Proposal nội bộ · 10/07/2026</w:t>
+    </w:r>
+  </w:p>
+</w:hdr>
 </file>
 
 <file path=word/numbering.xml><?xml version="1.0" encoding="utf-8"?>
@@ -5438,6 +6336,7 @@
     <w:rsid w:val="00FC693F"/>
     <w:rPr>
       <w:rFonts w:ascii="Calibri" w:hAnsi="Calibri" w:eastAsia="Calibri"/>
+      <w:color w:val="1A2423"/>
       <w:sz w:val="22"/>
     </w:rPr>
   </w:style>

</xml_diff>

<commit_message>
docs(proposal): thêm logo SEHC INFRA vào bìa Word + góc 4 sơ đồ
</commit_message>
<xml_diff>
--- a/docs/axsvr-proposal.docx
+++ b/docs/axsvr-proposal.docx
@@ -4,8 +4,46 @@
   <w:body>
     <w:p/>
     <w:p/>
-    <w:p/>
-    <w:p/>
+    <w:p>
+      <w:pPr>
+        <w:spacing w:after="600"/>
+        <w:jc w:val="left"/>
+      </w:pPr>
+      <w:r>
+        <w:drawing>
+          <wp:inline xmlns:a="http://schemas.openxmlformats.org/drawingml/2006/main" xmlns:pic="http://schemas.openxmlformats.org/drawingml/2006/picture">
+            <wp:extent cx="1872000" cy="461346"/>
+            <wp:docPr id="1" name="Picture 1"/>
+            <wp:cNvGraphicFramePr>
+              <a:graphicFrameLocks noChangeAspect="1"/>
+            </wp:cNvGraphicFramePr>
+            <a:graphic>
+              <a:graphicData uri="http://schemas.openxmlformats.org/drawingml/2006/picture">
+                <pic:pic>
+                  <pic:nvPicPr>
+                    <pic:cNvPr id="0" name="sehc-infra-logo.png"/>
+                    <pic:cNvPicPr/>
+                  </pic:nvPicPr>
+                  <pic:blipFill>
+                    <a:blip r:embed="rId9"/>
+                    <a:stretch>
+                      <a:fillRect/>
+                    </a:stretch>
+                  </pic:blipFill>
+                  <pic:spPr>
+                    <a:xfrm>
+                      <a:off x="0" y="0"/>
+                      <a:ext cx="1872000" cy="461346"/>
+                    </a:xfrm>
+                    <a:prstGeom prst="rect"/>
+                  </pic:spPr>
+                </pic:pic>
+              </a:graphicData>
+            </a:graphic>
+          </wp:inline>
+        </w:drawing>
+      </w:r>
+    </w:p>
     <w:p>
       <w:pPr>
         <w:spacing w:before="0" w:after="200"/>
@@ -1112,7 +1150,7 @@
         <w:drawing>
           <wp:inline xmlns:a="http://schemas.openxmlformats.org/drawingml/2006/main" xmlns:pic="http://schemas.openxmlformats.org/drawingml/2006/picture">
             <wp:extent cx="5976000" cy="5627400"/>
-            <wp:docPr id="1" name="Picture 1"/>
+            <wp:docPr id="2" name="Picture 2"/>
             <wp:cNvGraphicFramePr>
               <a:graphicFrameLocks noChangeAspect="1"/>
             </wp:cNvGraphicFramePr>
@@ -1124,7 +1162,7 @@
                     <pic:cNvPicPr/>
                   </pic:nvPicPr>
                   <pic:blipFill>
-                    <a:blip r:embed="rId11"/>
+                    <a:blip r:embed="rId12"/>
                     <a:stretch>
                       <a:fillRect/>
                     </a:stretch>
@@ -1544,7 +1582,7 @@
         <w:drawing>
           <wp:inline xmlns:a="http://schemas.openxmlformats.org/drawingml/2006/main" xmlns:pic="http://schemas.openxmlformats.org/drawingml/2006/picture">
             <wp:extent cx="5976000" cy="3087600"/>
-            <wp:docPr id="2" name="Picture 2"/>
+            <wp:docPr id="3" name="Picture 3"/>
             <wp:cNvGraphicFramePr>
               <a:graphicFrameLocks noChangeAspect="1"/>
             </wp:cNvGraphicFramePr>
@@ -1556,7 +1594,7 @@
                     <pic:cNvPicPr/>
                   </pic:nvPicPr>
                   <pic:blipFill>
-                    <a:blip r:embed="rId12"/>
+                    <a:blip r:embed="rId13"/>
                     <a:stretch>
                       <a:fillRect/>
                     </a:stretch>
@@ -1612,7 +1650,7 @@
         <w:drawing>
           <wp:inline xmlns:a="http://schemas.openxmlformats.org/drawingml/2006/main" xmlns:pic="http://schemas.openxmlformats.org/drawingml/2006/picture">
             <wp:extent cx="5976000" cy="3187200"/>
-            <wp:docPr id="3" name="Picture 3"/>
+            <wp:docPr id="4" name="Picture 4"/>
             <wp:cNvGraphicFramePr>
               <a:graphicFrameLocks noChangeAspect="1"/>
             </wp:cNvGraphicFramePr>
@@ -1624,7 +1662,7 @@
                     <pic:cNvPicPr/>
                   </pic:nvPicPr>
                   <pic:blipFill>
-                    <a:blip r:embed="rId13"/>
+                    <a:blip r:embed="rId14"/>
                     <a:stretch>
                       <a:fillRect/>
                     </a:stretch>
@@ -2747,7 +2785,7 @@
         <w:drawing>
           <wp:inline xmlns:a="http://schemas.openxmlformats.org/drawingml/2006/main" xmlns:pic="http://schemas.openxmlformats.org/drawingml/2006/picture">
             <wp:extent cx="5976000" cy="3286800"/>
-            <wp:docPr id="4" name="Picture 4"/>
+            <wp:docPr id="5" name="Picture 5"/>
             <wp:cNvGraphicFramePr>
               <a:graphicFrameLocks noChangeAspect="1"/>
             </wp:cNvGraphicFramePr>
@@ -2759,7 +2797,7 @@
                     <pic:cNvPicPr/>
                   </pic:nvPicPr>
                   <pic:blipFill>
-                    <a:blip r:embed="rId14"/>
+                    <a:blip r:embed="rId15"/>
                     <a:stretch>
                       <a:fillRect/>
                     </a:stretch>
@@ -5921,8 +5959,8 @@
     </w:tbl>
     <w:p/>
     <w:sectPr>
-      <w:headerReference w:type="default" r:id="rId9"/>
-      <w:footerReference w:type="default" r:id="rId10"/>
+      <w:headerReference w:type="default" r:id="rId10"/>
+      <w:footerReference w:type="default" r:id="rId11"/>
       <w:pgSz w:w="12240" w:h="15840"/>
       <w:pgMar w:top="1134" w:right="1247" w:bottom="1134" w:left="1247" w:header="720" w:footer="720" w:gutter="0"/>
       <w:cols w:space="720"/>

</xml_diff>

<commit_message>
docs(proposal): đồng bộ tông sơ đồ + tài liệu sang xanh dương #0071BC khớp logo SEHC INFRA
</commit_message>
<xml_diff>
--- a/docs/axsvr-proposal.docx
+++ b/docs/axsvr-proposal.docx
@@ -52,7 +52,7 @@
       <w:r>
         <w:rPr>
           <w:b/>
-          <w:color w:val="146B63"/>
+          <w:color w:val="0071BC"/>
           <w:sz w:val="22"/>
         </w:rPr>
         <w:t>PROPOSAL NỘI BỘ — TRÌNH QUẢN LÝ</w:t>
@@ -63,7 +63,7 @@
         <w:rPr>
           <w:rFonts w:ascii="Cambria" w:hAnsi="Cambria"/>
           <w:b/>
-          <w:color w:val="1A2423"/>
+          <w:color w:val="1A2230"/>
           <w:sz w:val="52"/>
         </w:rPr>
         <w:t>HẠ TẦNG WEB HIGH AVAILABILITY</w:t>
@@ -74,7 +74,7 @@
         <w:rPr>
           <w:rFonts w:ascii="Cambria" w:hAnsi="Cambria"/>
           <w:b/>
-          <w:color w:val="146B63"/>
+          <w:color w:val="0071BC"/>
           <w:sz w:val="52"/>
         </w:rPr>
         <w:t>DỰ ÁN "AX SVR"</w:t>
@@ -88,7 +88,7 @@
       <w:r>
         <w:rPr>
           <w:b w:val="0"/>
-          <w:color w:val="5A6B68"/>
+          <w:color w:val="5A6676"/>
           <w:sz w:val="26"/>
         </w:rPr>
         <w:t>Báo cáo hoàn thành triển khai và đề xuất giai đoạn tiếp theo</w:t>
@@ -110,14 +110,14 @@
         <w:tc>
           <w:tcPr>
             <w:tcW w:type="dxa" w:w="4873"/>
-            <w:shd w:fill="F0F6F5"/>
+            <w:shd w:fill="EDF4FB"/>
           </w:tcPr>
           <w:p>
             <w:r/>
             <w:r>
               <w:rPr>
                 <w:b/>
-                <w:color w:val="5A6B68"/>
+                <w:color w:val="5A6676"/>
                 <w:sz w:val="18"/>
               </w:rPr>
               <w:t>NGÀY</w:t>
@@ -144,14 +144,14 @@
         <w:tc>
           <w:tcPr>
             <w:tcW w:type="dxa" w:w="4873"/>
-            <w:shd w:fill="F0F6F5"/>
+            <w:shd w:fill="EDF4FB"/>
           </w:tcPr>
           <w:p>
             <w:r/>
             <w:r>
               <w:rPr>
                 <w:b/>
-                <w:color w:val="5A6B68"/>
+                <w:color w:val="5A6676"/>
                 <w:sz w:val="18"/>
               </w:rPr>
               <w:t>TRẠNG THÁI</w:t>
@@ -178,14 +178,14 @@
         <w:tc>
           <w:tcPr>
             <w:tcW w:type="dxa" w:w="4873"/>
-            <w:shd w:fill="F0F6F5"/>
+            <w:shd w:fill="EDF4FB"/>
           </w:tcPr>
           <w:p>
             <w:r/>
             <w:r>
               <w:rPr>
                 <w:b/>
-                <w:color w:val="5A6B68"/>
+                <w:color w:val="5A6676"/>
                 <w:sz w:val="18"/>
               </w:rPr>
               <w:t>PHIÊN BẢN</w:t>
@@ -212,14 +212,14 @@
         <w:tc>
           <w:tcPr>
             <w:tcW w:type="dxa" w:w="4873"/>
-            <w:shd w:fill="F0F6F5"/>
+            <w:shd w:fill="EDF4FB"/>
           </w:tcPr>
           <w:p>
             <w:r/>
             <w:r>
               <w:rPr>
                 <w:b/>
-                <w:color w:val="5A6B68"/>
+                <w:color w:val="5A6676"/>
                 <w:sz w:val="18"/>
               </w:rPr>
               <w:t>NGƯỜI THỰC HIỆN</w:t>
@@ -253,7 +253,7 @@
       <w:pPr>
         <w:spacing w:before="120" w:after="120"/>
         <w:jc w:val="center"/>
-        <w:shd w:fill="146B63"/>
+        <w:shd w:fill="0071BC"/>
       </w:pPr>
       <w:r>
         <w:rPr>
@@ -277,7 +277,7 @@
       <w:r>
         <w:rPr>
           <w:rFonts w:ascii="Cambria" w:hAnsi="Cambria"/>
-          <w:color w:val="146B63"/>
+          <w:color w:val="0071BC"/>
           <w:sz w:val="30"/>
         </w:rPr>
         <w:t>1. Tóm tắt điều hành (Executive Summary)</w:t>
@@ -513,7 +513,7 @@
       <w:r>
         <w:rPr>
           <w:rFonts w:ascii="Cambria" w:hAnsi="Cambria"/>
-          <w:color w:val="146B63"/>
+          <w:color w:val="0071BC"/>
           <w:sz w:val="30"/>
         </w:rPr>
         <w:t>2. Bối cảnh &amp; mục tiêu</w:t>
@@ -526,7 +526,7 @@
       <w:r>
         <w:rPr>
           <w:rFonts w:ascii="Cambria" w:hAnsi="Cambria"/>
-          <w:color w:val="1A2423"/>
+          <w:color w:val="1A2230"/>
           <w:sz w:val="25"/>
         </w:rPr>
         <w:t>Bối cảnh</w:t>
@@ -638,7 +638,7 @@
       <w:r>
         <w:rPr>
           <w:rFonts w:ascii="Cambria" w:hAnsi="Cambria"/>
-          <w:color w:val="1A2423"/>
+          <w:color w:val="1A2230"/>
           <w:sz w:val="25"/>
         </w:rPr>
         <w:t>Mục tiêu đã cam kết</w:t>
@@ -660,7 +660,7 @@
         <w:tc>
           <w:tcPr>
             <w:tcW w:type="dxa" w:w="3249"/>
-            <w:shd w:fill="146B63"/>
+            <w:shd w:fill="0071BC"/>
           </w:tcPr>
           <w:p>
             <w:r>
@@ -684,7 +684,7 @@
         <w:tc>
           <w:tcPr>
             <w:tcW w:type="dxa" w:w="3249"/>
-            <w:shd w:fill="146B63"/>
+            <w:shd w:fill="0071BC"/>
           </w:tcPr>
           <w:p>
             <w:r>
@@ -708,7 +708,7 @@
         <w:tc>
           <w:tcPr>
             <w:tcW w:type="dxa" w:w="3249"/>
-            <w:shd w:fill="146B63"/>
+            <w:shd w:fill="0071BC"/>
           </w:tcPr>
           <w:p>
             <w:r>
@@ -796,7 +796,7 @@
         <w:tc>
           <w:tcPr>
             <w:tcW w:type="dxa" w:w="3249"/>
-            <w:shd w:fill="F0F6F5"/>
+            <w:shd w:fill="EDF4FB"/>
           </w:tcPr>
           <w:p>
             <w:r>
@@ -817,7 +817,7 @@
         <w:tc>
           <w:tcPr>
             <w:tcW w:type="dxa" w:w="3249"/>
-            <w:shd w:fill="F0F6F5"/>
+            <w:shd w:fill="EDF4FB"/>
           </w:tcPr>
           <w:p>
             <w:r>
@@ -838,7 +838,7 @@
         <w:tc>
           <w:tcPr>
             <w:tcW w:type="dxa" w:w="3249"/>
-            <w:shd w:fill="F0F6F5"/>
+            <w:shd w:fill="EDF4FB"/>
           </w:tcPr>
           <w:p>
             <w:r>
@@ -923,7 +923,7 @@
         <w:tc>
           <w:tcPr>
             <w:tcW w:type="dxa" w:w="3249"/>
-            <w:shd w:fill="F0F6F5"/>
+            <w:shd w:fill="EDF4FB"/>
           </w:tcPr>
           <w:p>
             <w:r>
@@ -944,7 +944,7 @@
         <w:tc>
           <w:tcPr>
             <w:tcW w:type="dxa" w:w="3249"/>
-            <w:shd w:fill="F0F6F5"/>
+            <w:shd w:fill="EDF4FB"/>
           </w:tcPr>
           <w:p>
             <w:r>
@@ -965,7 +965,7 @@
         <w:tc>
           <w:tcPr>
             <w:tcW w:type="dxa" w:w="3249"/>
-            <w:shd w:fill="F0F6F5"/>
+            <w:shd w:fill="EDF4FB"/>
           </w:tcPr>
           <w:p>
             <w:r>
@@ -1050,7 +1050,7 @@
         <w:tc>
           <w:tcPr>
             <w:tcW w:type="dxa" w:w="3249"/>
-            <w:shd w:fill="F0F6F5"/>
+            <w:shd w:fill="EDF4FB"/>
           </w:tcPr>
           <w:p>
             <w:r>
@@ -1071,7 +1071,7 @@
         <w:tc>
           <w:tcPr>
             <w:tcW w:type="dxa" w:w="3249"/>
-            <w:shd w:fill="F0F6F5"/>
+            <w:shd w:fill="EDF4FB"/>
           </w:tcPr>
           <w:p>
             <w:r>
@@ -1092,7 +1092,7 @@
         <w:tc>
           <w:tcPr>
             <w:tcW w:type="dxa" w:w="3249"/>
-            <w:shd w:fill="F0F6F5"/>
+            <w:shd w:fill="EDF4FB"/>
           </w:tcPr>
           <w:p>
             <w:r>
@@ -1121,7 +1121,7 @@
       <w:r>
         <w:rPr>
           <w:rFonts w:ascii="Cambria" w:hAnsi="Cambria"/>
-          <w:color w:val="146B63"/>
+          <w:color w:val="0071BC"/>
           <w:sz w:val="30"/>
         </w:rPr>
         <w:t>3. Kiến trúc giải pháp</w:t>
@@ -1134,7 +1134,7 @@
       <w:r>
         <w:rPr>
           <w:rFonts w:ascii="Cambria" w:hAnsi="Cambria"/>
-          <w:color w:val="1A2423"/>
+          <w:color w:val="1A2230"/>
           <w:sz w:val="25"/>
         </w:rPr>
         <w:t>3.1 Sơ đồ tổng thể</w:t>
@@ -1189,7 +1189,7 @@
       <w:r>
         <w:rPr>
           <w:i/>
-          <w:color w:val="5A6B68"/>
+          <w:color w:val="5A6676"/>
           <w:sz w:val="18"/>
         </w:rPr>
         <w:t>Hình: Sơ đồ kiến trúc tổng thể AX Svr</w:t>
@@ -1202,7 +1202,7 @@
       <w:r>
         <w:rPr>
           <w:rFonts w:ascii="Cambria" w:hAnsi="Cambria"/>
-          <w:color w:val="1A2423"/>
+          <w:color w:val="1A2230"/>
           <w:sz w:val="25"/>
         </w:rPr>
         <w:t>3.2 Các quyết định kiến trúc chính &amp; lý do</w:t>
@@ -1269,7 +1269,7 @@
           <w:rFonts w:ascii="Consolas" w:hAnsi="Consolas"/>
           <w:b w:val="0"/>
           <w:i w:val="0"/>
-          <w:color w:val="146B63"/>
+          <w:color w:val="0071BC"/>
           <w:sz w:val="20"/>
         </w:rPr>
         <w:t>target_session_attrs=read-write</w:t>
@@ -1312,7 +1312,7 @@
           <w:rFonts w:ascii="Consolas" w:hAnsi="Consolas"/>
           <w:b/>
           <w:i w:val="0"/>
-          <w:color w:val="146B63"/>
+          <w:color w:val="0071BC"/>
           <w:sz w:val="20"/>
         </w:rPr>
         <w:t>D:\app</w:t>
@@ -1348,7 +1348,7 @@
           <w:rFonts w:ascii="Consolas" w:hAnsi="Consolas"/>
           <w:b/>
           <w:i w:val="0"/>
-          <w:color w:val="146B63"/>
+          <w:color w:val="0071BC"/>
           <w:sz w:val="20"/>
         </w:rPr>
         <w:t>/backup</w:t>
@@ -1413,7 +1413,7 @@
       <w:r>
         <w:rPr>
           <w:rFonts w:ascii="Cambria" w:hAnsi="Cambria"/>
-          <w:color w:val="1A2423"/>
+          <w:color w:val="1A2230"/>
           <w:sz w:val="25"/>
         </w:rPr>
         <w:t>3.3 Bảo mật — mô hình nhiều lớp</w:t>
@@ -1475,7 +1475,7 @@
           <w:rFonts w:ascii="Consolas" w:hAnsi="Consolas"/>
           <w:b w:val="0"/>
           <w:i w:val="0"/>
-          <w:color w:val="146B63"/>
+          <w:color w:val="0071BC"/>
           <w:sz w:val="20"/>
         </w:rPr>
         <w:t>apply-firewall.sh</w:t>
@@ -1492,7 +1492,7 @@
           <w:rFonts w:ascii="Consolas" w:hAnsi="Consolas"/>
           <w:b w:val="0"/>
           <w:i w:val="0"/>
-          <w:color w:val="146B63"/>
+          <w:color w:val="0071BC"/>
           <w:sz w:val="20"/>
         </w:rPr>
         <w:t>apply-firewall-windows.ps1</w:t>
@@ -1542,7 +1542,7 @@
           <w:rFonts w:ascii="Consolas" w:hAnsi="Consolas"/>
           <w:b w:val="0"/>
           <w:i w:val="0"/>
-          <w:color w:val="146B63"/>
+          <w:color w:val="0071BC"/>
           <w:sz w:val="20"/>
         </w:rPr>
         <w:t>postgres</w:t>
@@ -1559,7 +1559,7 @@
           <w:rFonts w:ascii="Consolas" w:hAnsi="Consolas"/>
           <w:b w:val="0"/>
           <w:i w:val="0"/>
-          <w:color w:val="146B63"/>
+          <w:color w:val="0071BC"/>
           <w:sz w:val="20"/>
         </w:rPr>
         <w:t>dbadmin</w:t>
@@ -1621,7 +1621,7 @@
       <w:r>
         <w:rPr>
           <w:i/>
-          <w:color w:val="5A6B68"/>
+          <w:color w:val="5A6676"/>
           <w:sz w:val="18"/>
         </w:rPr>
         <w:t>Hình: Mô hình bảo mật nhiều lớp</w:t>
@@ -1634,7 +1634,7 @@
       <w:r>
         <w:rPr>
           <w:rFonts w:ascii="Cambria" w:hAnsi="Cambria"/>
-          <w:color w:val="1A2423"/>
+          <w:color w:val="1A2230"/>
           <w:sz w:val="25"/>
         </w:rPr>
         <w:t>3.4 Chiến lược backup &amp; khôi phục dữ liệu</w:t>
@@ -1689,7 +1689,7 @@
       <w:r>
         <w:rPr>
           <w:i/>
-          <w:color w:val="5A6B68"/>
+          <w:color w:val="5A6676"/>
           <w:sz w:val="18"/>
         </w:rPr>
         <w:t>Hình: Chiến lược backup và khôi phục</w:t>
@@ -1703,7 +1703,7 @@
       <w:r>
         <w:rPr>
           <w:rFonts w:ascii="Cambria" w:hAnsi="Cambria"/>
-          <w:color w:val="146B63"/>
+          <w:color w:val="0071BC"/>
           <w:sz w:val="30"/>
         </w:rPr>
         <w:t>4. Khối lượng công việc đã hoàn thành</w:t>
@@ -1716,7 +1716,7 @@
       <w:r>
         <w:rPr>
           <w:rFonts w:ascii="Cambria" w:hAnsi="Cambria"/>
-          <w:color w:val="1A2423"/>
+          <w:color w:val="1A2230"/>
           <w:sz w:val="25"/>
         </w:rPr>
         <w:t>4.1 Hạ tầng đã triển khai (production)</w:t>
@@ -1738,7 +1738,7 @@
         <w:tc>
           <w:tcPr>
             <w:tcW w:type="dxa" w:w="3249"/>
-            <w:shd w:fill="146B63"/>
+            <w:shd w:fill="0071BC"/>
           </w:tcPr>
           <w:p>
             <w:r>
@@ -1762,7 +1762,7 @@
         <w:tc>
           <w:tcPr>
             <w:tcW w:type="dxa" w:w="3249"/>
-            <w:shd w:fill="146B63"/>
+            <w:shd w:fill="0071BC"/>
           </w:tcPr>
           <w:p>
             <w:r>
@@ -1786,7 +1786,7 @@
         <w:tc>
           <w:tcPr>
             <w:tcW w:type="dxa" w:w="3249"/>
-            <w:shd w:fill="146B63"/>
+            <w:shd w:fill="0071BC"/>
           </w:tcPr>
           <w:p>
             <w:r>
@@ -1874,7 +1874,7 @@
         <w:tc>
           <w:tcPr>
             <w:tcW w:type="dxa" w:w="3249"/>
-            <w:shd w:fill="F0F6F5"/>
+            <w:shd w:fill="EDF4FB"/>
           </w:tcPr>
           <w:p>
             <w:r>
@@ -1895,7 +1895,7 @@
         <w:tc>
           <w:tcPr>
             <w:tcW w:type="dxa" w:w="3249"/>
-            <w:shd w:fill="F0F6F5"/>
+            <w:shd w:fill="EDF4FB"/>
           </w:tcPr>
           <w:p>
             <w:r>
@@ -1916,7 +1916,7 @@
         <w:tc>
           <w:tcPr>
             <w:tcW w:type="dxa" w:w="3249"/>
-            <w:shd w:fill="F0F6F5"/>
+            <w:shd w:fill="EDF4FB"/>
           </w:tcPr>
           <w:p>
             <w:r>
@@ -1937,7 +1937,7 @@
                 <w:rFonts w:ascii="Consolas" w:hAnsi="Consolas"/>
                 <w:b w:val="0"/>
                 <w:i w:val="0"/>
-                <w:color w:val="146B63"/>
+                <w:color w:val="0071BC"/>
                 <w:sz w:val="20"/>
               </w:rPr>
               <w:t>/data</w:t>
@@ -2011,7 +2011,7 @@
         <w:tc>
           <w:tcPr>
             <w:tcW w:type="dxa" w:w="3249"/>
-            <w:shd w:fill="F0F6F5"/>
+            <w:shd w:fill="EDF4FB"/>
           </w:tcPr>
           <w:p>
             <w:r>
@@ -2032,7 +2032,7 @@
         <w:tc>
           <w:tcPr>
             <w:tcW w:type="dxa" w:w="3249"/>
-            <w:shd w:fill="F0F6F5"/>
+            <w:shd w:fill="EDF4FB"/>
           </w:tcPr>
           <w:p>
             <w:r>
@@ -2053,7 +2053,7 @@
         <w:tc>
           <w:tcPr>
             <w:tcW w:type="dxa" w:w="3249"/>
-            <w:shd w:fill="F0F6F5"/>
+            <w:shd w:fill="EDF4FB"/>
           </w:tcPr>
           <w:p>
             <w:r>
@@ -2138,7 +2138,7 @@
         <w:tc>
           <w:tcPr>
             <w:tcW w:type="dxa" w:w="3249"/>
-            <w:shd w:fill="F0F6F5"/>
+            <w:shd w:fill="EDF4FB"/>
           </w:tcPr>
           <w:p>
             <w:r>
@@ -2159,7 +2159,7 @@
         <w:tc>
           <w:tcPr>
             <w:tcW w:type="dxa" w:w="3249"/>
-            <w:shd w:fill="F0F6F5"/>
+            <w:shd w:fill="EDF4FB"/>
           </w:tcPr>
           <w:p>
             <w:r>
@@ -2180,7 +2180,7 @@
         <w:tc>
           <w:tcPr>
             <w:tcW w:type="dxa" w:w="3249"/>
-            <w:shd w:fill="F0F6F5"/>
+            <w:shd w:fill="EDF4FB"/>
           </w:tcPr>
           <w:p>
             <w:r>
@@ -2201,7 +2201,7 @@
                 <w:rFonts w:ascii="Consolas" w:hAnsi="Consolas"/>
                 <w:b w:val="0"/>
                 <w:i w:val="0"/>
-                <w:color w:val="146B63"/>
+                <w:color w:val="0071BC"/>
                 <w:sz w:val="20"/>
               </w:rPr>
               <w:t>/backup</w:t>
@@ -2283,7 +2283,7 @@
         <w:tc>
           <w:tcPr>
             <w:tcW w:type="dxa" w:w="3249"/>
-            <w:shd w:fill="F0F6F5"/>
+            <w:shd w:fill="EDF4FB"/>
           </w:tcPr>
           <w:p>
             <w:r>
@@ -2304,7 +2304,7 @@
         <w:tc>
           <w:tcPr>
             <w:tcW w:type="dxa" w:w="3249"/>
-            <w:shd w:fill="F0F6F5"/>
+            <w:shd w:fill="EDF4FB"/>
           </w:tcPr>
           <w:p>
             <w:r>
@@ -2325,7 +2325,7 @@
         <w:tc>
           <w:tcPr>
             <w:tcW w:type="dxa" w:w="3249"/>
-            <w:shd w:fill="F0F6F5"/>
+            <w:shd w:fill="EDF4FB"/>
           </w:tcPr>
           <w:p>
             <w:r>
@@ -2349,7 +2349,7 @@
     <w:p>
       <w:pPr>
         <w:ind w:left="227"/>
-        <w:shd w:fill="E3EFED"/>
+        <w:shd w:fill="E1EFF8"/>
       </w:pPr>
       <w:r>
         <w:rPr>
@@ -2407,7 +2407,7 @@
       <w:r>
         <w:rPr>
           <w:rFonts w:ascii="Cambria" w:hAnsi="Cambria"/>
-          <w:color w:val="1A2423"/>
+          <w:color w:val="1A2230"/>
           <w:sz w:val="25"/>
         </w:rPr>
         <w:t>4.2 Sản phẩm bàn giao (deliverables)</w:t>
@@ -2428,7 +2428,7 @@
         <w:tc>
           <w:tcPr>
             <w:tcW w:type="dxa" w:w="4873"/>
-            <w:shd w:fill="146B63"/>
+            <w:shd w:fill="0071BC"/>
           </w:tcPr>
           <w:p>
             <w:r>
@@ -2452,7 +2452,7 @@
         <w:tc>
           <w:tcPr>
             <w:tcW w:type="dxa" w:w="4873"/>
-            <w:shd w:fill="146B63"/>
+            <w:shd w:fill="0071BC"/>
           </w:tcPr>
           <w:p>
             <w:r>
@@ -2520,7 +2520,7 @@
         <w:tc>
           <w:tcPr>
             <w:tcW w:type="dxa" w:w="4873"/>
-            <w:shd w:fill="F0F6F5"/>
+            <w:shd w:fill="EDF4FB"/>
           </w:tcPr>
           <w:p>
             <w:r>
@@ -2541,7 +2541,7 @@
                 <w:rFonts w:ascii="Consolas" w:hAnsi="Consolas"/>
                 <w:b w:val="0"/>
                 <w:i w:val="0"/>
-                <w:color w:val="146B63"/>
+                <w:color w:val="0071BC"/>
                 <w:sz w:val="20"/>
               </w:rPr>
               <w:t>db-scripts/</w:t>
@@ -2551,7 +2551,7 @@
         <w:tc>
           <w:tcPr>
             <w:tcW w:type="dxa" w:w="4873"/>
-            <w:shd w:fill="F0F6F5"/>
+            <w:shd w:fill="EDF4FB"/>
           </w:tcPr>
           <w:p>
             <w:r>
@@ -2616,7 +2616,7 @@
         <w:tc>
           <w:tcPr>
             <w:tcW w:type="dxa" w:w="4873"/>
-            <w:shd w:fill="F0F6F5"/>
+            <w:shd w:fill="EDF4FB"/>
           </w:tcPr>
           <w:p>
             <w:r>
@@ -2637,7 +2637,7 @@
         <w:tc>
           <w:tcPr>
             <w:tcW w:type="dxa" w:w="4873"/>
-            <w:shd w:fill="F0F6F5"/>
+            <w:shd w:fill="EDF4FB"/>
           </w:tcPr>
           <w:p>
             <w:r>
@@ -2650,7 +2650,7 @@
                 <w:rFonts w:ascii="Consolas" w:hAnsi="Consolas"/>
                 <w:b w:val="0"/>
                 <w:i w:val="0"/>
-                <w:color w:val="146B63"/>
+                <w:color w:val="0071BC"/>
                 <w:sz w:val="20"/>
               </w:rPr>
               <w:t>gen-autoinstall.sh</w:t>
@@ -2712,7 +2712,7 @@
         <w:tc>
           <w:tcPr>
             <w:tcW w:type="dxa" w:w="4873"/>
-            <w:shd w:fill="F0F6F5"/>
+            <w:shd w:fill="EDF4FB"/>
           </w:tcPr>
           <w:p>
             <w:r>
@@ -2733,7 +2733,7 @@
         <w:tc>
           <w:tcPr>
             <w:tcW w:type="dxa" w:w="4873"/>
-            <w:shd w:fill="F0F6F5"/>
+            <w:shd w:fill="EDF4FB"/>
           </w:tcPr>
           <w:p>
             <w:r>
@@ -2769,7 +2769,7 @@
       <w:r>
         <w:rPr>
           <w:rFonts w:ascii="Cambria" w:hAnsi="Cambria"/>
-          <w:color w:val="1A2423"/>
+          <w:color w:val="1A2230"/>
           <w:sz w:val="25"/>
         </w:rPr>
         <w:t>4.3 Kết quả kiểm thử HA (theo checklist nghiệm thu)</w:t>
@@ -2824,7 +2824,7 @@
       <w:r>
         <w:rPr>
           <w:i/>
-          <w:color w:val="5A6B68"/>
+          <w:color w:val="5A6676"/>
           <w:sz w:val="18"/>
         </w:rPr>
         <w:t>Hình: Kịch bản failover cụm PostgreSQL</w:t>
@@ -2914,7 +2914,7 @@
       <w:r>
         <w:rPr>
           <w:rFonts w:ascii="Cambria" w:hAnsi="Cambria"/>
-          <w:color w:val="146B63"/>
+          <w:color w:val="0071BC"/>
           <w:sz w:val="30"/>
         </w:rPr>
         <w:t>5. Giá trị mang lại</w:t>
@@ -3023,7 +3023,7 @@
       <w:r>
         <w:rPr>
           <w:rFonts w:ascii="Cambria" w:hAnsi="Cambria"/>
-          <w:color w:val="146B63"/>
+          <w:color w:val="0071BC"/>
           <w:sz w:val="30"/>
         </w:rPr>
         <w:t>6. Rủi ro còn lại &amp; giới hạn hiện tại</w:t>
@@ -3046,7 +3046,7 @@
         <w:tc>
           <w:tcPr>
             <w:tcW w:type="dxa" w:w="2436"/>
-            <w:shd w:fill="146B63"/>
+            <w:shd w:fill="0071BC"/>
           </w:tcPr>
           <w:p>
             <w:r>
@@ -3070,7 +3070,7 @@
         <w:tc>
           <w:tcPr>
             <w:tcW w:type="dxa" w:w="2436"/>
-            <w:shd w:fill="146B63"/>
+            <w:shd w:fill="0071BC"/>
           </w:tcPr>
           <w:p>
             <w:r>
@@ -3094,7 +3094,7 @@
         <w:tc>
           <w:tcPr>
             <w:tcW w:type="dxa" w:w="2436"/>
-            <w:shd w:fill="146B63"/>
+            <w:shd w:fill="0071BC"/>
           </w:tcPr>
           <w:p>
             <w:r>
@@ -3118,7 +3118,7 @@
         <w:tc>
           <w:tcPr>
             <w:tcW w:type="dxa" w:w="2436"/>
-            <w:shd w:fill="146B63"/>
+            <w:shd w:fill="0071BC"/>
           </w:tcPr>
           <w:p>
             <w:r>
@@ -3226,7 +3226,7 @@
         <w:tc>
           <w:tcPr>
             <w:tcW w:type="dxa" w:w="2436"/>
-            <w:shd w:fill="F0F6F5"/>
+            <w:shd w:fill="EDF4FB"/>
           </w:tcPr>
           <w:p>
             <w:r>
@@ -3247,7 +3247,7 @@
         <w:tc>
           <w:tcPr>
             <w:tcW w:type="dxa" w:w="2436"/>
-            <w:shd w:fill="F0F6F5"/>
+            <w:shd w:fill="EDF4FB"/>
           </w:tcPr>
           <w:p>
             <w:r>
@@ -3268,7 +3268,7 @@
         <w:tc>
           <w:tcPr>
             <w:tcW w:type="dxa" w:w="2436"/>
-            <w:shd w:fill="F0F6F5"/>
+            <w:shd w:fill="EDF4FB"/>
           </w:tcPr>
           <w:p>
             <w:r>
@@ -3289,7 +3289,7 @@
         <w:tc>
           <w:tcPr>
             <w:tcW w:type="dxa" w:w="2436"/>
-            <w:shd w:fill="F0F6F5"/>
+            <w:shd w:fill="EDF4FB"/>
           </w:tcPr>
           <w:p>
             <w:r>
@@ -3410,7 +3410,7 @@
         <w:tc>
           <w:tcPr>
             <w:tcW w:type="dxa" w:w="2436"/>
-            <w:shd w:fill="F0F6F5"/>
+            <w:shd w:fill="EDF4FB"/>
           </w:tcPr>
           <w:p>
             <w:r>
@@ -3431,7 +3431,7 @@
         <w:tc>
           <w:tcPr>
             <w:tcW w:type="dxa" w:w="2436"/>
-            <w:shd w:fill="F0F6F5"/>
+            <w:shd w:fill="EDF4FB"/>
           </w:tcPr>
           <w:p>
             <w:r>
@@ -3452,7 +3452,7 @@
         <w:tc>
           <w:tcPr>
             <w:tcW w:type="dxa" w:w="2436"/>
-            <w:shd w:fill="F0F6F5"/>
+            <w:shd w:fill="EDF4FB"/>
           </w:tcPr>
           <w:p>
             <w:r>
@@ -3473,7 +3473,7 @@
         <w:tc>
           <w:tcPr>
             <w:tcW w:type="dxa" w:w="2436"/>
-            <w:shd w:fill="F0F6F5"/>
+            <w:shd w:fill="EDF4FB"/>
           </w:tcPr>
           <w:p>
             <w:r>
@@ -3584,7 +3584,7 @@
       <w:r>
         <w:rPr>
           <w:rFonts w:ascii="Cambria" w:hAnsi="Cambria"/>
-          <w:color w:val="146B63"/>
+          <w:color w:val="0071BC"/>
           <w:sz w:val="30"/>
         </w:rPr>
         <w:t>7. Đề xuất giai đoạn tiếp theo</w:t>
@@ -3597,7 +3597,7 @@
       <w:r>
         <w:rPr>
           <w:rFonts w:ascii="Cambria" w:hAnsi="Cambria"/>
-          <w:color w:val="1A2423"/>
+          <w:color w:val="1A2230"/>
           <w:sz w:val="25"/>
         </w:rPr>
         <w:t>7.1 Tích hợp giám sát vào Zabbix/Grafana sẵn có *(ưu tiên cao)*</w:t>
@@ -3640,7 +3640,7 @@
           <w:rFonts w:ascii="Consolas" w:hAnsi="Consolas"/>
           <w:b w:val="0"/>
           <w:i w:val="0"/>
-          <w:color w:val="146B63"/>
+          <w:color w:val="0071BC"/>
           <w:sz w:val="20"/>
         </w:rPr>
         <w:t>:8008/metrics</w:t>
@@ -3669,7 +3669,7 @@
           <w:rFonts w:ascii="Consolas" w:hAnsi="Consolas"/>
           <w:b w:val="0"/>
           <w:i w:val="0"/>
-          <w:color w:val="146B63"/>
+          <w:color w:val="0071BC"/>
           <w:sz w:val="20"/>
         </w:rPr>
         <w:t>/data</w:t>
@@ -3686,7 +3686,7 @@
           <w:rFonts w:ascii="Consolas" w:hAnsi="Consolas"/>
           <w:b w:val="0"/>
           <w:i w:val="0"/>
-          <w:color w:val="146B63"/>
+          <w:color w:val="0071BC"/>
           <w:sz w:val="20"/>
         </w:rPr>
         <w:t>/backup</w:t>
@@ -3718,7 +3718,7 @@
       <w:r>
         <w:rPr>
           <w:rFonts w:ascii="Cambria" w:hAnsi="Cambria"/>
-          <w:color w:val="1A2423"/>
+          <w:color w:val="1A2230"/>
           <w:sz w:val="25"/>
         </w:rPr>
         <w:t>7.2 Backup off-site — hoàn thiện 3-2-1 *(ưu tiên cao)*</w:t>
@@ -3740,7 +3740,7 @@
       <w:r>
         <w:rPr>
           <w:rFonts w:ascii="Cambria" w:hAnsi="Cambria"/>
-          <w:color w:val="1A2423"/>
+          <w:color w:val="1A2230"/>
           <w:sz w:val="25"/>
         </w:rPr>
         <w:t>7.3 Quy trình vận hành định kỳ</w:t>
@@ -3774,7 +3774,7 @@
           <w:rFonts w:ascii="Consolas" w:hAnsi="Consolas"/>
           <w:b w:val="0"/>
           <w:i w:val="0"/>
-          <w:color w:val="146B63"/>
+          <w:color w:val="0071BC"/>
           <w:sz w:val="20"/>
         </w:rPr>
         <w:t>pgbackrest info</w:t>
@@ -3806,7 +3806,7 @@
       <w:r>
         <w:rPr>
           <w:rFonts w:ascii="Cambria" w:hAnsi="Cambria"/>
-          <w:color w:val="1A2423"/>
+          <w:color w:val="1A2230"/>
           <w:sz w:val="25"/>
         </w:rPr>
         <w:t>7.4 Nguồn lực đề xuất</w:t>
@@ -3827,7 +3827,7 @@
         <w:tc>
           <w:tcPr>
             <w:tcW w:type="dxa" w:w="4873"/>
-            <w:shd w:fill="146B63"/>
+            <w:shd w:fill="0071BC"/>
           </w:tcPr>
           <w:p>
             <w:r>
@@ -3851,7 +3851,7 @@
         <w:tc>
           <w:tcPr>
             <w:tcW w:type="dxa" w:w="4873"/>
-            <w:shd w:fill="146B63"/>
+            <w:shd w:fill="0071BC"/>
           </w:tcPr>
           <w:p>
             <w:r>
@@ -3919,7 +3919,7 @@
         <w:tc>
           <w:tcPr>
             <w:tcW w:type="dxa" w:w="4873"/>
-            <w:shd w:fill="F0F6F5"/>
+            <w:shd w:fill="EDF4FB"/>
           </w:tcPr>
           <w:p>
             <w:r>
@@ -3940,7 +3940,7 @@
         <w:tc>
           <w:tcPr>
             <w:tcW w:type="dxa" w:w="4873"/>
-            <w:shd w:fill="F0F6F5"/>
+            <w:shd w:fill="EDF4FB"/>
           </w:tcPr>
           <w:p>
             <w:r>
@@ -4011,7 +4011,7 @@
       <w:r>
         <w:rPr>
           <w:rFonts w:ascii="Cambria" w:hAnsi="Cambria"/>
-          <w:color w:val="146B63"/>
+          <w:color w:val="0071BC"/>
           <w:sz w:val="30"/>
         </w:rPr>
         <w:t>8. Kết luận</w:t>
@@ -4109,7 +4109,7 @@
       <w:r>
         <w:rPr>
           <w:rFonts w:ascii="Cambria" w:hAnsi="Cambria"/>
-          <w:color w:val="146B63"/>
+          <w:color w:val="0071BC"/>
           <w:sz w:val="30"/>
         </w:rPr>
         <w:t>Phụ lục A — Bảng IP hệ thống</w:t>
@@ -4132,7 +4132,7 @@
         <w:tc>
           <w:tcPr>
             <w:tcW w:type="dxa" w:w="2436"/>
-            <w:shd w:fill="146B63"/>
+            <w:shd w:fill="0071BC"/>
           </w:tcPr>
           <w:p>
             <w:r>
@@ -4156,7 +4156,7 @@
         <w:tc>
           <w:tcPr>
             <w:tcW w:type="dxa" w:w="2436"/>
-            <w:shd w:fill="146B63"/>
+            <w:shd w:fill="0071BC"/>
           </w:tcPr>
           <w:p>
             <w:r>
@@ -4180,7 +4180,7 @@
         <w:tc>
           <w:tcPr>
             <w:tcW w:type="dxa" w:w="2436"/>
-            <w:shd w:fill="146B63"/>
+            <w:shd w:fill="0071BC"/>
           </w:tcPr>
           <w:p>
             <w:r>
@@ -4204,7 +4204,7 @@
         <w:tc>
           <w:tcPr>
             <w:tcW w:type="dxa" w:w="2436"/>
-            <w:shd w:fill="146B63"/>
+            <w:shd w:fill="0071BC"/>
           </w:tcPr>
           <w:p>
             <w:r>
@@ -4312,7 +4312,7 @@
         <w:tc>
           <w:tcPr>
             <w:tcW w:type="dxa" w:w="2436"/>
-            <w:shd w:fill="F0F6F5"/>
+            <w:shd w:fill="EDF4FB"/>
           </w:tcPr>
           <w:p>
             <w:r>
@@ -4333,7 +4333,7 @@
         <w:tc>
           <w:tcPr>
             <w:tcW w:type="dxa" w:w="2436"/>
-            <w:shd w:fill="F0F6F5"/>
+            <w:shd w:fill="EDF4FB"/>
           </w:tcPr>
           <w:p>
             <w:r>
@@ -4354,7 +4354,7 @@
         <w:tc>
           <w:tcPr>
             <w:tcW w:type="dxa" w:w="2436"/>
-            <w:shd w:fill="F0F6F5"/>
+            <w:shd w:fill="EDF4FB"/>
           </w:tcPr>
           <w:p>
             <w:r>
@@ -4375,7 +4375,7 @@
         <w:tc>
           <w:tcPr>
             <w:tcW w:type="dxa" w:w="2436"/>
-            <w:shd w:fill="F0F6F5"/>
+            <w:shd w:fill="EDF4FB"/>
           </w:tcPr>
           <w:p>
             <w:r>
@@ -4480,7 +4480,7 @@
         <w:tc>
           <w:tcPr>
             <w:tcW w:type="dxa" w:w="2436"/>
-            <w:shd w:fill="F0F6F5"/>
+            <w:shd w:fill="EDF4FB"/>
           </w:tcPr>
           <w:p>
             <w:r>
@@ -4501,7 +4501,7 @@
         <w:tc>
           <w:tcPr>
             <w:tcW w:type="dxa" w:w="2436"/>
-            <w:shd w:fill="F0F6F5"/>
+            <w:shd w:fill="EDF4FB"/>
           </w:tcPr>
           <w:p>
             <w:r>
@@ -4522,7 +4522,7 @@
         <w:tc>
           <w:tcPr>
             <w:tcW w:type="dxa" w:w="2436"/>
-            <w:shd w:fill="F0F6F5"/>
+            <w:shd w:fill="EDF4FB"/>
           </w:tcPr>
           <w:p>
             <w:r>
@@ -4543,7 +4543,7 @@
         <w:tc>
           <w:tcPr>
             <w:tcW w:type="dxa" w:w="2436"/>
-            <w:shd w:fill="F0F6F5"/>
+            <w:shd w:fill="EDF4FB"/>
           </w:tcPr>
           <w:p>
             <w:r>
@@ -4648,7 +4648,7 @@
         <w:tc>
           <w:tcPr>
             <w:tcW w:type="dxa" w:w="2436"/>
-            <w:shd w:fill="F0F6F5"/>
+            <w:shd w:fill="EDF4FB"/>
           </w:tcPr>
           <w:p>
             <w:r>
@@ -4669,7 +4669,7 @@
         <w:tc>
           <w:tcPr>
             <w:tcW w:type="dxa" w:w="2436"/>
-            <w:shd w:fill="F0F6F5"/>
+            <w:shd w:fill="EDF4FB"/>
           </w:tcPr>
           <w:p>
             <w:r>
@@ -4690,7 +4690,7 @@
         <w:tc>
           <w:tcPr>
             <w:tcW w:type="dxa" w:w="2436"/>
-            <w:shd w:fill="F0F6F5"/>
+            <w:shd w:fill="EDF4FB"/>
           </w:tcPr>
           <w:p>
             <w:r>
@@ -4711,7 +4711,7 @@
         <w:tc>
           <w:tcPr>
             <w:tcW w:type="dxa" w:w="2436"/>
-            <w:shd w:fill="F0F6F5"/>
+            <w:shd w:fill="EDF4FB"/>
           </w:tcPr>
           <w:p>
             <w:r>
@@ -4816,7 +4816,7 @@
         <w:tc>
           <w:tcPr>
             <w:tcW w:type="dxa" w:w="2436"/>
-            <w:shd w:fill="F0F6F5"/>
+            <w:shd w:fill="EDF4FB"/>
           </w:tcPr>
           <w:p>
             <w:r>
@@ -4837,7 +4837,7 @@
         <w:tc>
           <w:tcPr>
             <w:tcW w:type="dxa" w:w="2436"/>
-            <w:shd w:fill="F0F6F5"/>
+            <w:shd w:fill="EDF4FB"/>
           </w:tcPr>
           <w:p>
             <w:r>
@@ -4858,7 +4858,7 @@
         <w:tc>
           <w:tcPr>
             <w:tcW w:type="dxa" w:w="2436"/>
-            <w:shd w:fill="F0F6F5"/>
+            <w:shd w:fill="EDF4FB"/>
           </w:tcPr>
           <w:p>
             <w:r>
@@ -4879,7 +4879,7 @@
         <w:tc>
           <w:tcPr>
             <w:tcW w:type="dxa" w:w="2436"/>
-            <w:shd w:fill="F0F6F5"/>
+            <w:shd w:fill="EDF4FB"/>
           </w:tcPr>
           <w:p>
             <w:r>
@@ -4982,7 +4982,7 @@
                 <w:rFonts w:ascii="Consolas" w:hAnsi="Consolas"/>
                 <w:b w:val="0"/>
                 <w:i w:val="0"/>
-                <w:color w:val="146B63"/>
+                <w:color w:val="0071BC"/>
                 <w:sz w:val="20"/>
               </w:rPr>
               <w:t>/backup</w:t>
@@ -5002,7 +5002,7 @@
         <w:tc>
           <w:tcPr>
             <w:tcW w:type="dxa" w:w="2436"/>
-            <w:shd w:fill="F0F6F5"/>
+            <w:shd w:fill="EDF4FB"/>
           </w:tcPr>
           <w:p>
             <w:r>
@@ -5023,7 +5023,7 @@
         <w:tc>
           <w:tcPr>
             <w:tcW w:type="dxa" w:w="2436"/>
-            <w:shd w:fill="F0F6F5"/>
+            <w:shd w:fill="EDF4FB"/>
           </w:tcPr>
           <w:p>
             <w:r>
@@ -5044,7 +5044,7 @@
         <w:tc>
           <w:tcPr>
             <w:tcW w:type="dxa" w:w="2436"/>
-            <w:shd w:fill="F0F6F5"/>
+            <w:shd w:fill="EDF4FB"/>
           </w:tcPr>
           <w:p>
             <w:r>
@@ -5065,7 +5065,7 @@
         <w:tc>
           <w:tcPr>
             <w:tcW w:type="dxa" w:w="2436"/>
-            <w:shd w:fill="F0F6F5"/>
+            <w:shd w:fill="EDF4FB"/>
           </w:tcPr>
           <w:p>
             <w:r>
@@ -5094,7 +5094,7 @@
       <w:r>
         <w:rPr>
           <w:rFonts w:ascii="Cambria" w:hAnsi="Cambria"/>
-          <w:color w:val="146B63"/>
+          <w:color w:val="0071BC"/>
           <w:sz w:val="30"/>
         </w:rPr>
         <w:t>Phụ lục B — Danh mục tài liệu bàn giao</w:t>
@@ -5116,7 +5116,7 @@
         <w:tc>
           <w:tcPr>
             <w:tcW w:type="dxa" w:w="3249"/>
-            <w:shd w:fill="146B63"/>
+            <w:shd w:fill="0071BC"/>
           </w:tcPr>
           <w:p>
             <w:r>
@@ -5140,7 +5140,7 @@
         <w:tc>
           <w:tcPr>
             <w:tcW w:type="dxa" w:w="3249"/>
-            <w:shd w:fill="146B63"/>
+            <w:shd w:fill="0071BC"/>
           </w:tcPr>
           <w:p>
             <w:r>
@@ -5164,7 +5164,7 @@
         <w:tc>
           <w:tcPr>
             <w:tcW w:type="dxa" w:w="3249"/>
-            <w:shd w:fill="146B63"/>
+            <w:shd w:fill="0071BC"/>
           </w:tcPr>
           <w:p>
             <w:r>
@@ -5252,7 +5252,7 @@
         <w:tc>
           <w:tcPr>
             <w:tcW w:type="dxa" w:w="3249"/>
-            <w:shd w:fill="F0F6F5"/>
+            <w:shd w:fill="EDF4FB"/>
           </w:tcPr>
           <w:p>
             <w:r>
@@ -5273,7 +5273,7 @@
         <w:tc>
           <w:tcPr>
             <w:tcW w:type="dxa" w:w="3249"/>
-            <w:shd w:fill="F0F6F5"/>
+            <w:shd w:fill="EDF4FB"/>
           </w:tcPr>
           <w:p>
             <w:r>
@@ -5294,7 +5294,7 @@
         <w:tc>
           <w:tcPr>
             <w:tcW w:type="dxa" w:w="3249"/>
-            <w:shd w:fill="F0F6F5"/>
+            <w:shd w:fill="EDF4FB"/>
           </w:tcPr>
           <w:p>
             <w:r>
@@ -5379,7 +5379,7 @@
         <w:tc>
           <w:tcPr>
             <w:tcW w:type="dxa" w:w="3249"/>
-            <w:shd w:fill="F0F6F5"/>
+            <w:shd w:fill="EDF4FB"/>
           </w:tcPr>
           <w:p>
             <w:r>
@@ -5400,7 +5400,7 @@
         <w:tc>
           <w:tcPr>
             <w:tcW w:type="dxa" w:w="3249"/>
-            <w:shd w:fill="F0F6F5"/>
+            <w:shd w:fill="EDF4FB"/>
           </w:tcPr>
           <w:p>
             <w:r>
@@ -5421,7 +5421,7 @@
         <w:tc>
           <w:tcPr>
             <w:tcW w:type="dxa" w:w="3249"/>
-            <w:shd w:fill="F0F6F5"/>
+            <w:shd w:fill="EDF4FB"/>
           </w:tcPr>
           <w:p>
             <w:r>
@@ -5506,7 +5506,7 @@
         <w:tc>
           <w:tcPr>
             <w:tcW w:type="dxa" w:w="3249"/>
-            <w:shd w:fill="F0F6F5"/>
+            <w:shd w:fill="EDF4FB"/>
           </w:tcPr>
           <w:p>
             <w:r>
@@ -5527,7 +5527,7 @@
         <w:tc>
           <w:tcPr>
             <w:tcW w:type="dxa" w:w="3249"/>
-            <w:shd w:fill="F0F6F5"/>
+            <w:shd w:fill="EDF4FB"/>
           </w:tcPr>
           <w:p>
             <w:r>
@@ -5548,7 +5548,7 @@
         <w:tc>
           <w:tcPr>
             <w:tcW w:type="dxa" w:w="3249"/>
-            <w:shd w:fill="F0F6F5"/>
+            <w:shd w:fill="EDF4FB"/>
           </w:tcPr>
           <w:p>
             <w:r>
@@ -5641,7 +5641,7 @@
         <w:tc>
           <w:tcPr>
             <w:tcW w:type="dxa" w:w="3249"/>
-            <w:shd w:fill="F0F6F5"/>
+            <w:shd w:fill="EDF4FB"/>
           </w:tcPr>
           <w:p>
             <w:r>
@@ -5662,7 +5662,7 @@
         <w:tc>
           <w:tcPr>
             <w:tcW w:type="dxa" w:w="3249"/>
-            <w:shd w:fill="F0F6F5"/>
+            <w:shd w:fill="EDF4FB"/>
           </w:tcPr>
           <w:p>
             <w:r>
@@ -5683,7 +5683,7 @@
         <w:tc>
           <w:tcPr>
             <w:tcW w:type="dxa" w:w="3249"/>
-            <w:shd w:fill="F0F6F5"/>
+            <w:shd w:fill="EDF4FB"/>
           </w:tcPr>
           <w:p>
             <w:r>
@@ -5768,7 +5768,7 @@
         <w:tc>
           <w:tcPr>
             <w:tcW w:type="dxa" w:w="3249"/>
-            <w:shd w:fill="F0F6F5"/>
+            <w:shd w:fill="EDF4FB"/>
           </w:tcPr>
           <w:p>
             <w:r>
@@ -5789,7 +5789,7 @@
         <w:tc>
           <w:tcPr>
             <w:tcW w:type="dxa" w:w="3249"/>
-            <w:shd w:fill="F0F6F5"/>
+            <w:shd w:fill="EDF4FB"/>
           </w:tcPr>
           <w:p>
             <w:r>
@@ -5810,7 +5810,7 @@
         <w:tc>
           <w:tcPr>
             <w:tcW w:type="dxa" w:w="3249"/>
-            <w:shd w:fill="F0F6F5"/>
+            <w:shd w:fill="EDF4FB"/>
           </w:tcPr>
           <w:p>
             <w:r>
@@ -5895,7 +5895,7 @@
         <w:tc>
           <w:tcPr>
             <w:tcW w:type="dxa" w:w="3249"/>
-            <w:shd w:fill="F0F6F5"/>
+            <w:shd w:fill="EDF4FB"/>
           </w:tcPr>
           <w:p>
             <w:r>
@@ -5916,7 +5916,7 @@
         <w:tc>
           <w:tcPr>
             <w:tcW w:type="dxa" w:w="3249"/>
-            <w:shd w:fill="F0F6F5"/>
+            <w:shd w:fill="EDF4FB"/>
           </w:tcPr>
           <w:p>
             <w:r>
@@ -5937,7 +5937,7 @@
         <w:tc>
           <w:tcPr>
             <w:tcW w:type="dxa" w:w="3249"/>
-            <w:shd w:fill="F0F6F5"/>
+            <w:shd w:fill="EDF4FB"/>
           </w:tcPr>
           <w:p>
             <w:r>
@@ -5980,7 +5980,7 @@
     <w:r/>
     <w:r>
       <w:rPr>
-        <w:color w:val="5A6B68"/>
+        <w:color w:val="5A6676"/>
         <w:sz w:val="18"/>
       </w:rPr>
       <w:fldChar w:fldCharType="begin"/>
@@ -6000,7 +6000,7 @@
     <w:r/>
     <w:r>
       <w:rPr>
-        <w:color w:val="5A6B68"/>
+        <w:color w:val="5A6676"/>
         <w:sz w:val="16"/>
       </w:rPr>
       <w:t>AX Svr — Proposal nội bộ · 10/07/2026</w:t>
@@ -6374,7 +6374,7 @@
     <w:rsid w:val="00FC693F"/>
     <w:rPr>
       <w:rFonts w:ascii="Calibri" w:hAnsi="Calibri" w:eastAsia="Calibri"/>
-      <w:color w:val="1A2423"/>
+      <w:color w:val="1A2230"/>
       <w:sz w:val="22"/>
     </w:rPr>
   </w:style>

</xml_diff>

<commit_message>
docs(proposal): gộp trọn một giai đoạn (bỏ GĐ2) + thêm bản tiếng Anh (md, docx, sơ đồ EN)
</commit_message>
<xml_diff>
--- a/docs/axsvr-proposal.docx
+++ b/docs/axsvr-proposal.docx
@@ -481,7 +481,7 @@
           <w:b/>
           <w:i w:val="0"/>
         </w:rPr>
-        <w:t>Đề xuất tiếp theo:</w:t>
+        <w:t>Trong cùng phạm vi dự án (thực hiện trọn một giai đoạn, không tách giai đoạn 2):</w:t>
       </w:r>
       <w:r>
         <w:rPr>
@@ -3217,7 +3217,25 @@
                 <w:i w:val="0"/>
                 <w:sz w:val="20"/>
               </w:rPr>
-              <w:t>Bổ sung backup off-site (site khác/đĩa rời — air-gap không dùng được cloud) → hoàn thiện chuẩn 3-2-1. Tài liệu đã viết sẵn (Phase 5b)</w:t>
+              <w:t>Bổ sung backup off-site (site khác/đĩa rời — air-gap không dùng được cloud) → hoàn thiện chuẩn 3-2-1. Tài liệu đã viết sẵn (</w:t>
+            </w:r>
+            <w:r>
+              <w:rPr>
+                <w:rFonts w:ascii="Consolas" w:hAnsi="Consolas"/>
+                <w:b w:val="0"/>
+                <w:i w:val="0"/>
+                <w:color w:val="0071BC"/>
+                <w:sz w:val="20"/>
+              </w:rPr>
+              <w:t>axsvr-backup-offsite.md</w:t>
+            </w:r>
+            <w:r>
+              <w:rPr>
+                <w:b w:val="0"/>
+                <w:i w:val="0"/>
+                <w:sz w:val="20"/>
+              </w:rPr>
+              <w:t>)</w:t>
             </w:r>
           </w:p>
         </w:tc>
@@ -3587,7 +3605,44 @@
           <w:color w:val="0071BC"/>
           <w:sz w:val="30"/>
         </w:rPr>
-        <w:t>7. Đề xuất giai đoạn tiếp theo</w:t>
+        <w:t>7. Hạng mục hoàn thiện — trọn gói trong một giai đoạn</w:t>
+      </w:r>
+    </w:p>
+    <w:p>
+      <w:r>
+        <w:rPr>
+          <w:b w:val="0"/>
+          <w:i w:val="0"/>
+        </w:rPr>
+        <w:t xml:space="preserve">Các hạng mục dưới đây thuộc </w:t>
+      </w:r>
+      <w:r>
+        <w:rPr>
+          <w:b/>
+          <w:i w:val="0"/>
+        </w:rPr>
+        <w:t>cùng một phạm vi dự án</w:t>
+      </w:r>
+      <w:r>
+        <w:rPr>
+          <w:b w:val="0"/>
+          <w:i w:val="0"/>
+        </w:rPr>
+        <w:t xml:space="preserve">, thực hiện gọn trong </w:t>
+      </w:r>
+      <w:r>
+        <w:rPr>
+          <w:b/>
+          <w:i w:val="0"/>
+        </w:rPr>
+        <w:t>một đợt duy nhất</w:t>
+      </w:r>
+      <w:r>
+        <w:rPr>
+          <w:b w:val="0"/>
+          <w:i w:val="0"/>
+        </w:rPr>
+        <w:t xml:space="preserve"> (không tách thành giai đoạn 2) để đạt độ an toàn và vận hành trọn vẹn:</w:t>
       </w:r>
     </w:p>
     <w:p>
@@ -3809,7 +3864,7 @@
           <w:color w:val="1A2230"/>
           <w:sz w:val="25"/>
         </w:rPr>
-        <w:t>7.4 Nguồn lực đề xuất</w:t>
+        <w:t>7.4 Nguồn lực để hoàn tất (trong một giai đoạn)</w:t>
       </w:r>
     </w:p>
     <w:tbl>
@@ -3997,6 +4052,50 @@
                 <w:sz w:val="20"/>
               </w:rPr>
               <w:t>1–2 ngày công</w:t>
+            </w:r>
+          </w:p>
+        </w:tc>
+      </w:tr>
+      <w:tr>
+        <w:tc>
+          <w:tcPr>
+            <w:tcW w:type="dxa" w:w="4873"/>
+            <w:shd w:fill="EDF4FB"/>
+          </w:tcPr>
+          <w:p>
+            <w:r>
+              <w:rPr>
+                <w:sz w:val="20"/>
+              </w:rPr>
+            </w:r>
+            <w:r>
+              <w:rPr>
+                <w:b/>
+                <w:i w:val="0"/>
+                <w:sz w:val="20"/>
+              </w:rPr>
+              <w:t>Tổng</w:t>
+            </w:r>
+          </w:p>
+        </w:tc>
+        <w:tc>
+          <w:tcPr>
+            <w:tcW w:type="dxa" w:w="4873"/>
+            <w:shd w:fill="EDF4FB"/>
+          </w:tcPr>
+          <w:p>
+            <w:r>
+              <w:rPr>
+                <w:sz w:val="20"/>
+              </w:rPr>
+            </w:r>
+            <w:r>
+              <w:rPr>
+                <w:b/>
+                <w:i w:val="0"/>
+                <w:sz w:val="20"/>
+              </w:rPr>
+              <w:t>~6–10 ngày công, làm gọn một đợt</w:t>
             </w:r>
           </w:p>
         </w:tc>
@@ -4091,14 +4190,28 @@
           <w:b/>
           <w:i w:val="0"/>
         </w:rPr>
-        <w:t>Phê duyệt</w:t>
+        <w:t>Phê duyệt hoàn tất</w:t>
       </w:r>
       <w:r>
         <w:rPr>
           <w:b w:val="0"/>
           <w:i w:val="0"/>
         </w:rPr>
-        <w:t xml:space="preserve"> triển khai giai đoạn tiếp theo (mục 7) với ước lượng nguồn lực kèm theo.</w:t>
+        <w:t xml:space="preserve"> các hạng mục còn lại (mục 7) — thực hiện </w:t>
+      </w:r>
+      <w:r>
+        <w:rPr>
+          <w:b/>
+          <w:i w:val="0"/>
+        </w:rPr>
+        <w:t>trọn trong một giai đoạn</w:t>
+      </w:r>
+      <w:r>
+        <w:rPr>
+          <w:b w:val="0"/>
+          <w:i w:val="0"/>
+        </w:rPr>
+        <w:t>, tổng ~6–10 ngày công.</w:t>
       </w:r>
     </w:p>
     <w:p>
@@ -5632,7 +5745,7 @@
                 <w:i/>
                 <w:sz w:val="20"/>
               </w:rPr>
-              <w:t>chưa triển khai, đề xuất</w:t>
+              <w:t>thuộc phạm vi, chưa triển khai</w:t>
             </w:r>
           </w:p>
         </w:tc>

</xml_diff>